<commit_message>
Two instructors (Viktoria Cologna first), session table layout, lecturer column
Co-Authored-By: Claude Fable 5 <noreply@anthropic.com>
</commit_message>
<xml_diff>
--- a/docs/syllabus.docx
+++ b/docs/syllabus.docx
@@ -10,13 +10,13 @@
         <w:t xml:space="preserve">Syllabus</w:t>
       </w:r>
     </w:p>
-    <w:bookmarkStart w:id="20" w:name="instructor"/>
+    <w:bookmarkStart w:id="20" w:name="instructors"/>
     <w:p>
       <w:pPr>
         <w:pStyle w:val="Heading2"/>
       </w:pPr>
       <w:r>
-        <w:t xml:space="preserve">Instructor</w:t>
+        <w:t xml:space="preserve">Instructors</w:t>
       </w:r>
     </w:p>
     <w:p>
@@ -24,7 +24,15 @@
         <w:pStyle w:val="FirstParagraph"/>
       </w:pPr>
       <w:r>
-        <w:t xml:space="preserve">Jan Pfänder | ETH Zurich | janlukas.pfaender@gmail.com | https://janpfander.github.io/</w:t>
+        <w:t xml:space="preserve">Viktoria Cologna | https://www.viktoriacologna.com/</w:t>
+      </w:r>
+    </w:p>
+    <w:p>
+      <w:pPr>
+        <w:pStyle w:val="BodyText"/>
+      </w:pPr>
+      <w:r>
+        <w:t xml:space="preserve">Jan Pfänder | janlukas.pfaender@gmail.com | https://janpfander.github.io/</w:t>
       </w:r>
     </w:p>
     <w:bookmarkEnd w:id="20"/>
@@ -278,13 +286,13 @@
       </w:r>
     </w:p>
     <w:bookmarkEnd w:id="27"/>
-    <w:bookmarkStart w:id="45" w:name="lecture-plan-draft"/>
+    <w:bookmarkStart w:id="31" w:name="course-structure"/>
     <w:p>
       <w:pPr>
         <w:pStyle w:val="Heading2"/>
       </w:pPr>
       <w:r>
-        <w:t xml:space="preserve">Lecture Plan (Draft)</w:t>
+        <w:t xml:space="preserve">Course Structure</w:t>
       </w:r>
     </w:p>
     <w:tbl>
@@ -418,802 +426,3187 @@
         </w:tc>
       </w:tr>
     </w:tbl>
-    <w:bookmarkStart w:id="31" w:name="Xec5c94048152799cf581497ba56a83f387a0339"/>
-    <w:p>
-      <w:pPr>
-        <w:pStyle w:val="Heading3"/>
-      </w:pPr>
-      <w:r>
-        <w:t xml:space="preserve">1 — 15.09.2026 — Introduction and organizational questions</w:t>
-      </w:r>
-    </w:p>
-    <w:p>
-      <w:pPr>
-        <w:pStyle w:val="FirstParagraph"/>
-      </w:pPr>
-      <w:r>
-        <w:rPr>
-          <w:b/>
-          <w:bCs/>
-        </w:rPr>
-        <w:t xml:space="preserve">[TODO: co-teacher attribution (</w:t>
-      </w:r>
-      <w:r>
-        <w:rPr>
-          <w:b/>
-          <w:bCs/>
-        </w:rPr>
-        <w:t xml:space="preserve">“Viktoria, Jan”</w:t>
-      </w:r>
-      <w:r>
-        <w:rPr>
-          <w:b/>
-          <w:bCs/>
-        </w:rPr>
-        <w:t xml:space="preserve">) from old course — confirm]</w:t>
-      </w:r>
-    </w:p>
-    <w:p>
-      <w:pPr>
-        <w:pStyle w:val="BodyText"/>
-      </w:pPr>
-      <w:r>
-        <w:t xml:space="preserve">Why is climate change communication important and why is it so challenging?</w:t>
-      </w:r>
-    </w:p>
-    <w:p>
-      <w:pPr>
-        <w:pStyle w:val="BodyText"/>
-      </w:pPr>
-      <w:r>
-        <w:t xml:space="preserve">Literature:</w:t>
-      </w:r>
-    </w:p>
-    <w:p>
-      <w:pPr>
-        <w:pStyle w:val="Compact"/>
-        <w:numPr>
-          <w:ilvl w:val="0"/>
-          <w:numId w:val="1004"/>
-        </w:numPr>
-      </w:pPr>
-      <w:r>
-        <w:t xml:space="preserve">Markowitz &amp; Guckian (2018). Climate change communication: Challenges, insights, and opportunities.</w:t>
-      </w:r>
-    </w:p>
+    <w:tbl>
+      <w:tblPr>
+        <w:tblStyle w:val="Table"/>
+        <w:tblW w:type="pct" w:w="5000"/>
+        <w:tblLayout w:type="fixed"/>
+        <w:tblLook w:firstRow="1" w:lastRow="0" w:firstColumn="0" w:lastColumn="0" w:noHBand="0" w:noVBand="0" w:val="0020"/>
+      </w:tblPr>
+      <w:tblGrid>
+        <w:gridCol w:w="316"/>
+        <w:gridCol w:w="871"/>
+        <w:gridCol w:w="3722"/>
+        <w:gridCol w:w="3009"/>
+      </w:tblGrid>
+      <w:tr>
+        <w:trPr>
+          <w:tblHeader w:val="on"/>
+        </w:trPr>
+        <w:tc>
+          <w:tcPr/>
+          <w:p>
+            <w:pPr>
+              <w:pStyle w:val="Compact"/>
+            </w:pPr>
+            <w:r>
+              <w:t xml:space="preserve">#</w:t>
+            </w:r>
+          </w:p>
+        </w:tc>
+        <w:tc>
+          <w:tcPr/>
+          <w:p>
+            <w:pPr>
+              <w:pStyle w:val="Compact"/>
+            </w:pPr>
+            <w:r>
+              <w:t xml:space="preserve">Date</w:t>
+            </w:r>
+          </w:p>
+        </w:tc>
+        <w:tc>
+          <w:tcPr/>
+          <w:p>
+            <w:pPr>
+              <w:pStyle w:val="Compact"/>
+            </w:pPr>
+            <w:r>
+              <w:t xml:space="preserve">Topic</w:t>
+            </w:r>
+          </w:p>
+        </w:tc>
+        <w:tc>
+          <w:tcPr/>
+          <w:p>
+            <w:pPr>
+              <w:pStyle w:val="Compact"/>
+            </w:pPr>
+            <w:r>
+              <w:t xml:space="preserve">Literature</w:t>
+            </w:r>
+          </w:p>
+        </w:tc>
+      </w:tr>
+      <w:tr>
+        <w:tc>
+          <w:tcPr/>
+          <w:p>
+            <w:pPr>
+              <w:pStyle w:val="Compact"/>
+            </w:pPr>
+            <w:r>
+              <w:t xml:space="preserve">1</w:t>
+            </w:r>
+          </w:p>
+        </w:tc>
+        <w:tc>
+          <w:tcPr/>
+          <w:p>
+            <w:pPr>
+              <w:pStyle w:val="Compact"/>
+            </w:pPr>
+            <w:r>
+              <w:t xml:space="preserve">15.09.2026</w:t>
+            </w:r>
+          </w:p>
+        </w:tc>
+        <w:tc>
+          <w:tcPr/>
+          <w:p>
+            <w:pPr>
+              <w:pStyle w:val="BodyText"/>
+            </w:pPr>
+            <w:r>
+              <w:rPr>
+                <w:b/>
+                <w:bCs/>
+              </w:rPr>
+              <w:t xml:space="preserve">Introduction and</w:t>
+            </w:r>
+            <w:r>
+              <w:rPr>
+                <w:b/>
+                <w:bCs/>
+              </w:rPr>
+              <w:t xml:space="preserve"> </w:t>
+            </w:r>
+            <w:r>
+              <w:rPr>
+                <w:b/>
+                <w:bCs/>
+              </w:rPr>
+              <w:t xml:space="preserve">organizational</w:t>
+            </w:r>
+            <w:r>
+              <w:rPr>
+                <w:b/>
+                <w:bCs/>
+              </w:rPr>
+              <w:t xml:space="preserve"> </w:t>
+            </w:r>
+            <w:r>
+              <w:rPr>
+                <w:b/>
+                <w:bCs/>
+              </w:rPr>
+              <w:t xml:space="preserve">questions</w:t>
+            </w:r>
+            <w:r>
+              <w:t xml:space="preserve"> </w:t>
+            </w:r>
+            <w:r>
+              <w:t xml:space="preserve">— Viktoria</w:t>
+            </w:r>
+            <w:r>
+              <w:t xml:space="preserve"> </w:t>
+            </w:r>
+            <w:r>
+              <w:t xml:space="preserve">Cologna &amp; Jan Pfänder</w:t>
+            </w:r>
+          </w:p>
+          <w:p>
+            <w:pPr>
+              <w:pStyle w:val="BodyText"/>
+            </w:pPr>
+            <w:r>
+              <w:t xml:space="preserve">Why is climate change</w:t>
+            </w:r>
+            <w:r>
+              <w:t xml:space="preserve"> </w:t>
+            </w:r>
+            <w:r>
+              <w:t xml:space="preserve">communication important</w:t>
+            </w:r>
+            <w:r>
+              <w:t xml:space="preserve"> </w:t>
+            </w:r>
+            <w:r>
+              <w:t xml:space="preserve">and why is it so</w:t>
+            </w:r>
+            <w:r>
+              <w:t xml:space="preserve"> </w:t>
+            </w:r>
+            <w:r>
+              <w:t xml:space="preserve">challenging?</w:t>
+            </w:r>
+          </w:p>
+        </w:tc>
+        <w:tc>
+          <w:tcPr/>
+          <w:p>
+            <w:pPr>
+              <w:pStyle w:val="Compact"/>
+            </w:pPr>
+            <w:r>
+              <w:t xml:space="preserve">Markowitz &amp; Guckian</w:t>
+            </w:r>
+            <w:r>
+              <w:t xml:space="preserve"> </w:t>
+            </w:r>
+            <w:r>
+              <w:t xml:space="preserve">(2018). Climate change</w:t>
+            </w:r>
+            <w:r>
+              <w:t xml:space="preserve"> </w:t>
+            </w:r>
+            <w:r>
+              <w:t xml:space="preserve">communication:</w:t>
+            </w:r>
+            <w:r>
+              <w:t xml:space="preserve"> </w:t>
+            </w:r>
+            <w:r>
+              <w:t xml:space="preserve">Challenges, insights,</w:t>
+            </w:r>
+            <w:r>
+              <w:t xml:space="preserve"> </w:t>
+            </w:r>
+            <w:r>
+              <w:t xml:space="preserve">and opportunities.</w:t>
+            </w:r>
+          </w:p>
+        </w:tc>
+      </w:tr>
+      <w:tr>
+        <w:tc>
+          <w:tcPr/>
+          <w:p>
+            <w:pPr>
+              <w:pStyle w:val="Compact"/>
+            </w:pPr>
+            <w:r>
+              <w:t xml:space="preserve">2</w:t>
+            </w:r>
+          </w:p>
+        </w:tc>
+        <w:tc>
+          <w:tcPr/>
+          <w:p>
+            <w:pPr>
+              <w:pStyle w:val="Compact"/>
+            </w:pPr>
+            <w:r>
+              <w:t xml:space="preserve">22.09.2026</w:t>
+            </w:r>
+          </w:p>
+        </w:tc>
+        <w:tc>
+          <w:tcPr/>
+          <w:p>
+            <w:pPr>
+              <w:pStyle w:val="BodyText"/>
+            </w:pPr>
+            <w:r>
+              <w:rPr>
+                <w:b/>
+                <w:bCs/>
+              </w:rPr>
+              <w:t xml:space="preserve">Climate change, the</w:t>
+            </w:r>
+            <w:r>
+              <w:rPr>
+                <w:b/>
+                <w:bCs/>
+              </w:rPr>
+              <w:t xml:space="preserve"> </w:t>
+            </w:r>
+            <w:r>
+              <w:rPr>
+                <w:b/>
+                <w:bCs/>
+              </w:rPr>
+              <w:t xml:space="preserve">deficit model, and</w:t>
+            </w:r>
+            <w:r>
+              <w:rPr>
+                <w:b/>
+                <w:bCs/>
+              </w:rPr>
+              <w:t xml:space="preserve"> </w:t>
+            </w:r>
+            <w:r>
+              <w:rPr>
+                <w:b/>
+                <w:bCs/>
+              </w:rPr>
+              <w:t xml:space="preserve">public opinion</w:t>
+            </w:r>
+            <w:r>
+              <w:t xml:space="preserve"> </w:t>
+            </w:r>
+            <w:r>
+              <w:t xml:space="preserve">—</w:t>
+            </w:r>
+            <w:r>
+              <w:t xml:space="preserve"> </w:t>
+            </w:r>
+            <w:r>
+              <w:t xml:space="preserve">Viktoria Cologna</w:t>
+            </w:r>
+          </w:p>
+          <w:p>
+            <w:pPr>
+              <w:pStyle w:val="BodyText"/>
+            </w:pPr>
+            <w:r>
+              <w:t xml:space="preserve">What is climate change</w:t>
+            </w:r>
+            <w:r>
+              <w:t xml:space="preserve"> </w:t>
+            </w:r>
+            <w:r>
+              <w:t xml:space="preserve">and how does it occur?</w:t>
+            </w:r>
+            <w:r>
+              <w:t xml:space="preserve"> </w:t>
+            </w:r>
+            <w:r>
+              <w:t xml:space="preserve">Does knowledge-focused</w:t>
+            </w:r>
+            <w:r>
+              <w:t xml:space="preserve"> </w:t>
+            </w:r>
+            <w:r>
+              <w:t xml:space="preserve">communication about</w:t>
+            </w:r>
+            <w:r>
+              <w:t xml:space="preserve"> </w:t>
+            </w:r>
+            <w:r>
+              <w:t xml:space="preserve">climate change lead to</w:t>
+            </w:r>
+            <w:r>
+              <w:t xml:space="preserve"> </w:t>
+            </w:r>
+            <w:r>
+              <w:t xml:space="preserve">more concern and</w:t>
+            </w:r>
+            <w:r>
+              <w:t xml:space="preserve"> </w:t>
+            </w:r>
+            <w:r>
+              <w:t xml:space="preserve">engagement? What is the</w:t>
+            </w:r>
+            <w:r>
+              <w:t xml:space="preserve"> </w:t>
+            </w:r>
+            <w:r>
+              <w:t xml:space="preserve">public opinion about</w:t>
+            </w:r>
+            <w:r>
+              <w:t xml:space="preserve"> </w:t>
+            </w:r>
+            <w:r>
+              <w:t xml:space="preserve">climate change?</w:t>
+            </w:r>
+          </w:p>
+        </w:tc>
+        <w:tc>
+          <w:tcPr/>
+          <w:p>
+            <w:pPr>
+              <w:pStyle w:val="BodyText"/>
+            </w:pPr>
+            <w:r>
+              <w:t xml:space="preserve">Metag et al. (2017).</w:t>
+            </w:r>
+            <w:r>
+              <w:t xml:space="preserve"> </w:t>
+            </w:r>
+            <w:r>
+              <w:t xml:space="preserve">Global warming’s five</w:t>
+            </w:r>
+            <w:r>
+              <w:t xml:space="preserve"> </w:t>
+            </w:r>
+            <w:r>
+              <w:t xml:space="preserve">Germanys.</w:t>
+            </w:r>
+          </w:p>
+          <w:p>
+            <w:pPr>
+              <w:pStyle w:val="BodyText"/>
+            </w:pPr>
+            <w:r>
+              <w:t xml:space="preserve">Leiserowitz et al.</w:t>
+            </w:r>
+            <w:r>
+              <w:t xml:space="preserve"> </w:t>
+            </w:r>
+            <w:r>
+              <w:t xml:space="preserve">(2024). Climate Change</w:t>
+            </w:r>
+            <w:r>
+              <w:t xml:space="preserve"> </w:t>
+            </w:r>
+            <w:r>
+              <w:t xml:space="preserve">in the American Mind:</w:t>
+            </w:r>
+            <w:r>
+              <w:t xml:space="preserve"> </w:t>
+            </w:r>
+            <w:r>
+              <w:t xml:space="preserve">Beliefs &amp; Attitudes.</w:t>
+            </w:r>
+            <w:r>
+              <w:t xml:space="preserve"> </w:t>
+            </w:r>
+            <w:r>
+              <w:rPr>
+                <w:b/>
+                <w:bCs/>
+              </w:rPr>
+              <w:t xml:space="preserve">[TODO: missing from</w:t>
+            </w:r>
+            <w:r>
+              <w:rPr>
+                <w:b/>
+                <w:bCs/>
+              </w:rPr>
+              <w:t xml:space="preserve"> </w:t>
+            </w:r>
+            <w:r>
+              <w:rPr>
+                <w:b/>
+                <w:bCs/>
+              </w:rPr>
+              <w:t xml:space="preserve">reference list]</w:t>
+            </w:r>
+          </w:p>
+          <w:p>
+            <w:pPr>
+              <w:pStyle w:val="BodyText"/>
+            </w:pPr>
+            <w:r>
+              <w:t xml:space="preserve">Shi et al. (2016).</w:t>
+            </w:r>
+            <w:r>
+              <w:t xml:space="preserve"> </w:t>
+            </w:r>
+            <w:r>
+              <w:t xml:space="preserve">Knowledge as a driver of</w:t>
+            </w:r>
+            <w:r>
+              <w:t xml:space="preserve"> </w:t>
+            </w:r>
+            <w:r>
+              <w:t xml:space="preserve">public perceptions about</w:t>
+            </w:r>
+            <w:r>
+              <w:t xml:space="preserve"> </w:t>
+            </w:r>
+            <w:r>
+              <w:t xml:space="preserve">climate change</w:t>
+            </w:r>
+            <w:r>
+              <w:t xml:space="preserve"> </w:t>
+            </w:r>
+            <w:r>
+              <w:t xml:space="preserve">reassessed.</w:t>
+            </w:r>
+          </w:p>
+        </w:tc>
+      </w:tr>
+      <w:tr>
+        <w:tc>
+          <w:tcPr/>
+          <w:p>
+            <w:pPr>
+              <w:pStyle w:val="Compact"/>
+            </w:pPr>
+            <w:r>
+              <w:t xml:space="preserve">3</w:t>
+            </w:r>
+          </w:p>
+        </w:tc>
+        <w:tc>
+          <w:tcPr/>
+          <w:p>
+            <w:pPr>
+              <w:pStyle w:val="Compact"/>
+            </w:pPr>
+            <w:r>
+              <w:t xml:space="preserve">29.09.2026</w:t>
+            </w:r>
+          </w:p>
+        </w:tc>
+        <w:tc>
+          <w:tcPr/>
+          <w:p>
+            <w:pPr>
+              <w:pStyle w:val="BodyText"/>
+            </w:pPr>
+            <w:r>
+              <w:rPr>
+                <w:b/>
+                <w:bCs/>
+              </w:rPr>
+              <w:t xml:space="preserve">Guest speaker: Dr.</w:t>
+            </w:r>
+            <w:r>
+              <w:rPr>
+                <w:b/>
+                <w:bCs/>
+              </w:rPr>
+              <w:t xml:space="preserve"> </w:t>
+            </w:r>
+            <w:r>
+              <w:rPr>
+                <w:b/>
+                <w:bCs/>
+              </w:rPr>
+              <w:t xml:space="preserve">Leonard Creutzburg</w:t>
+            </w:r>
+          </w:p>
+          <w:p>
+            <w:pPr>
+              <w:pStyle w:val="BodyText"/>
+            </w:pPr>
+            <w:r>
+              <w:rPr>
+                <w:b/>
+                <w:bCs/>
+              </w:rPr>
+              <w:t xml:space="preserve">[TODO: blurb below</w:t>
+            </w:r>
+            <w:r>
+              <w:rPr>
+                <w:b/>
+                <w:bCs/>
+              </w:rPr>
+              <w:t xml:space="preserve"> </w:t>
+            </w:r>
+            <w:r>
+              <w:rPr>
+                <w:b/>
+                <w:bCs/>
+              </w:rPr>
+              <w:t xml:space="preserve">describes a different</w:t>
+            </w:r>
+            <w:r>
+              <w:rPr>
+                <w:b/>
+                <w:bCs/>
+              </w:rPr>
+              <w:t xml:space="preserve"> </w:t>
+            </w:r>
+            <w:r>
+              <w:rPr>
+                <w:b/>
+                <w:bCs/>
+              </w:rPr>
+              <w:t xml:space="preserve">person (Dr. Lydia</w:t>
+            </w:r>
+            <w:r>
+              <w:rPr>
+                <w:b/>
+                <w:bCs/>
+              </w:rPr>
+              <w:t xml:space="preserve"> </w:t>
+            </w:r>
+            <w:r>
+              <w:rPr>
+                <w:b/>
+                <w:bCs/>
+              </w:rPr>
+              <w:t xml:space="preserve">Ebersbach, WWF) —</w:t>
+            </w:r>
+            <w:r>
+              <w:rPr>
+                <w:b/>
+                <w:bCs/>
+              </w:rPr>
+              <w:t xml:space="preserve"> </w:t>
+            </w:r>
+            <w:r>
+              <w:rPr>
+                <w:b/>
+                <w:bCs/>
+              </w:rPr>
+              <w:t xml:space="preserve">rewrite for the actual</w:t>
+            </w:r>
+            <w:r>
+              <w:rPr>
+                <w:b/>
+                <w:bCs/>
+              </w:rPr>
+              <w:t xml:space="preserve"> </w:t>
+            </w:r>
+            <w:r>
+              <w:rPr>
+                <w:b/>
+                <w:bCs/>
+              </w:rPr>
+              <w:t xml:space="preserve">speaker]</w:t>
+            </w:r>
+          </w:p>
+          <w:p>
+            <w:pPr>
+              <w:pStyle w:val="BodyText"/>
+            </w:pPr>
+            <w:r>
+              <w:t xml:space="preserve">Dr. Lydia Ebersbach is</w:t>
+            </w:r>
+            <w:r>
+              <w:t xml:space="preserve"> </w:t>
+            </w:r>
+            <w:r>
+              <w:t xml:space="preserve">media relations manager</w:t>
+            </w:r>
+            <w:r>
+              <w:t xml:space="preserve"> </w:t>
+            </w:r>
+            <w:r>
+              <w:t xml:space="preserve">at WWF Switzerland. She</w:t>
+            </w:r>
+            <w:r>
+              <w:t xml:space="preserve"> </w:t>
+            </w:r>
+            <w:r>
+              <w:t xml:space="preserve">holds a Magister in</w:t>
+            </w:r>
+            <w:r>
+              <w:t xml:space="preserve"> </w:t>
+            </w:r>
+            <w:r>
+              <w:t xml:space="preserve">History, Politics and</w:t>
+            </w:r>
+            <w:r>
+              <w:t xml:space="preserve"> </w:t>
+            </w:r>
+            <w:r>
+              <w:t xml:space="preserve">Economics from Potsdam</w:t>
+            </w:r>
+            <w:r>
+              <w:t xml:space="preserve"> </w:t>
+            </w:r>
+            <w:r>
+              <w:t xml:space="preserve">University, a PhD in</w:t>
+            </w:r>
+            <w:r>
+              <w:t xml:space="preserve"> </w:t>
+            </w:r>
+            <w:r>
+              <w:t xml:space="preserve">Marketing from St.</w:t>
+            </w:r>
+            <w:r>
+              <w:t xml:space="preserve"> </w:t>
+            </w:r>
+            <w:r>
+              <w:t xml:space="preserve">Gallen University and</w:t>
+            </w:r>
+            <w:r>
+              <w:t xml:space="preserve"> </w:t>
+            </w:r>
+            <w:r>
+              <w:t xml:space="preserve">completed a CAS in</w:t>
+            </w:r>
+            <w:r>
+              <w:t xml:space="preserve"> </w:t>
+            </w:r>
+            <w:r>
+              <w:t xml:space="preserve">Storytelling and Brand</w:t>
+            </w:r>
+            <w:r>
+              <w:t xml:space="preserve"> </w:t>
+            </w:r>
+            <w:r>
+              <w:t xml:space="preserve">Journalism at MAZ / HSL.</w:t>
+            </w:r>
+            <w:r>
+              <w:t xml:space="preserve"> </w:t>
+            </w:r>
+            <w:r>
+              <w:t xml:space="preserve">She will talk to us</w:t>
+            </w:r>
+            <w:r>
+              <w:t xml:space="preserve"> </w:t>
+            </w:r>
+            <w:r>
+              <w:t xml:space="preserve">about the challenges of</w:t>
+            </w:r>
+            <w:r>
+              <w:t xml:space="preserve"> </w:t>
+            </w:r>
+            <w:r>
+              <w:t xml:space="preserve">climate communication</w:t>
+            </w:r>
+            <w:r>
+              <w:t xml:space="preserve"> </w:t>
+            </w:r>
+            <w:r>
+              <w:t xml:space="preserve">from the perspective of</w:t>
+            </w:r>
+            <w:r>
+              <w:t xml:space="preserve"> </w:t>
+            </w:r>
+            <w:r>
+              <w:t xml:space="preserve">a Swiss NGO.</w:t>
+            </w:r>
+          </w:p>
+        </w:tc>
+        <w:tc>
+          <w:tcPr/>
+          <w:p>
+            <w:pPr>
+              <w:pStyle w:val="BodyText"/>
+            </w:pPr>
+            <w:r>
+              <w:rPr>
+                <w:b/>
+                <w:bCs/>
+              </w:rPr>
+              <w:t xml:space="preserve">[TODO: framing</w:t>
+            </w:r>
+            <w:r>
+              <w:rPr>
+                <w:b/>
+                <w:bCs/>
+              </w:rPr>
+              <w:t xml:space="preserve"> </w:t>
+            </w:r>
+            <w:r>
+              <w:rPr>
+                <w:b/>
+                <w:bCs/>
+              </w:rPr>
+              <w:t xml:space="preserve">literature listed here</w:t>
+            </w:r>
+            <w:r>
+              <w:rPr>
+                <w:b/>
+                <w:bCs/>
+              </w:rPr>
+              <w:t xml:space="preserve"> </w:t>
+            </w:r>
+            <w:r>
+              <w:rPr>
+                <w:b/>
+                <w:bCs/>
+              </w:rPr>
+              <w:t xml:space="preserve">in the template likely</w:t>
+            </w:r>
+            <w:r>
+              <w:rPr>
+                <w:b/>
+                <w:bCs/>
+              </w:rPr>
+              <w:t xml:space="preserve"> </w:t>
+            </w:r>
+            <w:r>
+              <w:rPr>
+                <w:b/>
+                <w:bCs/>
+              </w:rPr>
+              <w:t xml:space="preserve">belongs to session 4]</w:t>
+            </w:r>
+          </w:p>
+          <w:p>
+            <w:pPr>
+              <w:pStyle w:val="BodyText"/>
+            </w:pPr>
+            <w:r>
+              <w:t xml:space="preserve">Lakoff, G. (2010). Why</w:t>
+            </w:r>
+            <w:r>
+              <w:t xml:space="preserve"> </w:t>
+            </w:r>
+            <w:r>
+              <w:t xml:space="preserve">it Matters How We Frame</w:t>
+            </w:r>
+            <w:r>
+              <w:t xml:space="preserve"> </w:t>
+            </w:r>
+            <w:r>
+              <w:t xml:space="preserve">the Environment.</w:t>
+            </w:r>
+          </w:p>
+          <w:p>
+            <w:pPr>
+              <w:pStyle w:val="BodyText"/>
+            </w:pPr>
+            <w:r>
+              <w:t xml:space="preserve">Dasandi et al. (2022).</w:t>
+            </w:r>
+            <w:r>
+              <w:t xml:space="preserve"> </w:t>
+            </w:r>
+            <w:r>
+              <w:t xml:space="preserve">Positive, global, and</w:t>
+            </w:r>
+            <w:r>
+              <w:t xml:space="preserve"> </w:t>
+            </w:r>
+            <w:r>
+              <w:t xml:space="preserve">health or environment</w:t>
+            </w:r>
+            <w:r>
+              <w:t xml:space="preserve"> </w:t>
+            </w:r>
+            <w:r>
+              <w:t xml:space="preserve">framing bolsters public</w:t>
+            </w:r>
+            <w:r>
+              <w:t xml:space="preserve"> </w:t>
+            </w:r>
+            <w:r>
+              <w:t xml:space="preserve">support for climate</w:t>
+            </w:r>
+            <w:r>
+              <w:t xml:space="preserve"> </w:t>
+            </w:r>
+            <w:r>
+              <w:t xml:space="preserve">policies.</w:t>
+            </w:r>
+          </w:p>
+          <w:p>
+            <w:pPr>
+              <w:pStyle w:val="BodyText"/>
+            </w:pPr>
+            <w:r>
+              <w:t xml:space="preserve">Supran &amp; Oreskes (2021).</w:t>
+            </w:r>
+            <w:r>
+              <w:t xml:space="preserve"> </w:t>
+            </w:r>
+            <w:r>
+              <w:t xml:space="preserve">Rhetoric and frame</w:t>
+            </w:r>
+            <w:r>
+              <w:t xml:space="preserve"> </w:t>
+            </w:r>
+            <w:r>
+              <w:t xml:space="preserve">analysis of ExxonMobil’s</w:t>
+            </w:r>
+            <w:r>
+              <w:t xml:space="preserve"> </w:t>
+            </w:r>
+            <w:r>
+              <w:t xml:space="preserve">climate change</w:t>
+            </w:r>
+            <w:r>
+              <w:t xml:space="preserve"> </w:t>
+            </w:r>
+            <w:r>
+              <w:t xml:space="preserve">communications.</w:t>
+            </w:r>
+          </w:p>
+        </w:tc>
+      </w:tr>
+      <w:tr>
+        <w:tc>
+          <w:tcPr/>
+          <w:p>
+            <w:pPr>
+              <w:pStyle w:val="Compact"/>
+            </w:pPr>
+            <w:r>
+              <w:t xml:space="preserve">4</w:t>
+            </w:r>
+          </w:p>
+        </w:tc>
+        <w:tc>
+          <w:tcPr/>
+          <w:p>
+            <w:pPr>
+              <w:pStyle w:val="Compact"/>
+            </w:pPr>
+            <w:r>
+              <w:t xml:space="preserve">06.10.2026</w:t>
+            </w:r>
+          </w:p>
+        </w:tc>
+        <w:tc>
+          <w:tcPr/>
+          <w:p>
+            <w:pPr>
+              <w:pStyle w:val="BodyText"/>
+            </w:pPr>
+            <w:r>
+              <w:rPr>
+                <w:b/>
+                <w:bCs/>
+              </w:rPr>
+              <w:t xml:space="preserve">Mental models and</w:t>
+            </w:r>
+            <w:r>
+              <w:rPr>
+                <w:b/>
+                <w:bCs/>
+              </w:rPr>
+              <w:t xml:space="preserve"> </w:t>
+            </w:r>
+            <w:r>
+              <w:rPr>
+                <w:b/>
+                <w:bCs/>
+              </w:rPr>
+              <w:t xml:space="preserve">framing</w:t>
+            </w:r>
+            <w:r>
+              <w:t xml:space="preserve"> </w:t>
+            </w:r>
+            <w:r>
+              <w:t xml:space="preserve">— Jan Pfänder</w:t>
+            </w:r>
+          </w:p>
+          <w:p>
+            <w:pPr>
+              <w:pStyle w:val="BodyText"/>
+            </w:pPr>
+            <w:r>
+              <w:t xml:space="preserve">What are mental models?</w:t>
+            </w:r>
+            <w:r>
+              <w:t xml:space="preserve"> </w:t>
+            </w:r>
+            <w:r>
+              <w:t xml:space="preserve">Which frames are used in</w:t>
+            </w:r>
+            <w:r>
+              <w:t xml:space="preserve"> </w:t>
+            </w:r>
+            <w:r>
+              <w:t xml:space="preserve">climate change</w:t>
+            </w:r>
+            <w:r>
+              <w:t xml:space="preserve"> </w:t>
+            </w:r>
+            <w:r>
+              <w:t xml:space="preserve">communication? How can</w:t>
+            </w:r>
+            <w:r>
+              <w:t xml:space="preserve"> </w:t>
+            </w:r>
+            <w:r>
+              <w:t xml:space="preserve">we frame climate change</w:t>
+            </w:r>
+            <w:r>
+              <w:t xml:space="preserve"> </w:t>
+            </w:r>
+            <w:r>
+              <w:t xml:space="preserve">in a way that allows us</w:t>
+            </w:r>
+            <w:r>
+              <w:t xml:space="preserve"> </w:t>
+            </w:r>
+            <w:r>
+              <w:t xml:space="preserve">to reach different</w:t>
+            </w:r>
+            <w:r>
+              <w:t xml:space="preserve"> </w:t>
+            </w:r>
+            <w:r>
+              <w:t xml:space="preserve">population groups? What</w:t>
+            </w:r>
+            <w:r>
+              <w:t xml:space="preserve"> </w:t>
+            </w:r>
+            <w:r>
+              <w:t xml:space="preserve">are the strategies,</w:t>
+            </w:r>
+            <w:r>
+              <w:t xml:space="preserve"> </w:t>
+            </w:r>
+            <w:r>
+              <w:t xml:space="preserve">channels, and messages</w:t>
+            </w:r>
+            <w:r>
+              <w:t xml:space="preserve"> </w:t>
+            </w:r>
+            <w:r>
+              <w:t xml:space="preserve">used by different</w:t>
+            </w:r>
+            <w:r>
+              <w:t xml:space="preserve"> </w:t>
+            </w:r>
+            <w:r>
+              <w:t xml:space="preserve">stakeholders?</w:t>
+            </w:r>
+          </w:p>
+        </w:tc>
+        <w:tc>
+          <w:tcPr/>
+          <w:p>
+            <w:pPr>
+              <w:pStyle w:val="BodyText"/>
+            </w:pPr>
+            <w:r>
+              <w:rPr>
+                <w:b/>
+                <w:bCs/>
+              </w:rPr>
+              <w:t xml:space="preserve">[TODO: template lists</w:t>
+            </w:r>
+            <w:r>
+              <w:rPr>
+                <w:b/>
+                <w:bCs/>
+              </w:rPr>
+              <w:t xml:space="preserve"> </w:t>
+            </w:r>
+            <w:r>
+              <w:rPr>
+                <w:b/>
+                <w:bCs/>
+              </w:rPr>
+              <w:t xml:space="preserve">the climate-delay/denial</w:t>
+            </w:r>
+            <w:r>
+              <w:rPr>
+                <w:b/>
+                <w:bCs/>
+              </w:rPr>
+              <w:t xml:space="preserve"> </w:t>
+            </w:r>
+            <w:r>
+              <w:rPr>
+                <w:b/>
+                <w:bCs/>
+              </w:rPr>
+              <w:t xml:space="preserve">literature here, which</w:t>
+            </w:r>
+            <w:r>
+              <w:rPr>
+                <w:b/>
+                <w:bCs/>
+              </w:rPr>
+              <w:t xml:space="preserve"> </w:t>
+            </w:r>
+            <w:r>
+              <w:rPr>
+                <w:b/>
+                <w:bCs/>
+              </w:rPr>
+              <w:t xml:space="preserve">matches session 5’s</w:t>
+            </w:r>
+            <w:r>
+              <w:rPr>
+                <w:b/>
+                <w:bCs/>
+              </w:rPr>
+              <w:t xml:space="preserve"> </w:t>
+            </w:r>
+            <w:r>
+              <w:rPr>
+                <w:b/>
+                <w:bCs/>
+              </w:rPr>
+              <w:t xml:space="preserve">topic — check</w:t>
+            </w:r>
+            <w:r>
+              <w:rPr>
+                <w:b/>
+                <w:bCs/>
+              </w:rPr>
+              <w:t xml:space="preserve"> </w:t>
+            </w:r>
+            <w:r>
+              <w:rPr>
+                <w:b/>
+                <w:bCs/>
+              </w:rPr>
+              <w:t xml:space="preserve">alignment]</w:t>
+            </w:r>
+          </w:p>
+          <w:p>
+            <w:pPr>
+              <w:pStyle w:val="BodyText"/>
+            </w:pPr>
+            <w:r>
+              <w:t xml:space="preserve">Lamb, W. F. et al.</w:t>
+            </w:r>
+            <w:r>
+              <w:t xml:space="preserve"> </w:t>
+            </w:r>
+            <w:r>
+              <w:t xml:space="preserve">(2020). Discourses of</w:t>
+            </w:r>
+            <w:r>
+              <w:t xml:space="preserve"> </w:t>
+            </w:r>
+            <w:r>
+              <w:t xml:space="preserve">climate delay.</w:t>
+            </w:r>
+          </w:p>
+          <w:p>
+            <w:pPr>
+              <w:pStyle w:val="BodyText"/>
+            </w:pPr>
+            <w:r>
+              <w:t xml:space="preserve">Cook, J. (2020).</w:t>
+            </w:r>
+            <w:r>
+              <w:t xml:space="preserve"> </w:t>
+            </w:r>
+            <w:r>
+              <w:t xml:space="preserve">Deconstructing Climate</w:t>
+            </w:r>
+            <w:r>
+              <w:t xml:space="preserve"> </w:t>
+            </w:r>
+            <w:r>
+              <w:t xml:space="preserve">Science Denial.</w:t>
+            </w:r>
+          </w:p>
+        </w:tc>
+      </w:tr>
+      <w:tr>
+        <w:tc>
+          <w:tcPr/>
+          <w:p>
+            <w:pPr>
+              <w:pStyle w:val="Compact"/>
+            </w:pPr>
+            <w:r>
+              <w:t xml:space="preserve">5</w:t>
+            </w:r>
+          </w:p>
+        </w:tc>
+        <w:tc>
+          <w:tcPr/>
+          <w:p>
+            <w:pPr>
+              <w:pStyle w:val="Compact"/>
+            </w:pPr>
+            <w:r>
+              <w:t xml:space="preserve">13.10.2026</w:t>
+            </w:r>
+          </w:p>
+        </w:tc>
+        <w:tc>
+          <w:tcPr/>
+          <w:p>
+            <w:pPr>
+              <w:pStyle w:val="BodyText"/>
+            </w:pPr>
+            <w:r>
+              <w:rPr>
+                <w:b/>
+                <w:bCs/>
+              </w:rPr>
+              <w:t xml:space="preserve">Climate change</w:t>
+            </w:r>
+            <w:r>
+              <w:rPr>
+                <w:b/>
+                <w:bCs/>
+              </w:rPr>
+              <w:t xml:space="preserve"> </w:t>
+            </w:r>
+            <w:r>
+              <w:rPr>
+                <w:b/>
+                <w:bCs/>
+              </w:rPr>
+              <w:t xml:space="preserve">misinformation</w:t>
+            </w:r>
+            <w:r>
+              <w:t xml:space="preserve"> </w:t>
+            </w:r>
+            <w:r>
+              <w:t xml:space="preserve">— Jan</w:t>
+            </w:r>
+            <w:r>
+              <w:t xml:space="preserve"> </w:t>
+            </w:r>
+            <w:r>
+              <w:t xml:space="preserve">Pfänder</w:t>
+            </w:r>
+          </w:p>
+          <w:p>
+            <w:pPr>
+              <w:pStyle w:val="BodyText"/>
+            </w:pPr>
+            <w:r>
+              <w:t xml:space="preserve">What are discourses that</w:t>
+            </w:r>
+            <w:r>
+              <w:t xml:space="preserve"> </w:t>
+            </w:r>
+            <w:r>
+              <w:t xml:space="preserve">delay action on climate</w:t>
+            </w:r>
+            <w:r>
+              <w:t xml:space="preserve"> </w:t>
+            </w:r>
+            <w:r>
+              <w:t xml:space="preserve">change? How do you</w:t>
+            </w:r>
+            <w:r>
+              <w:t xml:space="preserve"> </w:t>
+            </w:r>
+            <w:r>
+              <w:t xml:space="preserve">identify climate science</w:t>
+            </w:r>
+            <w:r>
+              <w:t xml:space="preserve"> </w:t>
+            </w:r>
+            <w:r>
+              <w:t xml:space="preserve">denial and how do you</w:t>
+            </w:r>
+            <w:r>
+              <w:t xml:space="preserve"> </w:t>
+            </w:r>
+            <w:r>
+              <w:t xml:space="preserve">respond to it?</w:t>
+            </w:r>
+          </w:p>
+        </w:tc>
+        <w:tc>
+          <w:tcPr/>
+          <w:p>
+            <w:pPr>
+              <w:pStyle w:val="Compact"/>
+            </w:pPr>
+            <w:r>
+              <w:rPr>
+                <w:b/>
+                <w:bCs/>
+              </w:rPr>
+              <w:t xml:space="preserve">[TODO: template’s</w:t>
+            </w:r>
+            <w:r>
+              <w:rPr>
+                <w:b/>
+                <w:bCs/>
+              </w:rPr>
+              <w:t xml:space="preserve"> </w:t>
+            </w:r>
+            <w:r>
+              <w:rPr>
+                <w:b/>
+                <w:bCs/>
+              </w:rPr>
+              <w:t xml:space="preserve">literature cell held</w:t>
+            </w:r>
+            <w:r>
+              <w:rPr>
+                <w:b/>
+                <w:bCs/>
+              </w:rPr>
+              <w:t xml:space="preserve"> </w:t>
+            </w:r>
+            <w:r>
+              <w:rPr>
+                <w:b/>
+                <w:bCs/>
+              </w:rPr>
+              <w:t xml:space="preserve">only a guest-prep note —</w:t>
+            </w:r>
+            <w:r>
+              <w:rPr>
+                <w:b/>
+                <w:bCs/>
+              </w:rPr>
+              <w:t xml:space="preserve"> </w:t>
+            </w:r>
+            <w:r>
+              <w:rPr>
+                <w:b/>
+                <w:bCs/>
+              </w:rPr>
+              <w:t xml:space="preserve">assign readings]</w:t>
+            </w:r>
+          </w:p>
+        </w:tc>
+      </w:tr>
+      <w:tr>
+        <w:tc>
+          <w:tcPr/>
+          <w:p>
+            <w:pPr>
+              <w:pStyle w:val="Compact"/>
+            </w:pPr>
+            <w:r>
+              <w:t xml:space="preserve">6</w:t>
+            </w:r>
+          </w:p>
+        </w:tc>
+        <w:tc>
+          <w:tcPr/>
+          <w:p>
+            <w:pPr>
+              <w:pStyle w:val="Compact"/>
+            </w:pPr>
+            <w:r>
+              <w:t xml:space="preserve">20.10.2026</w:t>
+            </w:r>
+          </w:p>
+        </w:tc>
+        <w:tc>
+          <w:tcPr/>
+          <w:p>
+            <w:pPr>
+              <w:pStyle w:val="BodyText"/>
+            </w:pPr>
+            <w:r>
+              <w:rPr>
+                <w:b/>
+                <w:bCs/>
+              </w:rPr>
+              <w:t xml:space="preserve">Emotions and</w:t>
+            </w:r>
+            <w:r>
+              <w:rPr>
+                <w:b/>
+                <w:bCs/>
+              </w:rPr>
+              <w:t xml:space="preserve"> </w:t>
+            </w:r>
+            <w:r>
+              <w:rPr>
+                <w:b/>
+                <w:bCs/>
+              </w:rPr>
+              <w:t xml:space="preserve">behavior</w:t>
+            </w:r>
+            <w:r>
+              <w:t xml:space="preserve"> </w:t>
+            </w:r>
+            <w:r>
+              <w:t xml:space="preserve">—</w:t>
+            </w:r>
+            <w:r>
+              <w:t xml:space="preserve"> </w:t>
+            </w:r>
+            <w:r>
+              <w:rPr>
+                <w:b/>
+                <w:bCs/>
+              </w:rPr>
+              <w:t xml:space="preserve">[TODO:</w:t>
+            </w:r>
+            <w:r>
+              <w:rPr>
+                <w:b/>
+                <w:bCs/>
+              </w:rPr>
+              <w:t xml:space="preserve"> </w:t>
+            </w:r>
+            <w:r>
+              <w:rPr>
+                <w:b/>
+                <w:bCs/>
+              </w:rPr>
+              <w:t xml:space="preserve">lecturer]</w:t>
+            </w:r>
+          </w:p>
+          <w:p>
+            <w:pPr>
+              <w:pStyle w:val="BodyText"/>
+            </w:pPr>
+            <w:r>
+              <w:t xml:space="preserve">What is the role of</w:t>
+            </w:r>
+            <w:r>
+              <w:t xml:space="preserve"> </w:t>
+            </w:r>
+            <w:r>
+              <w:t xml:space="preserve">emotions in climate</w:t>
+            </w:r>
+            <w:r>
+              <w:t xml:space="preserve"> </w:t>
+            </w:r>
+            <w:r>
+              <w:t xml:space="preserve">change communication?</w:t>
+            </w:r>
+            <w:r>
+              <w:t xml:space="preserve"> </w:t>
+            </w:r>
+            <w:r>
+              <w:t xml:space="preserve">How can we communicate</w:t>
+            </w:r>
+            <w:r>
+              <w:t xml:space="preserve"> </w:t>
+            </w:r>
+            <w:r>
+              <w:t xml:space="preserve">about climate change in</w:t>
+            </w:r>
+            <w:r>
+              <w:t xml:space="preserve"> </w:t>
+            </w:r>
+            <w:r>
+              <w:t xml:space="preserve">a way that increases</w:t>
+            </w:r>
+            <w:r>
+              <w:t xml:space="preserve"> </w:t>
+            </w:r>
+            <w:r>
+              <w:t xml:space="preserve">feelings of</w:t>
+            </w:r>
+            <w:r>
+              <w:t xml:space="preserve"> </w:t>
+            </w:r>
+            <w:r>
+              <w:t xml:space="preserve">self-efficacy? How does</w:t>
+            </w:r>
+            <w:r>
+              <w:t xml:space="preserve"> </w:t>
+            </w:r>
+            <w:r>
+              <w:t xml:space="preserve">media usage relate to</w:t>
+            </w:r>
+            <w:r>
+              <w:t xml:space="preserve"> </w:t>
+            </w:r>
+            <w:r>
+              <w:t xml:space="preserve">behavioral intentions?</w:t>
+            </w:r>
+          </w:p>
+        </w:tc>
+        <w:tc>
+          <w:tcPr/>
+          <w:p>
+            <w:pPr>
+              <w:pStyle w:val="BodyText"/>
+            </w:pPr>
+            <w:r>
+              <w:t xml:space="preserve">Myers, T. A. et al.</w:t>
+            </w:r>
+            <w:r>
+              <w:t xml:space="preserve"> </w:t>
+            </w:r>
+            <w:r>
+              <w:t xml:space="preserve">(2023). Emotional</w:t>
+            </w:r>
+            <w:r>
+              <w:t xml:space="preserve"> </w:t>
+            </w:r>
+            <w:r>
+              <w:t xml:space="preserve">responses to climate</w:t>
+            </w:r>
+            <w:r>
+              <w:t xml:space="preserve"> </w:t>
+            </w:r>
+            <w:r>
+              <w:t xml:space="preserve">change information and</w:t>
+            </w:r>
+            <w:r>
+              <w:t xml:space="preserve"> </w:t>
+            </w:r>
+            <w:r>
+              <w:t xml:space="preserve">their effects on policy</w:t>
+            </w:r>
+            <w:r>
+              <w:t xml:space="preserve"> </w:t>
+            </w:r>
+            <w:r>
+              <w:t xml:space="preserve">support.</w:t>
+            </w:r>
+          </w:p>
+          <w:p>
+            <w:pPr>
+              <w:pStyle w:val="BodyText"/>
+            </w:pPr>
+            <w:r>
+              <w:t xml:space="preserve">Ogunbode et al. (2022).</w:t>
+            </w:r>
+            <w:r>
+              <w:t xml:space="preserve"> </w:t>
+            </w:r>
+            <w:r>
+              <w:t xml:space="preserve">Climate anxiety,</w:t>
+            </w:r>
+            <w:r>
+              <w:t xml:space="preserve"> </w:t>
+            </w:r>
+            <w:r>
+              <w:t xml:space="preserve">wellbeing and</w:t>
+            </w:r>
+            <w:r>
+              <w:t xml:space="preserve"> </w:t>
+            </w:r>
+            <w:r>
+              <w:t xml:space="preserve">pro-environmental</w:t>
+            </w:r>
+            <w:r>
+              <w:t xml:space="preserve"> </w:t>
+            </w:r>
+            <w:r>
+              <w:t xml:space="preserve">action.</w:t>
+            </w:r>
+          </w:p>
+          <w:p>
+            <w:pPr>
+              <w:pStyle w:val="BodyText"/>
+            </w:pPr>
+            <w:r>
+              <w:t xml:space="preserve">Stanley et al. (2021).</w:t>
+            </w:r>
+            <w:r>
+              <w:t xml:space="preserve"> </w:t>
+            </w:r>
+            <w:r>
+              <w:t xml:space="preserve">From anger to action.</w:t>
+            </w:r>
+          </w:p>
+        </w:tc>
+      </w:tr>
+      <w:tr>
+        <w:tc>
+          <w:tcPr/>
+          <w:p>
+            <w:pPr>
+              <w:pStyle w:val="Compact"/>
+            </w:pPr>
+            <w:r>
+              <w:t xml:space="preserve">7</w:t>
+            </w:r>
+          </w:p>
+        </w:tc>
+        <w:tc>
+          <w:tcPr/>
+          <w:p>
+            <w:pPr>
+              <w:pStyle w:val="Compact"/>
+            </w:pPr>
+            <w:r>
+              <w:t xml:space="preserve">27.10.2026</w:t>
+            </w:r>
+          </w:p>
+        </w:tc>
+        <w:tc>
+          <w:tcPr/>
+          <w:p>
+            <w:pPr>
+              <w:pStyle w:val="BodyText"/>
+            </w:pPr>
+            <w:r>
+              <w:rPr>
+                <w:b/>
+                <w:bCs/>
+              </w:rPr>
+              <w:t xml:space="preserve">A question of trust</w:t>
+            </w:r>
+            <w:r>
+              <w:t xml:space="preserve"> </w:t>
+            </w:r>
+            <w:r>
+              <w:t xml:space="preserve">—</w:t>
+            </w:r>
+            <w:r>
+              <w:t xml:space="preserve"> </w:t>
+            </w:r>
+            <w:r>
+              <w:rPr>
+                <w:b/>
+                <w:bCs/>
+              </w:rPr>
+              <w:t xml:space="preserve">[TODO: lecturer]</w:t>
+            </w:r>
+          </w:p>
+          <w:p>
+            <w:pPr>
+              <w:pStyle w:val="BodyText"/>
+            </w:pPr>
+            <w:r>
+              <w:t xml:space="preserve">Which actors are the</w:t>
+            </w:r>
+            <w:r>
+              <w:t xml:space="preserve"> </w:t>
+            </w:r>
+            <w:r>
+              <w:t xml:space="preserve">most trusted sources of</w:t>
+            </w:r>
+            <w:r>
+              <w:t xml:space="preserve"> </w:t>
+            </w:r>
+            <w:r>
+              <w:t xml:space="preserve">information about</w:t>
+            </w:r>
+            <w:r>
+              <w:t xml:space="preserve"> </w:t>
+            </w:r>
+            <w:r>
+              <w:t xml:space="preserve">climate change? How can</w:t>
+            </w:r>
+            <w:r>
+              <w:t xml:space="preserve"> </w:t>
+            </w:r>
+            <w:r>
+              <w:t xml:space="preserve">we maintain and</w:t>
+            </w:r>
+            <w:r>
+              <w:t xml:space="preserve"> </w:t>
+            </w:r>
+            <w:r>
+              <w:t xml:space="preserve">potentially increase</w:t>
+            </w:r>
+            <w:r>
+              <w:t xml:space="preserve"> </w:t>
+            </w:r>
+            <w:r>
+              <w:t xml:space="preserve">trust in climate change</w:t>
+            </w:r>
+            <w:r>
+              <w:t xml:space="preserve"> </w:t>
+            </w:r>
+            <w:r>
+              <w:t xml:space="preserve">communicators? What is</w:t>
+            </w:r>
+            <w:r>
+              <w:t xml:space="preserve"> </w:t>
+            </w:r>
+            <w:r>
+              <w:t xml:space="preserve">the role of climate</w:t>
+            </w:r>
+            <w:r>
+              <w:t xml:space="preserve"> </w:t>
+            </w:r>
+            <w:r>
+              <w:t xml:space="preserve">scientists in</w:t>
+            </w:r>
+            <w:r>
+              <w:t xml:space="preserve"> </w:t>
+            </w:r>
+            <w:r>
+              <w:t xml:space="preserve">communicating and</w:t>
+            </w:r>
+            <w:r>
+              <w:t xml:space="preserve"> </w:t>
+            </w:r>
+            <w:r>
+              <w:t xml:space="preserve">engaging on the topic?</w:t>
+            </w:r>
+          </w:p>
+        </w:tc>
+        <w:tc>
+          <w:tcPr/>
+          <w:p>
+            <w:pPr>
+              <w:pStyle w:val="BodyText"/>
+            </w:pPr>
+            <w:r>
+              <w:t xml:space="preserve">Cologna, V. et al.</w:t>
+            </w:r>
+            <w:r>
+              <w:t xml:space="preserve"> </w:t>
+            </w:r>
+            <w:r>
+              <w:t xml:space="preserve">(2024). Trust in climate</w:t>
+            </w:r>
+            <w:r>
+              <w:t xml:space="preserve"> </w:t>
+            </w:r>
+            <w:r>
+              <w:t xml:space="preserve">science and climate</w:t>
+            </w:r>
+            <w:r>
+              <w:t xml:space="preserve"> </w:t>
+            </w:r>
+            <w:r>
+              <w:t xml:space="preserve">scientists: a narrative</w:t>
+            </w:r>
+            <w:r>
+              <w:t xml:space="preserve"> </w:t>
+            </w:r>
+            <w:r>
+              <w:t xml:space="preserve">review.</w:t>
+            </w:r>
+          </w:p>
+          <w:p>
+            <w:pPr>
+              <w:pStyle w:val="BodyText"/>
+            </w:pPr>
+            <w:r>
+              <w:t xml:space="preserve">Oreskes, N. (2020). What</w:t>
+            </w:r>
+            <w:r>
+              <w:t xml:space="preserve"> </w:t>
+            </w:r>
+            <w:r>
+              <w:t xml:space="preserve">Is the Social</w:t>
+            </w:r>
+            <w:r>
+              <w:t xml:space="preserve"> </w:t>
+            </w:r>
+            <w:r>
+              <w:t xml:space="preserve">Responsibility of</w:t>
+            </w:r>
+            <w:r>
+              <w:t xml:space="preserve"> </w:t>
+            </w:r>
+            <w:r>
+              <w:t xml:space="preserve">Climate Scientists?</w:t>
+            </w:r>
+          </w:p>
+        </w:tc>
+      </w:tr>
+      <w:tr>
+        <w:tc>
+          <w:tcPr/>
+          <w:p>
+            <w:pPr>
+              <w:pStyle w:val="Compact"/>
+            </w:pPr>
+            <w:r>
+              <w:t xml:space="preserve">8</w:t>
+            </w:r>
+          </w:p>
+        </w:tc>
+        <w:tc>
+          <w:tcPr/>
+          <w:p>
+            <w:pPr>
+              <w:pStyle w:val="Compact"/>
+            </w:pPr>
+            <w:r>
+              <w:t xml:space="preserve">03.11.2026</w:t>
+            </w:r>
+          </w:p>
+        </w:tc>
+        <w:tc>
+          <w:tcPr/>
+          <w:p>
+            <w:pPr>
+              <w:pStyle w:val="BodyText"/>
+            </w:pPr>
+            <w:r>
+              <w:rPr>
+                <w:b/>
+                <w:bCs/>
+              </w:rPr>
+              <w:t xml:space="preserve">Guest speaker: Dr.</w:t>
+            </w:r>
+            <w:r>
+              <w:rPr>
+                <w:b/>
+                <w:bCs/>
+              </w:rPr>
+              <w:t xml:space="preserve"> </w:t>
+            </w:r>
+            <w:r>
+              <w:rPr>
+                <w:b/>
+                <w:bCs/>
+              </w:rPr>
+              <w:t xml:space="preserve">Cornelia Schwierz</w:t>
+            </w:r>
+            <w:r>
+              <w:t xml:space="preserve"> </w:t>
+            </w:r>
+            <w:r>
+              <w:rPr>
+                <w:b/>
+                <w:bCs/>
+              </w:rPr>
+              <w:t xml:space="preserve">[TODO: confirm</w:t>
+            </w:r>
+            <w:r>
+              <w:rPr>
+                <w:b/>
+                <w:bCs/>
+              </w:rPr>
+              <w:t xml:space="preserve"> </w:t>
+            </w:r>
+            <w:r>
+              <w:rPr>
+                <w:b/>
+                <w:bCs/>
+              </w:rPr>
+              <w:t xml:space="preserve">speaker still</w:t>
+            </w:r>
+            <w:r>
+              <w:rPr>
+                <w:b/>
+                <w:bCs/>
+              </w:rPr>
+              <w:t xml:space="preserve"> </w:t>
+            </w:r>
+            <w:r>
+              <w:rPr>
+                <w:b/>
+                <w:bCs/>
+              </w:rPr>
+              <w:t xml:space="preserve">current]</w:t>
+            </w:r>
+          </w:p>
+          <w:p>
+            <w:pPr>
+              <w:pStyle w:val="BodyText"/>
+            </w:pPr>
+            <w:r>
+              <w:t xml:space="preserve">Dr. Cornelia Schwierz is</w:t>
+            </w:r>
+            <w:r>
+              <w:t xml:space="preserve"> </w:t>
+            </w:r>
+            <w:r>
+              <w:t xml:space="preserve">Head of Climate</w:t>
+            </w:r>
+            <w:r>
+              <w:t xml:space="preserve"> </w:t>
+            </w:r>
+            <w:r>
+              <w:t xml:space="preserve">Monitoring and</w:t>
+            </w:r>
+            <w:r>
+              <w:t xml:space="preserve"> </w:t>
+            </w:r>
+            <w:r>
+              <w:t xml:space="preserve">Information at the</w:t>
+            </w:r>
+            <w:r>
+              <w:t xml:space="preserve"> </w:t>
+            </w:r>
+            <w:r>
+              <w:t xml:space="preserve">Federal Office of</w:t>
+            </w:r>
+            <w:r>
+              <w:t xml:space="preserve"> </w:t>
+            </w:r>
+            <w:r>
+              <w:t xml:space="preserve">Meteorology and</w:t>
+            </w:r>
+            <w:r>
+              <w:t xml:space="preserve"> </w:t>
+            </w:r>
+            <w:r>
+              <w:t xml:space="preserve">Climatology</w:t>
+            </w:r>
+            <w:r>
+              <w:t xml:space="preserve"> </w:t>
+            </w:r>
+            <w:r>
+              <w:t xml:space="preserve">(MeteoSwiss). In her</w:t>
+            </w:r>
+            <w:r>
+              <w:t xml:space="preserve"> </w:t>
+            </w:r>
+            <w:r>
+              <w:t xml:space="preserve">talk, she will tell us</w:t>
+            </w:r>
+            <w:r>
+              <w:t xml:space="preserve"> </w:t>
+            </w:r>
+            <w:r>
+              <w:t xml:space="preserve">about the challenges the</w:t>
+            </w:r>
+            <w:r>
+              <w:t xml:space="preserve"> </w:t>
+            </w:r>
+            <w:r>
+              <w:t xml:space="preserve">Federal Office faces in</w:t>
+            </w:r>
+            <w:r>
+              <w:t xml:space="preserve"> </w:t>
+            </w:r>
+            <w:r>
+              <w:t xml:space="preserve">communicating about</w:t>
+            </w:r>
+            <w:r>
+              <w:t xml:space="preserve"> </w:t>
+            </w:r>
+            <w:r>
+              <w:t xml:space="preserve">climate change and how</w:t>
+            </w:r>
+            <w:r>
+              <w:t xml:space="preserve"> </w:t>
+            </w:r>
+            <w:r>
+              <w:t xml:space="preserve">they overcome them.</w:t>
+            </w:r>
+          </w:p>
+        </w:tc>
+        <w:tc>
+          <w:tcPr/>
+          <w:p>
+            <w:pPr>
+              <w:pStyle w:val="Compact"/>
+            </w:pPr>
+            <w:r>
+              <w:t xml:space="preserve">Preparation: Come to</w:t>
+            </w:r>
+            <w:r>
+              <w:t xml:space="preserve"> </w:t>
+            </w:r>
+            <w:r>
+              <w:t xml:space="preserve">class with at least 3</w:t>
+            </w:r>
+            <w:r>
+              <w:t xml:space="preserve"> </w:t>
+            </w:r>
+            <w:r>
+              <w:t xml:space="preserve">questions for our guest</w:t>
+            </w:r>
+            <w:r>
+              <w:t xml:space="preserve"> </w:t>
+            </w:r>
+            <w:r>
+              <w:t xml:space="preserve">speaker.</w:t>
+            </w:r>
+          </w:p>
+        </w:tc>
+      </w:tr>
+      <w:tr>
+        <w:tc>
+          <w:tcPr/>
+          <w:p>
+            <w:pPr>
+              <w:pStyle w:val="Compact"/>
+            </w:pPr>
+            <w:r>
+              <w:t xml:space="preserve">9</w:t>
+            </w:r>
+          </w:p>
+        </w:tc>
+        <w:tc>
+          <w:tcPr/>
+          <w:p>
+            <w:pPr>
+              <w:pStyle w:val="Compact"/>
+            </w:pPr>
+            <w:r>
+              <w:t xml:space="preserve">10.11.2026</w:t>
+            </w:r>
+          </w:p>
+        </w:tc>
+        <w:tc>
+          <w:tcPr/>
+          <w:p>
+            <w:pPr>
+              <w:pStyle w:val="BodyText"/>
+            </w:pPr>
+            <w:r>
+              <w:rPr>
+                <w:b/>
+                <w:bCs/>
+              </w:rPr>
+              <w:t xml:space="preserve">Climate change in the</w:t>
+            </w:r>
+            <w:r>
+              <w:rPr>
+                <w:b/>
+                <w:bCs/>
+              </w:rPr>
+              <w:t xml:space="preserve"> </w:t>
+            </w:r>
+            <w:r>
+              <w:rPr>
+                <w:b/>
+                <w:bCs/>
+              </w:rPr>
+              <w:t xml:space="preserve">media</w:t>
+            </w:r>
+            <w:r>
+              <w:t xml:space="preserve"> </w:t>
+            </w:r>
+            <w:r>
+              <w:t xml:space="preserve">— Viktoria</w:t>
+            </w:r>
+            <w:r>
+              <w:t xml:space="preserve"> </w:t>
+            </w:r>
+            <w:r>
+              <w:t xml:space="preserve">Cologna</w:t>
+            </w:r>
+          </w:p>
+          <w:p>
+            <w:pPr>
+              <w:pStyle w:val="BodyText"/>
+            </w:pPr>
+            <w:r>
+              <w:t xml:space="preserve">How has climate change</w:t>
+            </w:r>
+            <w:r>
+              <w:t xml:space="preserve"> </w:t>
+            </w:r>
+            <w:r>
+              <w:t xml:space="preserve">communication in the</w:t>
+            </w:r>
+            <w:r>
+              <w:t xml:space="preserve"> </w:t>
+            </w:r>
+            <w:r>
+              <w:t xml:space="preserve">media evolved over time?</w:t>
+            </w:r>
+            <w:r>
+              <w:t xml:space="preserve"> </w:t>
+            </w:r>
+            <w:r>
+              <w:t xml:space="preserve">How is climate change</w:t>
+            </w:r>
+            <w:r>
+              <w:t xml:space="preserve"> </w:t>
+            </w:r>
+            <w:r>
+              <w:t xml:space="preserve">depicted in the media?</w:t>
+            </w:r>
+            <w:r>
+              <w:t xml:space="preserve"> </w:t>
+            </w:r>
+            <w:r>
+              <w:t xml:space="preserve">How does imagery affect</w:t>
+            </w:r>
+            <w:r>
+              <w:t xml:space="preserve"> </w:t>
+            </w:r>
+            <w:r>
+              <w:t xml:space="preserve">public perceptions of</w:t>
+            </w:r>
+            <w:r>
+              <w:t xml:space="preserve"> </w:t>
+            </w:r>
+            <w:r>
+              <w:t xml:space="preserve">climate change?</w:t>
+            </w:r>
+          </w:p>
+        </w:tc>
+        <w:tc>
+          <w:tcPr/>
+          <w:p>
+            <w:pPr>
+              <w:pStyle w:val="BodyText"/>
+            </w:pPr>
+            <w:r>
+              <w:t xml:space="preserve">Metag, J. et al. (2016).</w:t>
+            </w:r>
+            <w:r>
+              <w:t xml:space="preserve"> </w:t>
+            </w:r>
+            <w:r>
+              <w:t xml:space="preserve">Perceptions of Climate</w:t>
+            </w:r>
+            <w:r>
+              <w:t xml:space="preserve"> </w:t>
+            </w:r>
+            <w:r>
+              <w:t xml:space="preserve">Change Imagery.</w:t>
+            </w:r>
+          </w:p>
+          <w:p>
+            <w:pPr>
+              <w:pStyle w:val="BodyText"/>
+            </w:pPr>
+            <w:r>
+              <w:t xml:space="preserve">O’Neill, S. J. (2013).</w:t>
+            </w:r>
+            <w:r>
+              <w:t xml:space="preserve"> </w:t>
+            </w:r>
+            <w:r>
+              <w:t xml:space="preserve">Image matters. Climate</w:t>
+            </w:r>
+            <w:r>
+              <w:t xml:space="preserve"> </w:t>
+            </w:r>
+            <w:r>
+              <w:t xml:space="preserve">change imagery in US, UK</w:t>
+            </w:r>
+            <w:r>
+              <w:t xml:space="preserve"> </w:t>
+            </w:r>
+            <w:r>
+              <w:t xml:space="preserve">and Australian</w:t>
+            </w:r>
+            <w:r>
+              <w:t xml:space="preserve"> </w:t>
+            </w:r>
+            <w:r>
+              <w:t xml:space="preserve">newspapers.</w:t>
+            </w:r>
+          </w:p>
+        </w:tc>
+      </w:tr>
+      <w:tr>
+        <w:tc>
+          <w:tcPr/>
+          <w:p>
+            <w:pPr>
+              <w:pStyle w:val="Compact"/>
+            </w:pPr>
+            <w:r>
+              <w:t xml:space="preserve">10</w:t>
+            </w:r>
+          </w:p>
+        </w:tc>
+        <w:tc>
+          <w:tcPr/>
+          <w:p>
+            <w:pPr>
+              <w:pStyle w:val="Compact"/>
+            </w:pPr>
+            <w:r>
+              <w:t xml:space="preserve">17.11.2026</w:t>
+            </w:r>
+          </w:p>
+        </w:tc>
+        <w:tc>
+          <w:tcPr/>
+          <w:p>
+            <w:pPr>
+              <w:pStyle w:val="Compact"/>
+            </w:pPr>
+            <w:r>
+              <w:rPr>
+                <w:b/>
+                <w:bCs/>
+              </w:rPr>
+              <w:t xml:space="preserve">MISSING</w:t>
+            </w:r>
+            <w:r>
+              <w:t xml:space="preserve"> </w:t>
+            </w:r>
+            <w:r>
+              <w:rPr>
+                <w:b/>
+                <w:bCs/>
+              </w:rPr>
+              <w:t xml:space="preserve">[TODO:</w:t>
+            </w:r>
+            <w:r>
+              <w:rPr>
+                <w:b/>
+                <w:bCs/>
+              </w:rPr>
+              <w:t xml:space="preserve"> </w:t>
+            </w:r>
+            <w:r>
+              <w:rPr>
+                <w:b/>
+                <w:bCs/>
+              </w:rPr>
+              <w:t xml:space="preserve">topic was literally</w:t>
+            </w:r>
+            <w:r>
+              <w:rPr>
+                <w:b/>
+                <w:bCs/>
+              </w:rPr>
+              <w:t xml:space="preserve"> </w:t>
+            </w:r>
+            <w:r>
+              <w:rPr>
+                <w:b/>
+                <w:bCs/>
+              </w:rPr>
+              <w:t xml:space="preserve">“MISSING”</w:t>
+            </w:r>
+            <w:r>
+              <w:rPr>
+                <w:b/>
+                <w:bCs/>
+              </w:rPr>
+              <w:t xml:space="preserve"> </w:t>
+            </w:r>
+            <w:r>
+              <w:rPr>
+                <w:b/>
+                <w:bCs/>
+              </w:rPr>
+              <w:t xml:space="preserve">in the</w:t>
+            </w:r>
+            <w:r>
+              <w:rPr>
+                <w:b/>
+                <w:bCs/>
+              </w:rPr>
+              <w:t xml:space="preserve"> </w:t>
+            </w:r>
+            <w:r>
+              <w:rPr>
+                <w:b/>
+                <w:bCs/>
+              </w:rPr>
+              <w:t xml:space="preserve">template — define this</w:t>
+            </w:r>
+            <w:r>
+              <w:rPr>
+                <w:b/>
+                <w:bCs/>
+              </w:rPr>
+              <w:t xml:space="preserve"> </w:t>
+            </w:r>
+            <w:r>
+              <w:rPr>
+                <w:b/>
+                <w:bCs/>
+              </w:rPr>
+              <w:t xml:space="preserve">session]</w:t>
+            </w:r>
+          </w:p>
+        </w:tc>
+        <w:tc>
+          <w:tcPr/>
+          <w:p>
+            <w:pPr>
+              <w:pStyle w:val="BodyText"/>
+            </w:pPr>
+            <w:r>
+              <w:t xml:space="preserve">Barkemeyer et al.</w:t>
+            </w:r>
+            <w:r>
+              <w:t xml:space="preserve"> </w:t>
+            </w:r>
+            <w:r>
+              <w:t xml:space="preserve">(2017). Media coverage</w:t>
+            </w:r>
+            <w:r>
+              <w:t xml:space="preserve"> </w:t>
+            </w:r>
+            <w:r>
+              <w:t xml:space="preserve">of climate change: An</w:t>
+            </w:r>
+            <w:r>
+              <w:t xml:space="preserve"> </w:t>
+            </w:r>
+            <w:r>
+              <w:t xml:space="preserve">international</w:t>
+            </w:r>
+            <w:r>
+              <w:t xml:space="preserve"> </w:t>
+            </w:r>
+            <w:r>
+              <w:t xml:space="preserve">comparison.</w:t>
+            </w:r>
+          </w:p>
+          <w:p>
+            <w:pPr>
+              <w:pStyle w:val="BodyText"/>
+            </w:pPr>
+            <w:r>
+              <w:t xml:space="preserve">Klinger, K., &amp; Metag, J.</w:t>
+            </w:r>
+            <w:r>
+              <w:t xml:space="preserve"> </w:t>
+            </w:r>
+            <w:r>
+              <w:t xml:space="preserve">(2021). Media effects in</w:t>
+            </w:r>
+            <w:r>
+              <w:t xml:space="preserve"> </w:t>
+            </w:r>
+            <w:r>
+              <w:t xml:space="preserve">the context of</w:t>
+            </w:r>
+            <w:r>
+              <w:t xml:space="preserve"> </w:t>
+            </w:r>
+            <w:r>
+              <w:t xml:space="preserve">environmental issues.</w:t>
+            </w:r>
+          </w:p>
+          <w:p>
+            <w:pPr>
+              <w:pStyle w:val="BodyText"/>
+            </w:pPr>
+            <w:r>
+              <w:t xml:space="preserve">Schäfer and Painter</w:t>
+            </w:r>
+            <w:r>
+              <w:t xml:space="preserve"> </w:t>
+            </w:r>
+            <w:r>
+              <w:t xml:space="preserve">(2021). Climate</w:t>
+            </w:r>
+            <w:r>
+              <w:t xml:space="preserve"> </w:t>
+            </w:r>
+            <w:r>
+              <w:t xml:space="preserve">journalism in a changing</w:t>
+            </w:r>
+            <w:r>
+              <w:t xml:space="preserve"> </w:t>
+            </w:r>
+            <w:r>
+              <w:t xml:space="preserve">media ecosystem.</w:t>
+            </w:r>
+          </w:p>
+        </w:tc>
+      </w:tr>
+      <w:tr>
+        <w:tc>
+          <w:tcPr/>
+          <w:p>
+            <w:pPr>
+              <w:pStyle w:val="Compact"/>
+            </w:pPr>
+            <w:r>
+              <w:t xml:space="preserve">11</w:t>
+            </w:r>
+          </w:p>
+        </w:tc>
+        <w:tc>
+          <w:tcPr/>
+          <w:p>
+            <w:pPr>
+              <w:pStyle w:val="Compact"/>
+            </w:pPr>
+            <w:r>
+              <w:t xml:space="preserve">24.11.2026</w:t>
+            </w:r>
+          </w:p>
+        </w:tc>
+        <w:tc>
+          <w:tcPr/>
+          <w:p>
+            <w:pPr>
+              <w:pStyle w:val="BodyText"/>
+            </w:pPr>
+            <w:r>
+              <w:rPr>
+                <w:b/>
+                <w:bCs/>
+              </w:rPr>
+              <w:t xml:space="preserve">Guest speaker:</w:t>
+            </w:r>
+            <w:r>
+              <w:rPr>
+                <w:b/>
+                <w:bCs/>
+              </w:rPr>
+              <w:t xml:space="preserve"> </w:t>
+            </w:r>
+            <w:r>
+              <w:rPr>
+                <w:b/>
+                <w:bCs/>
+              </w:rPr>
+              <w:t xml:space="preserve">Cornelia Eisenach</w:t>
+            </w:r>
+          </w:p>
+          <w:p>
+            <w:pPr>
+              <w:pStyle w:val="BodyText"/>
+            </w:pPr>
+            <w:r>
+              <w:rPr>
+                <w:b/>
+                <w:bCs/>
+              </w:rPr>
+              <w:t xml:space="preserve">[TODO: blurb below</w:t>
+            </w:r>
+            <w:r>
+              <w:rPr>
+                <w:b/>
+                <w:bCs/>
+              </w:rPr>
+              <w:t xml:space="preserve"> </w:t>
+            </w:r>
+            <w:r>
+              <w:rPr>
+                <w:b/>
+                <w:bCs/>
+              </w:rPr>
+              <w:t xml:space="preserve">describes a different</w:t>
+            </w:r>
+            <w:r>
+              <w:rPr>
+                <w:b/>
+                <w:bCs/>
+              </w:rPr>
+              <w:t xml:space="preserve"> </w:t>
+            </w:r>
+            <w:r>
+              <w:rPr>
+                <w:b/>
+                <w:bCs/>
+              </w:rPr>
+              <w:t xml:space="preserve">person (Sabrina Weiss) —</w:t>
+            </w:r>
+            <w:r>
+              <w:rPr>
+                <w:b/>
+                <w:bCs/>
+              </w:rPr>
+              <w:t xml:space="preserve"> </w:t>
+            </w:r>
+            <w:r>
+              <w:rPr>
+                <w:b/>
+                <w:bCs/>
+              </w:rPr>
+              <w:t xml:space="preserve">rewrite for the actual</w:t>
+            </w:r>
+            <w:r>
+              <w:rPr>
+                <w:b/>
+                <w:bCs/>
+              </w:rPr>
+              <w:t xml:space="preserve"> </w:t>
+            </w:r>
+            <w:r>
+              <w:rPr>
+                <w:b/>
+                <w:bCs/>
+              </w:rPr>
+              <w:t xml:space="preserve">speaker]</w:t>
+            </w:r>
+          </w:p>
+          <w:p>
+            <w:pPr>
+              <w:pStyle w:val="BodyText"/>
+            </w:pPr>
+            <w:r>
+              <w:t xml:space="preserve">Sabrina Weiss is a Swiss</w:t>
+            </w:r>
+            <w:r>
+              <w:t xml:space="preserve"> </w:t>
+            </w:r>
+            <w:r>
+              <w:t xml:space="preserve">climate journalist. She</w:t>
+            </w:r>
+            <w:r>
+              <w:t xml:space="preserve"> </w:t>
+            </w:r>
+            <w:r>
+              <w:t xml:space="preserve">holds a BA in Media &amp;</w:t>
+            </w:r>
+            <w:r>
+              <w:t xml:space="preserve"> </w:t>
+            </w:r>
+            <w:r>
+              <w:t xml:space="preserve">Communication Sciences</w:t>
+            </w:r>
+            <w:r>
+              <w:t xml:space="preserve"> </w:t>
+            </w:r>
+            <w:r>
+              <w:t xml:space="preserve">from the University of</w:t>
+            </w:r>
+            <w:r>
+              <w:t xml:space="preserve"> </w:t>
+            </w:r>
+            <w:r>
+              <w:t xml:space="preserve">Zurich and an MSc in</w:t>
+            </w:r>
+            <w:r>
+              <w:t xml:space="preserve"> </w:t>
+            </w:r>
+            <w:r>
+              <w:t xml:space="preserve">Communication Psychology</w:t>
+            </w:r>
+            <w:r>
+              <w:t xml:space="preserve"> </w:t>
+            </w:r>
+            <w:r>
+              <w:t xml:space="preserve">from the London School</w:t>
+            </w:r>
+            <w:r>
+              <w:t xml:space="preserve"> </w:t>
+            </w:r>
+            <w:r>
+              <w:t xml:space="preserve">of Economics and</w:t>
+            </w:r>
+            <w:r>
+              <w:t xml:space="preserve"> </w:t>
+            </w:r>
+            <w:r>
+              <w:t xml:space="preserve">Political Science.</w:t>
+            </w:r>
+            <w:r>
+              <w:t xml:space="preserve"> </w:t>
+            </w:r>
+            <w:r>
+              <w:t xml:space="preserve">Sabrina Weiss is the</w:t>
+            </w:r>
+            <w:r>
+              <w:t xml:space="preserve"> </w:t>
+            </w:r>
+            <w:r>
+              <w:t xml:space="preserve">co-founder of the</w:t>
+            </w:r>
+            <w:r>
+              <w:t xml:space="preserve"> </w:t>
+            </w:r>
+            <w:r>
+              <w:t xml:space="preserve">Climate Journalism</w:t>
+            </w:r>
+            <w:r>
+              <w:t xml:space="preserve"> </w:t>
+            </w:r>
+            <w:r>
+              <w:t xml:space="preserve">Network. In her talk,</w:t>
+            </w:r>
+            <w:r>
+              <w:t xml:space="preserve"> </w:t>
+            </w:r>
+            <w:r>
+              <w:t xml:space="preserve">she will tell us about</w:t>
+            </w:r>
+            <w:r>
+              <w:t xml:space="preserve"> </w:t>
+            </w:r>
+            <w:r>
+              <w:t xml:space="preserve">the challenges of</w:t>
+            </w:r>
+            <w:r>
+              <w:t xml:space="preserve"> </w:t>
+            </w:r>
+            <w:r>
+              <w:t xml:space="preserve">climate change</w:t>
+            </w:r>
+            <w:r>
+              <w:t xml:space="preserve"> </w:t>
+            </w:r>
+            <w:r>
+              <w:t xml:space="preserve">communication in</w:t>
+            </w:r>
+            <w:r>
+              <w:t xml:space="preserve"> </w:t>
+            </w:r>
+            <w:r>
+              <w:t xml:space="preserve">journalism and how to</w:t>
+            </w:r>
+            <w:r>
+              <w:t xml:space="preserve"> </w:t>
+            </w:r>
+            <w:r>
+              <w:t xml:space="preserve">overcome them.</w:t>
+            </w:r>
+          </w:p>
+        </w:tc>
+        <w:tc>
+          <w:tcPr/>
+          <w:p>
+            <w:pPr>
+              <w:pStyle w:val="Compact"/>
+            </w:pPr>
+            <w:r>
+              <w:t xml:space="preserve">Preparation: Come to</w:t>
+            </w:r>
+            <w:r>
+              <w:t xml:space="preserve"> </w:t>
+            </w:r>
+            <w:r>
+              <w:t xml:space="preserve">class with at least 3</w:t>
+            </w:r>
+            <w:r>
+              <w:t xml:space="preserve"> </w:t>
+            </w:r>
+            <w:r>
+              <w:t xml:space="preserve">questions for our guest</w:t>
+            </w:r>
+            <w:r>
+              <w:t xml:space="preserve"> </w:t>
+            </w:r>
+            <w:r>
+              <w:t xml:space="preserve">speaker.</w:t>
+            </w:r>
+          </w:p>
+        </w:tc>
+      </w:tr>
+      <w:tr>
+        <w:tc>
+          <w:tcPr/>
+          <w:p>
+            <w:pPr>
+              <w:pStyle w:val="Compact"/>
+            </w:pPr>
+            <w:r>
+              <w:t xml:space="preserve">12</w:t>
+            </w:r>
+          </w:p>
+        </w:tc>
+        <w:tc>
+          <w:tcPr/>
+          <w:p>
+            <w:pPr>
+              <w:pStyle w:val="Compact"/>
+            </w:pPr>
+            <w:r>
+              <w:t xml:space="preserve">01.12.2026</w:t>
+            </w:r>
+          </w:p>
+        </w:tc>
+        <w:tc>
+          <w:tcPr/>
+          <w:p>
+            <w:pPr>
+              <w:pStyle w:val="BodyText"/>
+            </w:pPr>
+            <w:r>
+              <w:rPr>
+                <w:b/>
+                <w:bCs/>
+              </w:rPr>
+              <w:t xml:space="preserve">Guest speaker: Reto</w:t>
+            </w:r>
+            <w:r>
+              <w:rPr>
+                <w:b/>
+                <w:bCs/>
+              </w:rPr>
+              <w:t xml:space="preserve"> </w:t>
+            </w:r>
+            <w:r>
+              <w:rPr>
+                <w:b/>
+                <w:bCs/>
+              </w:rPr>
+              <w:t xml:space="preserve">Knutti</w:t>
+            </w:r>
+          </w:p>
+          <w:p>
+            <w:pPr>
+              <w:pStyle w:val="BodyText"/>
+            </w:pPr>
+            <w:r>
+              <w:rPr>
+                <w:b/>
+                <w:bCs/>
+              </w:rPr>
+              <w:t xml:space="preserve">[TODO: description</w:t>
+            </w:r>
+            <w:r>
+              <w:rPr>
+                <w:b/>
+                <w:bCs/>
+              </w:rPr>
+              <w:t xml:space="preserve"> </w:t>
+            </w:r>
+            <w:r>
+              <w:rPr>
+                <w:b/>
+                <w:bCs/>
+              </w:rPr>
+              <w:t xml:space="preserve">below is a wrap-up</w:t>
+            </w:r>
+            <w:r>
+              <w:rPr>
+                <w:b/>
+                <w:bCs/>
+              </w:rPr>
+              <w:t xml:space="preserve"> </w:t>
+            </w:r>
+            <w:r>
+              <w:rPr>
+                <w:b/>
+                <w:bCs/>
+              </w:rPr>
+              <w:t xml:space="preserve">summary from the old</w:t>
+            </w:r>
+            <w:r>
+              <w:rPr>
+                <w:b/>
+                <w:bCs/>
+              </w:rPr>
+              <w:t xml:space="preserve"> </w:t>
+            </w:r>
+            <w:r>
+              <w:rPr>
+                <w:b/>
+                <w:bCs/>
+              </w:rPr>
+              <w:t xml:space="preserve">course, not a speaker</w:t>
+            </w:r>
+            <w:r>
+              <w:rPr>
+                <w:b/>
+                <w:bCs/>
+              </w:rPr>
+              <w:t xml:space="preserve"> </w:t>
+            </w:r>
+            <w:r>
+              <w:rPr>
+                <w:b/>
+                <w:bCs/>
+              </w:rPr>
+              <w:t xml:space="preserve">blurb — rewrite]</w:t>
+            </w:r>
+          </w:p>
+          <w:p>
+            <w:pPr>
+              <w:pStyle w:val="BodyText"/>
+            </w:pPr>
+            <w:r>
+              <w:t xml:space="preserve">Based on what we have</w:t>
+            </w:r>
+            <w:r>
+              <w:t xml:space="preserve"> </w:t>
+            </w:r>
+            <w:r>
+              <w:t xml:space="preserve">learned in the previous</w:t>
+            </w:r>
+            <w:r>
+              <w:t xml:space="preserve"> </w:t>
+            </w:r>
+            <w:r>
+              <w:t xml:space="preserve">weeks, we will summarize</w:t>
+            </w:r>
+            <w:r>
+              <w:t xml:space="preserve"> </w:t>
+            </w:r>
+            <w:r>
+              <w:t xml:space="preserve">and discuss successful</w:t>
+            </w:r>
+            <w:r>
+              <w:t xml:space="preserve"> </w:t>
+            </w:r>
+            <w:r>
+              <w:t xml:space="preserve">communication</w:t>
+            </w:r>
+            <w:r>
+              <w:t xml:space="preserve"> </w:t>
+            </w:r>
+            <w:r>
+              <w:t xml:space="preserve">strategies.</w:t>
+            </w:r>
+          </w:p>
+        </w:tc>
+        <w:tc>
+          <w:tcPr/>
+          <w:p>
+            <w:pPr>
+              <w:pStyle w:val="BodyText"/>
+            </w:pPr>
+            <w:r>
+              <w:t xml:space="preserve">Maibach, E. W. et al.</w:t>
+            </w:r>
+            <w:r>
+              <w:t xml:space="preserve"> </w:t>
+            </w:r>
+            <w:r>
+              <w:t xml:space="preserve">(2023). Harnessing the</w:t>
+            </w:r>
+            <w:r>
+              <w:t xml:space="preserve"> </w:t>
+            </w:r>
+            <w:r>
+              <w:t xml:space="preserve">power of communication</w:t>
+            </w:r>
+            <w:r>
+              <w:t xml:space="preserve"> </w:t>
+            </w:r>
+            <w:r>
+              <w:t xml:space="preserve">and behavior science to</w:t>
+            </w:r>
+            <w:r>
+              <w:t xml:space="preserve"> </w:t>
+            </w:r>
+            <w:r>
+              <w:t xml:space="preserve">enhance society’s</w:t>
+            </w:r>
+            <w:r>
+              <w:t xml:space="preserve"> </w:t>
+            </w:r>
+            <w:r>
+              <w:t xml:space="preserve">response to climate</w:t>
+            </w:r>
+            <w:r>
+              <w:t xml:space="preserve"> </w:t>
+            </w:r>
+            <w:r>
+              <w:t xml:space="preserve">change.</w:t>
+            </w:r>
+          </w:p>
+          <w:p>
+            <w:pPr>
+              <w:pStyle w:val="BodyText"/>
+            </w:pPr>
+            <w:r>
+              <w:t xml:space="preserve">Corner et al. (2018).</w:t>
+            </w:r>
+            <w:r>
+              <w:t xml:space="preserve"> </w:t>
+            </w:r>
+            <w:r>
+              <w:t xml:space="preserve">Principles for effective</w:t>
+            </w:r>
+            <w:r>
+              <w:t xml:space="preserve"> </w:t>
+            </w:r>
+            <w:r>
+              <w:t xml:space="preserve">communication and public</w:t>
+            </w:r>
+            <w:r>
+              <w:t xml:space="preserve"> </w:t>
+            </w:r>
+            <w:r>
+              <w:t xml:space="preserve">engagement on climate</w:t>
+            </w:r>
+            <w:r>
+              <w:t xml:space="preserve"> </w:t>
+            </w:r>
+            <w:r>
+              <w:t xml:space="preserve">change.</w:t>
+            </w:r>
+            <w:r>
+              <w:t xml:space="preserve"> </w:t>
+            </w:r>
+            <w:r>
+              <w:rPr>
+                <w:b/>
+                <w:bCs/>
+              </w:rPr>
+              <w:t xml:space="preserve">[TODO:</w:t>
+            </w:r>
+            <w:r>
+              <w:rPr>
+                <w:b/>
+                <w:bCs/>
+              </w:rPr>
+              <w:t xml:space="preserve"> </w:t>
+            </w:r>
+            <w:r>
+              <w:rPr>
+                <w:b/>
+                <w:bCs/>
+              </w:rPr>
+              <w:t xml:space="preserve">missing from reference</w:t>
+            </w:r>
+            <w:r>
+              <w:rPr>
+                <w:b/>
+                <w:bCs/>
+              </w:rPr>
+              <w:t xml:space="preserve"> </w:t>
+            </w:r>
+            <w:r>
+              <w:rPr>
+                <w:b/>
+                <w:bCs/>
+              </w:rPr>
+              <w:t xml:space="preserve">list]</w:t>
+            </w:r>
+          </w:p>
+        </w:tc>
+      </w:tr>
+      <w:tr>
+        <w:tc>
+          <w:tcPr/>
+          <w:p>
+            <w:pPr>
+              <w:pStyle w:val="Compact"/>
+            </w:pPr>
+            <w:r>
+              <w:t xml:space="preserve">13</w:t>
+            </w:r>
+          </w:p>
+        </w:tc>
+        <w:tc>
+          <w:tcPr/>
+          <w:p>
+            <w:pPr>
+              <w:pStyle w:val="Compact"/>
+            </w:pPr>
+            <w:r>
+              <w:t xml:space="preserve">08.12.2026</w:t>
+            </w:r>
+          </w:p>
+        </w:tc>
+        <w:tc>
+          <w:tcPr/>
+          <w:p>
+            <w:pPr>
+              <w:pStyle w:val="BodyText"/>
+            </w:pPr>
+            <w:r>
+              <w:rPr>
+                <w:b/>
+                <w:bCs/>
+              </w:rPr>
+              <w:t xml:space="preserve">Guest speaker:</w:t>
+            </w:r>
+            <w:r>
+              <w:rPr>
+                <w:b/>
+                <w:bCs/>
+              </w:rPr>
+              <w:t xml:space="preserve"> </w:t>
+            </w:r>
+            <w:r>
+              <w:rPr>
+                <w:b/>
+                <w:bCs/>
+              </w:rPr>
+              <w:t xml:space="preserve">Industry/Kanton</w:t>
+            </w:r>
+            <w:r>
+              <w:t xml:space="preserve"> </w:t>
+            </w:r>
+            <w:r>
+              <w:rPr>
+                <w:b/>
+                <w:bCs/>
+              </w:rPr>
+              <w:t xml:space="preserve">[TODO: placeholder</w:t>
+            </w:r>
+            <w:r>
+              <w:rPr>
+                <w:b/>
+                <w:bCs/>
+              </w:rPr>
+              <w:t xml:space="preserve"> </w:t>
+            </w:r>
+            <w:r>
+              <w:rPr>
+                <w:b/>
+                <w:bCs/>
+              </w:rPr>
+              <w:t xml:space="preserve">title — confirm</w:t>
+            </w:r>
+            <w:r>
+              <w:rPr>
+                <w:b/>
+                <w:bCs/>
+              </w:rPr>
+              <w:t xml:space="preserve"> </w:t>
+            </w:r>
+            <w:r>
+              <w:rPr>
+                <w:b/>
+                <w:bCs/>
+              </w:rPr>
+              <w:t xml:space="preserve">speaker]</w:t>
+            </w:r>
+          </w:p>
+          <w:p>
+            <w:pPr>
+              <w:pStyle w:val="BodyText"/>
+            </w:pPr>
+            <w:r>
+              <w:rPr>
+                <w:b/>
+                <w:bCs/>
+              </w:rPr>
+              <w:t xml:space="preserve">[TODO: description</w:t>
+            </w:r>
+            <w:r>
+              <w:rPr>
+                <w:b/>
+                <w:bCs/>
+              </w:rPr>
+              <w:t xml:space="preserve"> </w:t>
+            </w:r>
+            <w:r>
+              <w:rPr>
+                <w:b/>
+                <w:bCs/>
+              </w:rPr>
+              <w:t xml:space="preserve">below is the old</w:t>
+            </w:r>
+            <w:r>
+              <w:rPr>
+                <w:b/>
+                <w:bCs/>
+              </w:rPr>
+              <w:t xml:space="preserve"> </w:t>
+            </w:r>
+            <w:r>
+              <w:rPr>
+                <w:b/>
+                <w:bCs/>
+              </w:rPr>
+              <w:t xml:space="preserve">course’s recap-session</w:t>
+            </w:r>
+            <w:r>
+              <w:rPr>
+                <w:b/>
+                <w:bCs/>
+              </w:rPr>
+              <w:t xml:space="preserve"> </w:t>
+            </w:r>
+            <w:r>
+              <w:rPr>
+                <w:b/>
+                <w:bCs/>
+              </w:rPr>
+              <w:t xml:space="preserve">text]</w:t>
+            </w:r>
+          </w:p>
+          <w:p>
+            <w:pPr>
+              <w:pStyle w:val="BodyText"/>
+            </w:pPr>
+            <w:r>
+              <w:t xml:space="preserve">We will reflect on the</w:t>
+            </w:r>
+            <w:r>
+              <w:t xml:space="preserve"> </w:t>
+            </w:r>
+            <w:r>
+              <w:t xml:space="preserve">contributions by our</w:t>
+            </w:r>
+            <w:r>
+              <w:t xml:space="preserve"> </w:t>
+            </w:r>
+            <w:r>
+              <w:t xml:space="preserve">guest speakers and how</w:t>
+            </w:r>
+            <w:r>
+              <w:t xml:space="preserve"> </w:t>
+            </w:r>
+            <w:r>
+              <w:t xml:space="preserve">they relate to what we</w:t>
+            </w:r>
+            <w:r>
+              <w:t xml:space="preserve"> </w:t>
+            </w:r>
+            <w:r>
+              <w:t xml:space="preserve">have learned in the</w:t>
+            </w:r>
+            <w:r>
+              <w:t xml:space="preserve"> </w:t>
+            </w:r>
+            <w:r>
+              <w:t xml:space="preserve">previous sessions. In</w:t>
+            </w:r>
+            <w:r>
+              <w:t xml:space="preserve"> </w:t>
+            </w:r>
+            <w:r>
+              <w:t xml:space="preserve">preparation for the</w:t>
+            </w:r>
+            <w:r>
+              <w:t xml:space="preserve"> </w:t>
+            </w:r>
+            <w:r>
+              <w:t xml:space="preserve">exam, we will recap the</w:t>
+            </w:r>
+            <w:r>
+              <w:t xml:space="preserve"> </w:t>
+            </w:r>
+            <w:r>
+              <w:t xml:space="preserve">main lessons learnt in</w:t>
+            </w:r>
+            <w:r>
+              <w:t xml:space="preserve"> </w:t>
+            </w:r>
+            <w:r>
+              <w:t xml:space="preserve">this course.</w:t>
+            </w:r>
+          </w:p>
+        </w:tc>
+        <w:tc>
+          <w:tcPr/>
+          <w:p>
+            <w:pPr>
+              <w:pStyle w:val="Compact"/>
+            </w:pPr>
+          </w:p>
+        </w:tc>
+      </w:tr>
+      <w:tr>
+        <w:tc>
+          <w:tcPr/>
+          <w:p>
+            <w:pPr>
+              <w:pStyle w:val="Compact"/>
+            </w:pPr>
+            <w:r>
+              <w:t xml:space="preserve">14</w:t>
+            </w:r>
+          </w:p>
+        </w:tc>
+        <w:tc>
+          <w:tcPr/>
+          <w:p>
+            <w:pPr>
+              <w:pStyle w:val="Compact"/>
+            </w:pPr>
+            <w:r>
+              <w:t xml:space="preserve">15.12.2026</w:t>
+            </w:r>
+          </w:p>
+        </w:tc>
+        <w:tc>
+          <w:tcPr/>
+          <w:p>
+            <w:pPr>
+              <w:pStyle w:val="BodyText"/>
+            </w:pPr>
+            <w:r>
+              <w:rPr>
+                <w:b/>
+                <w:bCs/>
+              </w:rPr>
+              <w:t xml:space="preserve">Discussion and lessons</w:t>
+            </w:r>
+            <w:r>
+              <w:rPr>
+                <w:b/>
+                <w:bCs/>
+              </w:rPr>
+              <w:t xml:space="preserve"> </w:t>
+            </w:r>
+            <w:r>
+              <w:rPr>
+                <w:b/>
+                <w:bCs/>
+              </w:rPr>
+              <w:t xml:space="preserve">learnt</w:t>
+            </w:r>
+            <w:r>
+              <w:t xml:space="preserve"> </w:t>
+            </w:r>
+            <w:r>
+              <w:t xml:space="preserve">— Viktoria</w:t>
+            </w:r>
+            <w:r>
+              <w:t xml:space="preserve"> </w:t>
+            </w:r>
+            <w:r>
+              <w:t xml:space="preserve">Cologna &amp; Jan Pfänder</w:t>
+            </w:r>
+          </w:p>
+          <w:p>
+            <w:pPr>
+              <w:pStyle w:val="BodyText"/>
+            </w:pPr>
+            <w:r>
+              <w:rPr>
+                <w:b/>
+                <w:bCs/>
+              </w:rPr>
+              <w:t xml:space="preserve">[TODO: description</w:t>
+            </w:r>
+            <w:r>
+              <w:rPr>
+                <w:b/>
+                <w:bCs/>
+              </w:rPr>
+              <w:t xml:space="preserve"> </w:t>
+            </w:r>
+            <w:r>
+              <w:rPr>
+                <w:b/>
+                <w:bCs/>
+              </w:rPr>
+              <w:t xml:space="preserve">below contains stale</w:t>
+            </w:r>
+            <w:r>
+              <w:rPr>
+                <w:b/>
+                <w:bCs/>
+              </w:rPr>
+              <w:t xml:space="preserve"> </w:t>
+            </w:r>
+            <w:r>
+              <w:rPr>
+                <w:b/>
+                <w:bCs/>
+              </w:rPr>
+              <w:t xml:space="preserve">2024 exam logistics —</w:t>
+            </w:r>
+            <w:r>
+              <w:rPr>
+                <w:b/>
+                <w:bCs/>
+              </w:rPr>
+              <w:t xml:space="preserve"> </w:t>
+            </w:r>
+            <w:r>
+              <w:rPr>
+                <w:b/>
+                <w:bCs/>
+              </w:rPr>
+              <w:t xml:space="preserve">rewrite]</w:t>
+            </w:r>
+          </w:p>
+          <w:p>
+            <w:pPr>
+              <w:pStyle w:val="BodyText"/>
+            </w:pPr>
+            <w:r>
+              <w:t xml:space="preserve">The exam will take place</w:t>
+            </w:r>
+            <w:r>
+              <w:t xml:space="preserve"> </w:t>
+            </w:r>
+            <w:r>
+              <w:t xml:space="preserve">on-site. The format of</w:t>
+            </w:r>
+            <w:r>
+              <w:t xml:space="preserve"> </w:t>
+            </w:r>
+            <w:r>
+              <w:t xml:space="preserve">the exam (online or pen</w:t>
+            </w:r>
+            <w:r>
+              <w:t xml:space="preserve"> </w:t>
+            </w:r>
+            <w:r>
+              <w:t xml:space="preserve">and paper) will be</w:t>
+            </w:r>
+            <w:r>
+              <w:t xml:space="preserve"> </w:t>
+            </w:r>
+            <w:r>
+              <w:t xml:space="preserve">communicated at a later</w:t>
+            </w:r>
+            <w:r>
+              <w:t xml:space="preserve"> </w:t>
+            </w:r>
+            <w:r>
+              <w:t xml:space="preserve">stage.</w:t>
+            </w:r>
+          </w:p>
+        </w:tc>
+        <w:tc>
+          <w:tcPr/>
+          <w:p>
+            <w:pPr>
+              <w:pStyle w:val="Compact"/>
+            </w:pPr>
+          </w:p>
+        </w:tc>
+      </w:tr>
+    </w:tbl>
     <w:bookmarkEnd w:id="31"/>
-    <w:bookmarkStart w:id="32" w:name="X959b7bb8eb6942e8b64bebc2533c39bccccc0a7"/>
-    <w:p>
-      <w:pPr>
-        <w:pStyle w:val="Heading3"/>
-      </w:pPr>
-      <w:r>
-        <w:t xml:space="preserve">2 — 22.09.2026 — Climate change, the deficit model, and public opinion</w:t>
-      </w:r>
-    </w:p>
-    <w:p>
-      <w:pPr>
-        <w:pStyle w:val="FirstParagraph"/>
-      </w:pPr>
-      <w:r>
-        <w:t xml:space="preserve">What is climate change and how does it occur? Does knowledge-focused communication about climate change lead to more concern and engagement? What is the public opinion about climate change?</w:t>
-      </w:r>
-    </w:p>
-    <w:p>
-      <w:pPr>
-        <w:pStyle w:val="BodyText"/>
-      </w:pPr>
-      <w:r>
-        <w:t xml:space="preserve">Literature:</w:t>
-      </w:r>
-    </w:p>
-    <w:p>
-      <w:pPr>
-        <w:pStyle w:val="Compact"/>
-        <w:numPr>
-          <w:ilvl w:val="0"/>
-          <w:numId w:val="1005"/>
-        </w:numPr>
-      </w:pPr>
-      <w:r>
-        <w:t xml:space="preserve">Metag et al. (2017). Global warming’s five Germanys.</w:t>
-      </w:r>
-    </w:p>
-    <w:p>
-      <w:pPr>
-        <w:pStyle w:val="Compact"/>
-        <w:numPr>
-          <w:ilvl w:val="0"/>
-          <w:numId w:val="1005"/>
-        </w:numPr>
-      </w:pPr>
-      <w:r>
-        <w:t xml:space="preserve">Leiserowitz et al. (2024). Climate Change in the American Mind: Beliefs &amp; Attitudes.</w:t>
-      </w:r>
-      <w:r>
-        <w:t xml:space="preserve"> </w:t>
-      </w:r>
-      <w:r>
-        <w:rPr>
-          <w:b/>
-          <w:bCs/>
-        </w:rPr>
-        <w:t xml:space="preserve">[TODO: missing from reference list in template]</w:t>
-      </w:r>
-    </w:p>
-    <w:p>
-      <w:pPr>
-        <w:pStyle w:val="Compact"/>
-        <w:numPr>
-          <w:ilvl w:val="0"/>
-          <w:numId w:val="1005"/>
-        </w:numPr>
-      </w:pPr>
-      <w:r>
-        <w:t xml:space="preserve">Shi et al. (2016). Knowledge as a driver of public perceptions about climate change reassessed.</w:t>
-      </w:r>
-    </w:p>
-    <w:bookmarkEnd w:id="32"/>
-    <w:bookmarkStart w:id="33" w:name="guest-speaker-dr.-leonard-creutzburg"/>
-    <w:p>
-      <w:pPr>
-        <w:pStyle w:val="Heading3"/>
-      </w:pPr>
-      <w:r>
-        <w:t xml:space="preserve">3 — 29.09.2026 — Guest speaker: Dr. Leonard Creutzburg</w:t>
-      </w:r>
-    </w:p>
-    <w:p>
-      <w:pPr>
-        <w:pStyle w:val="FirstParagraph"/>
-      </w:pPr>
-      <w:r>
-        <w:rPr>
-          <w:b/>
-          <w:bCs/>
-        </w:rPr>
-        <w:t xml:space="preserve">[TODO: blurb below describes a different person (Dr. Lydia Ebersbach, WWF) — stale from old course, rewrite for the actual speaker]</w:t>
-      </w:r>
-    </w:p>
-    <w:p>
-      <w:pPr>
-        <w:pStyle w:val="BodyText"/>
-      </w:pPr>
-      <w:r>
-        <w:t xml:space="preserve">Dr. Lydia Ebersbach is media relations manager at WWF Switzerland. She holds a Magister in History, Politics and Economics from Potsdam University, a PhD in Marketing from St. Gallen University and completed a CAS in Storytelling and Brand Journalism at MAZ / HSL. She will talk to us about the challenges of climate communication from the perspective of a Swiss NGO.</w:t>
-      </w:r>
-    </w:p>
-    <w:p>
-      <w:pPr>
-        <w:pStyle w:val="BodyText"/>
-      </w:pPr>
-      <w:r>
-        <w:t xml:space="preserve">Literature:</w:t>
-      </w:r>
-      <w:r>
-        <w:t xml:space="preserve"> </w:t>
-      </w:r>
-      <w:r>
-        <w:rPr>
-          <w:b/>
-          <w:bCs/>
-        </w:rPr>
-        <w:t xml:space="preserve">[TODO: framing literature listed here in the template likely belongs to session 4]</w:t>
-      </w:r>
-    </w:p>
-    <w:p>
-      <w:pPr>
-        <w:pStyle w:val="Compact"/>
-        <w:numPr>
-          <w:ilvl w:val="0"/>
-          <w:numId w:val="1006"/>
-        </w:numPr>
-      </w:pPr>
-      <w:r>
-        <w:t xml:space="preserve">Lakoff, G. (2010). Why it Matters How We Frame the Environment.</w:t>
-      </w:r>
-    </w:p>
-    <w:p>
-      <w:pPr>
-        <w:pStyle w:val="Compact"/>
-        <w:numPr>
-          <w:ilvl w:val="0"/>
-          <w:numId w:val="1006"/>
-        </w:numPr>
-      </w:pPr>
-      <w:r>
-        <w:t xml:space="preserve">Dasandi et al. (2022). Positive, global, and health or environment framing bolsters public support for climate policies.</w:t>
-      </w:r>
-    </w:p>
-    <w:p>
-      <w:pPr>
-        <w:pStyle w:val="Compact"/>
-        <w:numPr>
-          <w:ilvl w:val="0"/>
-          <w:numId w:val="1006"/>
-        </w:numPr>
-      </w:pPr>
-      <w:r>
-        <w:t xml:space="preserve">Supran &amp; Oreskes (2021). Rhetoric and frame analysis of ExxonMobil’s climate change communications.</w:t>
-      </w:r>
-    </w:p>
-    <w:bookmarkEnd w:id="33"/>
-    <w:bookmarkStart w:id="34" w:name="mental-models-and-framing"/>
-    <w:p>
-      <w:pPr>
-        <w:pStyle w:val="Heading3"/>
-      </w:pPr>
-      <w:r>
-        <w:t xml:space="preserve">4 — 06.10.2026 — Mental models and framing</w:t>
-      </w:r>
-    </w:p>
-    <w:p>
-      <w:pPr>
-        <w:pStyle w:val="FirstParagraph"/>
-      </w:pPr>
-      <w:r>
-        <w:t xml:space="preserve">What are mental models? Which frames are used in climate change communication? How can we frame climate change in a way that allows us to reach different population groups? What are the strategies, channels, and messages used by different stakeholders?</w:t>
-      </w:r>
-    </w:p>
-    <w:p>
-      <w:pPr>
-        <w:pStyle w:val="BodyText"/>
-      </w:pPr>
-      <w:r>
-        <w:t xml:space="preserve">Literature:</w:t>
-      </w:r>
-      <w:r>
-        <w:t xml:space="preserve"> </w:t>
-      </w:r>
-      <w:r>
-        <w:rPr>
-          <w:b/>
-          <w:bCs/>
-        </w:rPr>
-        <w:t xml:space="preserve">[TODO: template lists the climate-delay/denial literature here, which matches session 5’s topic — check alignment]</w:t>
-      </w:r>
-    </w:p>
-    <w:p>
-      <w:pPr>
-        <w:pStyle w:val="Compact"/>
-        <w:numPr>
-          <w:ilvl w:val="0"/>
-          <w:numId w:val="1007"/>
-        </w:numPr>
-      </w:pPr>
-      <w:r>
-        <w:t xml:space="preserve">Lamb, W. F. et al. (2020). Discourses of climate delay.</w:t>
-      </w:r>
-    </w:p>
-    <w:p>
-      <w:pPr>
-        <w:pStyle w:val="Compact"/>
-        <w:numPr>
-          <w:ilvl w:val="0"/>
-          <w:numId w:val="1007"/>
-        </w:numPr>
-      </w:pPr>
-      <w:r>
-        <w:t xml:space="preserve">Cook, J. (2020). Deconstructing Climate Science Denial.</w:t>
-      </w:r>
-    </w:p>
-    <w:bookmarkEnd w:id="34"/>
-    <w:bookmarkStart w:id="35" w:name="climate-change-misinformation"/>
-    <w:p>
-      <w:pPr>
-        <w:pStyle w:val="Heading3"/>
-      </w:pPr>
-      <w:r>
-        <w:t xml:space="preserve">5 — 13.10.2026 — Climate change misinformation</w:t>
-      </w:r>
-    </w:p>
-    <w:p>
-      <w:pPr>
-        <w:pStyle w:val="FirstParagraph"/>
-      </w:pPr>
-      <w:r>
-        <w:t xml:space="preserve">What are discourses that delay action on climate change? How do you identify climate science denial and how do you respond to it?</w:t>
-      </w:r>
-    </w:p>
-    <w:p>
-      <w:pPr>
-        <w:pStyle w:val="BodyText"/>
-      </w:pPr>
-      <w:r>
-        <w:t xml:space="preserve">Literature:</w:t>
-      </w:r>
-      <w:r>
-        <w:t xml:space="preserve"> </w:t>
-      </w:r>
-      <w:r>
-        <w:rPr>
-          <w:b/>
-          <w:bCs/>
-        </w:rPr>
-        <w:t xml:space="preserve">[TODO: template’s literature cell held only a guest-prep note (</w:t>
-      </w:r>
-      <w:r>
-        <w:rPr>
-          <w:b/>
-          <w:bCs/>
-        </w:rPr>
-        <w:t xml:space="preserve">“Come to class with at least 3 questions for our guest speaker”</w:t>
-      </w:r>
-      <w:r>
-        <w:rPr>
-          <w:b/>
-          <w:bCs/>
-        </w:rPr>
-        <w:t xml:space="preserve">) — misaligned, assign readings]</w:t>
-      </w:r>
-    </w:p>
-    <w:bookmarkEnd w:id="35"/>
-    <w:bookmarkStart w:id="36" w:name="emotions-and-behavior"/>
-    <w:p>
-      <w:pPr>
-        <w:pStyle w:val="Heading3"/>
-      </w:pPr>
-      <w:r>
-        <w:t xml:space="preserve">6 — 20.10.2026 — Emotions and behavior</w:t>
-      </w:r>
-    </w:p>
-    <w:p>
-      <w:pPr>
-        <w:pStyle w:val="FirstParagraph"/>
-      </w:pPr>
-      <w:r>
-        <w:t xml:space="preserve">What is the role of emotions in climate change communication? How can we communicate about climate change in a way that increases feelings of self-efficacy? How does media usage relate to behavioral intentions?</w:t>
-      </w:r>
-    </w:p>
-    <w:p>
-      <w:pPr>
-        <w:pStyle w:val="BodyText"/>
-      </w:pPr>
-      <w:r>
-        <w:t xml:space="preserve">Literature:</w:t>
-      </w:r>
-    </w:p>
-    <w:p>
-      <w:pPr>
-        <w:pStyle w:val="Compact"/>
-        <w:numPr>
-          <w:ilvl w:val="0"/>
-          <w:numId w:val="1008"/>
-        </w:numPr>
-      </w:pPr>
-      <w:r>
-        <w:t xml:space="preserve">Myers, T. A. et al. (2023). Emotional responses to climate change information and their effects on policy support.</w:t>
-      </w:r>
-    </w:p>
-    <w:p>
-      <w:pPr>
-        <w:pStyle w:val="Compact"/>
-        <w:numPr>
-          <w:ilvl w:val="0"/>
-          <w:numId w:val="1008"/>
-        </w:numPr>
-      </w:pPr>
-      <w:r>
-        <w:t xml:space="preserve">Ogunbode et al. (2022). Climate anxiety, wellbeing and pro-environmental action.</w:t>
-      </w:r>
-    </w:p>
-    <w:p>
-      <w:pPr>
-        <w:pStyle w:val="Compact"/>
-        <w:numPr>
-          <w:ilvl w:val="0"/>
-          <w:numId w:val="1008"/>
-        </w:numPr>
-      </w:pPr>
-      <w:r>
-        <w:t xml:space="preserve">Stanley et al. (2021). From anger to action.</w:t>
-      </w:r>
-    </w:p>
-    <w:bookmarkEnd w:id="36"/>
-    <w:bookmarkStart w:id="37" w:name="a-question-of-trust"/>
-    <w:p>
-      <w:pPr>
-        <w:pStyle w:val="Heading3"/>
-      </w:pPr>
-      <w:r>
-        <w:t xml:space="preserve">7 — 27.10.2026 — A question of trust</w:t>
-      </w:r>
-    </w:p>
-    <w:p>
-      <w:pPr>
-        <w:pStyle w:val="FirstParagraph"/>
-      </w:pPr>
-      <w:r>
-        <w:t xml:space="preserve">Which actors are the most trusted sources of information about climate change? How can we maintain and potentially increase trust in climate change communicators? What is the role of climate scientists in communicating and engaging on the topic?</w:t>
-      </w:r>
-    </w:p>
-    <w:p>
-      <w:pPr>
-        <w:pStyle w:val="BodyText"/>
-      </w:pPr>
-      <w:r>
-        <w:t xml:space="preserve">Literature:</w:t>
-      </w:r>
-    </w:p>
-    <w:p>
-      <w:pPr>
-        <w:pStyle w:val="Compact"/>
-        <w:numPr>
-          <w:ilvl w:val="0"/>
-          <w:numId w:val="1009"/>
-        </w:numPr>
-      </w:pPr>
-      <w:r>
-        <w:t xml:space="preserve">Cologna, V. et al. (2024). Trust in climate science and climate scientists: a narrative review.</w:t>
-      </w:r>
-    </w:p>
-    <w:p>
-      <w:pPr>
-        <w:pStyle w:val="Compact"/>
-        <w:numPr>
-          <w:ilvl w:val="0"/>
-          <w:numId w:val="1009"/>
-        </w:numPr>
-      </w:pPr>
-      <w:r>
-        <w:t xml:space="preserve">Oreskes, N. (2020). What Is the Social Responsibility of Climate Scientists?</w:t>
-      </w:r>
-    </w:p>
-    <w:bookmarkEnd w:id="37"/>
-    <w:bookmarkStart w:id="38" w:name="guest-speaker-dr.-cornelia-schwierz"/>
-    <w:p>
-      <w:pPr>
-        <w:pStyle w:val="Heading3"/>
-      </w:pPr>
-      <w:r>
-        <w:t xml:space="preserve">8 — 03.11.2026 — Guest speaker: Dr. Cornelia Schwierz</w:t>
-      </w:r>
-    </w:p>
-    <w:p>
-      <w:pPr>
-        <w:pStyle w:val="FirstParagraph"/>
-      </w:pPr>
-      <w:r>
-        <w:rPr>
-          <w:b/>
-          <w:bCs/>
-        </w:rPr>
-        <w:t xml:space="preserve">[TODO: confirm speaker still current]</w:t>
-      </w:r>
-    </w:p>
-    <w:p>
-      <w:pPr>
-        <w:pStyle w:val="BodyText"/>
-      </w:pPr>
-      <w:r>
-        <w:t xml:space="preserve">Dr. Cornelia Schwierz is Head of Climate Monitoring and Information at the Federal Office of Meteorology and Climatology (MeteoSwiss). In her talk, she will tell us about the challenges the Federal Office faces in communicating about climate change and how they overcome them.</w:t>
-      </w:r>
-    </w:p>
-    <w:p>
-      <w:pPr>
-        <w:pStyle w:val="BodyText"/>
-      </w:pPr>
-      <w:r>
-        <w:t xml:space="preserve">Preparation: Come to class with at least 3 questions for our guest speaker.</w:t>
-      </w:r>
-    </w:p>
-    <w:bookmarkEnd w:id="38"/>
-    <w:bookmarkStart w:id="39" w:name="climate-change-in-the-media"/>
-    <w:p>
-      <w:pPr>
-        <w:pStyle w:val="Heading3"/>
-      </w:pPr>
-      <w:r>
-        <w:t xml:space="preserve">9 — 10.11.2026 — Climate change in the media</w:t>
-      </w:r>
-    </w:p>
-    <w:p>
-      <w:pPr>
-        <w:pStyle w:val="FirstParagraph"/>
-      </w:pPr>
-      <w:r>
-        <w:t xml:space="preserve">How has climate change communication in the media evolved over time? How is climate change depicted in the media? How does imagery affect public perceptions of climate change?</w:t>
-      </w:r>
-    </w:p>
-    <w:p>
-      <w:pPr>
-        <w:pStyle w:val="BodyText"/>
-      </w:pPr>
-      <w:r>
-        <w:t xml:space="preserve">Literature:</w:t>
-      </w:r>
-    </w:p>
-    <w:p>
-      <w:pPr>
-        <w:pStyle w:val="Compact"/>
-        <w:numPr>
-          <w:ilvl w:val="0"/>
-          <w:numId w:val="1010"/>
-        </w:numPr>
-      </w:pPr>
-      <w:r>
-        <w:t xml:space="preserve">Metag, J. et al. (2016). Perceptions of Climate Change Imagery.</w:t>
-      </w:r>
-    </w:p>
-    <w:p>
-      <w:pPr>
-        <w:pStyle w:val="Compact"/>
-        <w:numPr>
-          <w:ilvl w:val="0"/>
-          <w:numId w:val="1010"/>
-        </w:numPr>
-      </w:pPr>
-      <w:r>
-        <w:t xml:space="preserve">O’Neill, S. J. (2013). Image matters. Climate change imagery in US, UK and Australian newspapers.</w:t>
-      </w:r>
-    </w:p>
-    <w:bookmarkEnd w:id="39"/>
-    <w:bookmarkStart w:id="40" w:name="missing"/>
-    <w:p>
-      <w:pPr>
-        <w:pStyle w:val="Heading3"/>
-      </w:pPr>
-      <w:r>
-        <w:t xml:space="preserve">10 — 17.11.2026 — MISSING</w:t>
-      </w:r>
-    </w:p>
-    <w:p>
-      <w:pPr>
-        <w:pStyle w:val="FirstParagraph"/>
-      </w:pPr>
-      <w:r>
-        <w:rPr>
-          <w:b/>
-          <w:bCs/>
-        </w:rPr>
-        <w:t xml:space="preserve">[TODO: topic was literally</w:t>
-      </w:r>
-      <w:r>
-        <w:rPr>
-          <w:b/>
-          <w:bCs/>
-        </w:rPr>
-        <w:t xml:space="preserve"> </w:t>
-      </w:r>
-      <w:r>
-        <w:rPr>
-          <w:b/>
-          <w:bCs/>
-        </w:rPr>
-        <w:t xml:space="preserve">“MISSING”</w:t>
-      </w:r>
-      <w:r>
-        <w:rPr>
-          <w:b/>
-          <w:bCs/>
-        </w:rPr>
-        <w:t xml:space="preserve"> </w:t>
-      </w:r>
-      <w:r>
-        <w:rPr>
-          <w:b/>
-          <w:bCs/>
-        </w:rPr>
-        <w:t xml:space="preserve">in the template — define this session]</w:t>
-      </w:r>
-    </w:p>
-    <w:p>
-      <w:pPr>
-        <w:pStyle w:val="BodyText"/>
-      </w:pPr>
-      <w:r>
-        <w:t xml:space="preserve">Literature:</w:t>
-      </w:r>
-    </w:p>
-    <w:p>
-      <w:pPr>
-        <w:pStyle w:val="Compact"/>
-        <w:numPr>
-          <w:ilvl w:val="0"/>
-          <w:numId w:val="1011"/>
-        </w:numPr>
-      </w:pPr>
-      <w:r>
-        <w:t xml:space="preserve">Barkemeyer et al. (2017). Media coverage of climate change: An international comparison.</w:t>
-      </w:r>
-    </w:p>
-    <w:p>
-      <w:pPr>
-        <w:pStyle w:val="Compact"/>
-        <w:numPr>
-          <w:ilvl w:val="0"/>
-          <w:numId w:val="1011"/>
-        </w:numPr>
-      </w:pPr>
-      <w:r>
-        <w:t xml:space="preserve">Klinger, K., &amp; Metag, J. (2021). Media effects in the context of environmental issues.</w:t>
-      </w:r>
-    </w:p>
-    <w:p>
-      <w:pPr>
-        <w:pStyle w:val="Compact"/>
-        <w:numPr>
-          <w:ilvl w:val="0"/>
-          <w:numId w:val="1011"/>
-        </w:numPr>
-      </w:pPr>
-      <w:r>
-        <w:t xml:space="preserve">Schäfer and Painter (2021). Climate journalism in a changing media ecosystem.</w:t>
-      </w:r>
-    </w:p>
-    <w:bookmarkEnd w:id="40"/>
-    <w:bookmarkStart w:id="41" w:name="guest-speaker-cornelia-eisenach"/>
-    <w:p>
-      <w:pPr>
-        <w:pStyle w:val="Heading3"/>
-      </w:pPr>
-      <w:r>
-        <w:t xml:space="preserve">11 — 24.11.2026 — Guest speaker: Cornelia Eisenach</w:t>
-      </w:r>
-    </w:p>
-    <w:p>
-      <w:pPr>
-        <w:pStyle w:val="FirstParagraph"/>
-      </w:pPr>
-      <w:r>
-        <w:rPr>
-          <w:b/>
-          <w:bCs/>
-        </w:rPr>
-        <w:t xml:space="preserve">[TODO: blurb below describes a different person (Sabrina Weiss) — stale from old course, rewrite for the actual speaker]</w:t>
-      </w:r>
-    </w:p>
-    <w:p>
-      <w:pPr>
-        <w:pStyle w:val="BodyText"/>
-      </w:pPr>
-      <w:r>
-        <w:t xml:space="preserve">Sabrina Weiss is a Swiss climate journalist. She holds a BA in Media &amp; Communication Sciences from the University of Zurich and an MSc in Communication Psychology from the London School of Economics and Political Science. Sabrina Weiss is the co-founder of the Climate Journalism Network. In her talk, she will tell us about the challenges of climate change communication in journalism and how to overcome them.</w:t>
-      </w:r>
-    </w:p>
-    <w:p>
-      <w:pPr>
-        <w:pStyle w:val="BodyText"/>
-      </w:pPr>
-      <w:r>
-        <w:t xml:space="preserve">Preparation: Come to class with at least 3 questions for our guest speaker.</w:t>
-      </w:r>
-    </w:p>
-    <w:bookmarkEnd w:id="41"/>
-    <w:bookmarkStart w:id="42" w:name="guest-speaker-reto-knutti"/>
-    <w:p>
-      <w:pPr>
-        <w:pStyle w:val="Heading3"/>
-      </w:pPr>
-      <w:r>
-        <w:t xml:space="preserve">12 — 01.12.2026 — Guest speaker: Reto Knutti</w:t>
-      </w:r>
-    </w:p>
-    <w:p>
-      <w:pPr>
-        <w:pStyle w:val="FirstParagraph"/>
-      </w:pPr>
-      <w:r>
-        <w:rPr>
-          <w:b/>
-          <w:bCs/>
-        </w:rPr>
-        <w:t xml:space="preserve">[TODO: description below is a wrap-up summary from the old course, not a speaker blurb — rewrite]</w:t>
-      </w:r>
-    </w:p>
-    <w:p>
-      <w:pPr>
-        <w:pStyle w:val="BodyText"/>
-      </w:pPr>
-      <w:r>
-        <w:t xml:space="preserve">Based on what we have learned in the previous weeks, we will summarize and discuss successful communication strategies.</w:t>
-      </w:r>
-    </w:p>
-    <w:p>
-      <w:pPr>
-        <w:pStyle w:val="BodyText"/>
-      </w:pPr>
-      <w:r>
-        <w:t xml:space="preserve">Literature:</w:t>
-      </w:r>
-    </w:p>
-    <w:p>
-      <w:pPr>
-        <w:pStyle w:val="Compact"/>
-        <w:numPr>
-          <w:ilvl w:val="0"/>
-          <w:numId w:val="1012"/>
-        </w:numPr>
-      </w:pPr>
-      <w:r>
-        <w:t xml:space="preserve">Maibach, E. W. et al. (2023). Harnessing the power of communication and behavior science to enhance society’s response to climate change.</w:t>
-      </w:r>
-    </w:p>
-    <w:p>
-      <w:pPr>
-        <w:pStyle w:val="Compact"/>
-        <w:numPr>
-          <w:ilvl w:val="0"/>
-          <w:numId w:val="1012"/>
-        </w:numPr>
-      </w:pPr>
-      <w:r>
-        <w:t xml:space="preserve">Corner et al. (2018). Principles for effective communication and public engagement on climate change.</w:t>
-      </w:r>
-      <w:r>
-        <w:t xml:space="preserve"> </w:t>
-      </w:r>
-      <w:r>
-        <w:rPr>
-          <w:b/>
-          <w:bCs/>
-        </w:rPr>
-        <w:t xml:space="preserve">[TODO: missing from reference list in template]</w:t>
-      </w:r>
-    </w:p>
-    <w:bookmarkEnd w:id="42"/>
-    <w:bookmarkStart w:id="43" w:name="guest-speaker-industrykanton"/>
-    <w:p>
-      <w:pPr>
-        <w:pStyle w:val="Heading3"/>
-      </w:pPr>
-      <w:r>
-        <w:t xml:space="preserve">13 — 08.12.2026 — Guest speaker: Industry/Kanton</w:t>
-      </w:r>
-    </w:p>
-    <w:p>
-      <w:pPr>
-        <w:pStyle w:val="FirstParagraph"/>
-      </w:pPr>
-      <w:r>
-        <w:rPr>
-          <w:b/>
-          <w:bCs/>
-        </w:rPr>
-        <w:t xml:space="preserve">[TODO: placeholder title — confirm speaker. Description below is the old course’s recap-session text]</w:t>
-      </w:r>
-    </w:p>
-    <w:p>
-      <w:pPr>
-        <w:pStyle w:val="BodyText"/>
-      </w:pPr>
-      <w:r>
-        <w:t xml:space="preserve">We will reflect on the contributions by our guest speakers and how they relate to what we have learned in the previous sessions. In preparation for the exam, we will recap the main lessons learnt in this course.</w:t>
-      </w:r>
-    </w:p>
-    <w:bookmarkEnd w:id="43"/>
-    <w:bookmarkStart w:id="44" w:name="discussion-and-lessons-learnt"/>
-    <w:p>
-      <w:pPr>
-        <w:pStyle w:val="Heading3"/>
-      </w:pPr>
-      <w:r>
-        <w:t xml:space="preserve">14 — 15.12.2026 — Discussion and lessons learnt</w:t>
-      </w:r>
-    </w:p>
-    <w:p>
-      <w:pPr>
-        <w:pStyle w:val="FirstParagraph"/>
-      </w:pPr>
-      <w:r>
-        <w:rPr>
-          <w:b/>
-          <w:bCs/>
-        </w:rPr>
-        <w:t xml:space="preserve">[TODO: description below contains stale 2024 exam logistics — rewrite]</w:t>
-      </w:r>
-    </w:p>
-    <w:p>
-      <w:pPr>
-        <w:pStyle w:val="BodyText"/>
-      </w:pPr>
-      <w:r>
-        <w:t xml:space="preserve">The exam will take place on-site. The format of the exam (online or pen and paper) will be communicated at a later stage.</w:t>
-      </w:r>
-    </w:p>
-    <w:bookmarkEnd w:id="44"/>
-    <w:bookmarkEnd w:id="45"/>
-    <w:bookmarkStart w:id="64" w:name="X52ede20610cd5e502bfe717b838f402e97af805"/>
+    <w:bookmarkStart w:id="50" w:name="X52ede20610cd5e502bfe717b838f402e97af805"/>
     <w:p>
       <w:pPr>
         <w:pStyle w:val="Heading2"/>
@@ -1358,7 +3751,7 @@
       <w:r>
         <w:t xml:space="preserve"> </w:t>
       </w:r>
-      <w:hyperlink r:id="rId46">
+      <w:hyperlink r:id="rId32">
         <w:r>
           <w:rPr>
             <w:rStyle w:val="Hyperlink"/>
@@ -1403,7 +3796,7 @@
       <w:r>
         <w:t xml:space="preserve"> </w:t>
       </w:r>
-      <w:hyperlink r:id="rId47">
+      <w:hyperlink r:id="rId33">
         <w:r>
           <w:rPr>
             <w:rStyle w:val="Hyperlink"/>
@@ -1435,7 +3828,7 @@
       <w:r>
         <w:t xml:space="preserve"> </w:t>
       </w:r>
-      <w:hyperlink r:id="rId48">
+      <w:hyperlink r:id="rId34">
         <w:r>
           <w:rPr>
             <w:rStyle w:val="Hyperlink"/>
@@ -1480,7 +3873,7 @@
       <w:r>
         <w:t xml:space="preserve"> </w:t>
       </w:r>
-      <w:hyperlink r:id="rId49">
+      <w:hyperlink r:id="rId35">
         <w:r>
           <w:rPr>
             <w:rStyle w:val="Hyperlink"/>
@@ -1546,7 +3939,7 @@
       <w:r>
         <w:t xml:space="preserve"> </w:t>
       </w:r>
-      <w:hyperlink r:id="rId50">
+      <w:hyperlink r:id="rId36">
         <w:r>
           <w:rPr>
             <w:rStyle w:val="Hyperlink"/>
@@ -1591,7 +3984,7 @@
       <w:r>
         <w:t xml:space="preserve"> </w:t>
       </w:r>
-      <w:hyperlink r:id="rId51">
+      <w:hyperlink r:id="rId37">
         <w:r>
           <w:rPr>
             <w:rStyle w:val="Hyperlink"/>
@@ -1636,7 +4029,7 @@
       <w:r>
         <w:t xml:space="preserve"> </w:t>
       </w:r>
-      <w:hyperlink r:id="rId52">
+      <w:hyperlink r:id="rId38">
         <w:r>
           <w:rPr>
             <w:rStyle w:val="Hyperlink"/>
@@ -1671,7 +4064,7 @@
       <w:r>
         <w:t xml:space="preserve"> </w:t>
       </w:r>
-      <w:hyperlink r:id="rId53">
+      <w:hyperlink r:id="rId39">
         <w:r>
           <w:rPr>
             <w:rStyle w:val="Hyperlink"/>
@@ -1716,7 +4109,7 @@
       <w:r>
         <w:t xml:space="preserve"> </w:t>
       </w:r>
-      <w:hyperlink r:id="rId54">
+      <w:hyperlink r:id="rId40">
         <w:r>
           <w:rPr>
             <w:rStyle w:val="Hyperlink"/>
@@ -1761,7 +4154,7 @@
       <w:r>
         <w:t xml:space="preserve"> </w:t>
       </w:r>
-      <w:hyperlink r:id="rId55">
+      <w:hyperlink r:id="rId41">
         <w:r>
           <w:rPr>
             <w:rStyle w:val="Hyperlink"/>
@@ -1806,7 +4199,7 @@
       <w:r>
         <w:t xml:space="preserve"> </w:t>
       </w:r>
-      <w:hyperlink r:id="rId56">
+      <w:hyperlink r:id="rId42">
         <w:r>
           <w:rPr>
             <w:rStyle w:val="Hyperlink"/>
@@ -1851,7 +4244,7 @@
       <w:r>
         <w:t xml:space="preserve"> </w:t>
       </w:r>
-      <w:hyperlink r:id="rId57">
+      <w:hyperlink r:id="rId43">
         <w:r>
           <w:rPr>
             <w:rStyle w:val="Hyperlink"/>
@@ -1896,7 +4289,7 @@
       <w:r>
         <w:t xml:space="preserve"> </w:t>
       </w:r>
-      <w:hyperlink r:id="rId58">
+      <w:hyperlink r:id="rId44">
         <w:r>
           <w:rPr>
             <w:rStyle w:val="Hyperlink"/>
@@ -1941,7 +4334,7 @@
       <w:r>
         <w:t xml:space="preserve"> </w:t>
       </w:r>
-      <w:hyperlink r:id="rId59">
+      <w:hyperlink r:id="rId45">
         <w:r>
           <w:rPr>
             <w:rStyle w:val="Hyperlink"/>
@@ -1986,7 +4379,7 @@
       <w:r>
         <w:t xml:space="preserve"> </w:t>
       </w:r>
-      <w:hyperlink r:id="rId60">
+      <w:hyperlink r:id="rId46">
         <w:r>
           <w:rPr>
             <w:rStyle w:val="Hyperlink"/>
@@ -2031,7 +4424,7 @@
       <w:r>
         <w:t xml:space="preserve"> </w:t>
       </w:r>
-      <w:hyperlink r:id="rId61">
+      <w:hyperlink r:id="rId47">
         <w:r>
           <w:rPr>
             <w:rStyle w:val="Hyperlink"/>
@@ -2076,7 +4469,7 @@
       <w:r>
         <w:t xml:space="preserve"> </w:t>
       </w:r>
-      <w:hyperlink r:id="rId62">
+      <w:hyperlink r:id="rId48">
         <w:r>
           <w:rPr>
             <w:rStyle w:val="Hyperlink"/>
@@ -2121,7 +4514,7 @@
       <w:r>
         <w:t xml:space="preserve"> </w:t>
       </w:r>
-      <w:hyperlink r:id="rId63">
+      <w:hyperlink r:id="rId49">
         <w:r>
           <w:rPr>
             <w:rStyle w:val="Hyperlink"/>
@@ -2130,7 +4523,7 @@
         </w:r>
       </w:hyperlink>
     </w:p>
-    <w:bookmarkEnd w:id="64"/>
+    <w:bookmarkEnd w:id="50"/>
     <w:sectPr>
       <w:footnotePr>
         <w:numRestart w:val="eachSect"/>
@@ -2466,33 +4859,6 @@
     <w:abstractNumId w:val="991"/>
   </w:num>
   <w:num w:numId="1003">
-    <w:abstractNumId w:val="991"/>
-  </w:num>
-  <w:num w:numId="1004">
-    <w:abstractNumId w:val="991"/>
-  </w:num>
-  <w:num w:numId="1005">
-    <w:abstractNumId w:val="991"/>
-  </w:num>
-  <w:num w:numId="1006">
-    <w:abstractNumId w:val="991"/>
-  </w:num>
-  <w:num w:numId="1007">
-    <w:abstractNumId w:val="991"/>
-  </w:num>
-  <w:num w:numId="1008">
-    <w:abstractNumId w:val="991"/>
-  </w:num>
-  <w:num w:numId="1009">
-    <w:abstractNumId w:val="991"/>
-  </w:num>
-  <w:num w:numId="1010">
-    <w:abstractNumId w:val="991"/>
-  </w:num>
-  <w:num w:numId="1011">
-    <w:abstractNumId w:val="991"/>
-  </w:num>
-  <w:num w:numId="1012">
     <w:abstractNumId w:val="991"/>
   </w:num>
 </w:numbering>

</xml_diff>

<commit_message>
Navajo brand theme, hex logo, CSV-driven schedule via tinytable, slide template
- data/schedule.csv is the single source for the syllabus table and the
  home-page overview (with lecturer column); edit sessions there
- _brand.yml (MetBrewer Navajo) themes website and revealjs slides
- docx needs a pandoc grid table, generated from HTML in a docx-only branch
  (tinytable markdown is not pandoc grid syntax)

Co-Authored-By: Claude Fable 5 <noreply@anthropic.com>
</commit_message>
<xml_diff>
--- a/docs/syllabus.docx
+++ b/docs/syllabus.docx
@@ -429,15 +429,15 @@
     <w:tbl>
       <w:tblPr>
         <w:tblStyle w:val="Table"/>
-        <w:tblW w:type="pct" w:w="5000"/>
+        <w:tblW w:type="pct" w:w="4909"/>
         <w:tblLayout w:type="fixed"/>
         <w:tblLook w:firstRow="1" w:lastRow="0" w:firstColumn="0" w:lastColumn="0" w:noHBand="0" w:noVBand="0" w:val="0020"/>
       </w:tblPr>
       <w:tblGrid>
-        <w:gridCol w:w="316"/>
-        <w:gridCol w:w="871"/>
-        <w:gridCol w:w="3722"/>
-        <w:gridCol w:w="3009"/>
+        <w:gridCol w:w="1944"/>
+        <w:gridCol w:w="1944"/>
+        <w:gridCol w:w="1944"/>
+        <w:gridCol w:w="1944"/>
       </w:tblGrid>
       <w:tr>
         <w:trPr>
@@ -918,6 +918,18 @@
               </w:rPr>
               <w:t xml:space="preserve">Leonard Creutzburg</w:t>
             </w:r>
+            <w:r>
+              <w:t xml:space="preserve"> </w:t>
+            </w:r>
+            <w:r>
+              <w:t xml:space="preserve">—</w:t>
+            </w:r>
+            <w:r>
+              <w:t xml:space="preserve"> </w:t>
+            </w:r>
+            <w:r>
+              <w:t xml:space="preserve">Invited speaker</w:t>
+            </w:r>
           </w:p>
           <w:p>
             <w:pPr>
@@ -2148,6 +2160,20 @@
               <w:t xml:space="preserve"> </w:t>
             </w:r>
             <w:r>
+              <w:t xml:space="preserve">—</w:t>
+            </w:r>
+            <w:r>
+              <w:t xml:space="preserve"> </w:t>
+            </w:r>
+            <w:r>
+              <w:t xml:space="preserve">Invited speaker</w:t>
+            </w:r>
+          </w:p>
+          <w:p>
+            <w:pPr>
+              <w:pStyle w:val="BodyText"/>
+            </w:pPr>
+            <w:r>
               <w:rPr>
                 <w:b/>
                 <w:bCs/>
@@ -2497,7 +2523,7 @@
           <w:tcPr/>
           <w:p>
             <w:pPr>
-              <w:pStyle w:val="Compact"/>
+              <w:pStyle w:val="BodyText"/>
             </w:pPr>
             <w:r>
               <w:rPr>
@@ -2510,6 +2536,12 @@
               <w:t xml:space="preserve"> </w:t>
             </w:r>
             <w:r>
+              <w:t xml:space="preserve">—</w:t>
+            </w:r>
+            <w:r>
+              <w:t xml:space="preserve"> </w:t>
+            </w:r>
+            <w:r>
               <w:rPr>
                 <w:b/>
                 <w:bCs/>
@@ -2528,63 +2560,47 @@
                 <w:b/>
                 <w:bCs/>
               </w:rPr>
-              <w:t xml:space="preserve">topic was literally</w:t>
-            </w:r>
-            <w:r>
-              <w:rPr>
-                <w:b/>
-                <w:bCs/>
-              </w:rPr>
-              <w:t xml:space="preserve"> </w:t>
-            </w:r>
-            <w:r>
-              <w:rPr>
-                <w:b/>
-                <w:bCs/>
-              </w:rPr>
-              <w:t xml:space="preserve">“MISSING”</w:t>
-            </w:r>
-            <w:r>
-              <w:rPr>
-                <w:b/>
-                <w:bCs/>
-              </w:rPr>
-              <w:t xml:space="preserve"> </w:t>
-            </w:r>
-            <w:r>
-              <w:rPr>
-                <w:b/>
-                <w:bCs/>
-              </w:rPr>
-              <w:t xml:space="preserve">in the</w:t>
-            </w:r>
-            <w:r>
-              <w:rPr>
-                <w:b/>
-                <w:bCs/>
-              </w:rPr>
-              <w:t xml:space="preserve"> </w:t>
-            </w:r>
-            <w:r>
-              <w:rPr>
-                <w:b/>
-                <w:bCs/>
-              </w:rPr>
-              <w:t xml:space="preserve">template — define this</w:t>
-            </w:r>
-            <w:r>
-              <w:rPr>
-                <w:b/>
-                <w:bCs/>
-              </w:rPr>
-              <w:t xml:space="preserve"> </w:t>
-            </w:r>
-            <w:r>
-              <w:rPr>
-                <w:b/>
-                <w:bCs/>
-              </w:rPr>
-              <w:t xml:space="preserve">session]</w:t>
+              <w:t xml:space="preserve">lecturer]</w:t>
+            </w:r>
+          </w:p>
+          <w:p>
+            <w:pPr>
+              <w:pStyle w:val="BodyText"/>
+            </w:pPr>
+            <w:r>
+              <w:rPr>
+                <w:b/>
+                <w:bCs/>
+              </w:rPr>
+              <w:t xml:space="preserve">[TODO: topic missing</w:t>
+            </w:r>
+            <w:r>
+              <w:rPr>
+                <w:b/>
+                <w:bCs/>
+              </w:rPr>
+              <w:t xml:space="preserve"> </w:t>
+            </w:r>
+            <w:r>
+              <w:rPr>
+                <w:b/>
+                <w:bCs/>
+              </w:rPr>
+              <w:t xml:space="preserve">in the template — define</w:t>
+            </w:r>
+            <w:r>
+              <w:rPr>
+                <w:b/>
+                <w:bCs/>
+              </w:rPr>
+              <w:t xml:space="preserve"> </w:t>
+            </w:r>
+            <w:r>
+              <w:rPr>
+                <w:b/>
+                <w:bCs/>
+              </w:rPr>
+              <w:t xml:space="preserve">this session]</w:t>
             </w:r>
           </w:p>
         </w:tc>
@@ -2726,6 +2742,18 @@
               </w:rPr>
               <w:t xml:space="preserve">Cornelia Eisenach</w:t>
             </w:r>
+            <w:r>
+              <w:t xml:space="preserve"> </w:t>
+            </w:r>
+            <w:r>
+              <w:t xml:space="preserve">—</w:t>
+            </w:r>
+            <w:r>
+              <w:t xml:space="preserve"> </w:t>
+            </w:r>
+            <w:r>
+              <w:t xml:space="preserve">Invited speaker</w:t>
+            </w:r>
           </w:p>
           <w:p>
             <w:pPr>
@@ -2998,6 +3026,18 @@
               </w:rPr>
               <w:t xml:space="preserve">Knutti</w:t>
             </w:r>
+            <w:r>
+              <w:t xml:space="preserve"> </w:t>
+            </w:r>
+            <w:r>
+              <w:t xml:space="preserve">— Invited</w:t>
+            </w:r>
+            <w:r>
+              <w:t xml:space="preserve"> </w:t>
+            </w:r>
+            <w:r>
+              <w:t xml:space="preserve">speaker</w:t>
+            </w:r>
           </w:p>
           <w:p>
             <w:pPr>
@@ -3278,6 +3318,20 @@
               <w:t xml:space="preserve"> </w:t>
             </w:r>
             <w:r>
+              <w:t xml:space="preserve">—</w:t>
+            </w:r>
+            <w:r>
+              <w:t xml:space="preserve"> </w:t>
+            </w:r>
+            <w:r>
+              <w:t xml:space="preserve">Invited speaker</w:t>
+            </w:r>
+          </w:p>
+          <w:p>
+            <w:pPr>
+              <w:pStyle w:val="BodyText"/>
+            </w:pPr>
+            <w:r>
               <w:rPr>
                 <w:b/>
                 <w:bCs/>
@@ -3296,75 +3350,49 @@
                 <w:b/>
                 <w:bCs/>
               </w:rPr>
-              <w:t xml:space="preserve">title — confirm</w:t>
-            </w:r>
-            <w:r>
-              <w:rPr>
-                <w:b/>
-                <w:bCs/>
-              </w:rPr>
-              <w:t xml:space="preserve"> </w:t>
-            </w:r>
-            <w:r>
-              <w:rPr>
-                <w:b/>
-                <w:bCs/>
-              </w:rPr>
-              <w:t xml:space="preserve">speaker]</w:t>
-            </w:r>
-          </w:p>
-          <w:p>
-            <w:pPr>
-              <w:pStyle w:val="BodyText"/>
-            </w:pPr>
-            <w:r>
-              <w:rPr>
-                <w:b/>
-                <w:bCs/>
-              </w:rPr>
-              <w:t xml:space="preserve">[TODO: description</w:t>
-            </w:r>
-            <w:r>
-              <w:rPr>
-                <w:b/>
-                <w:bCs/>
-              </w:rPr>
-              <w:t xml:space="preserve"> </w:t>
-            </w:r>
-            <w:r>
-              <w:rPr>
-                <w:b/>
-                <w:bCs/>
-              </w:rPr>
-              <w:t xml:space="preserve">below is the old</w:t>
-            </w:r>
-            <w:r>
-              <w:rPr>
-                <w:b/>
-                <w:bCs/>
-              </w:rPr>
-              <w:t xml:space="preserve"> </w:t>
-            </w:r>
-            <w:r>
-              <w:rPr>
-                <w:b/>
-                <w:bCs/>
-              </w:rPr>
-              <w:t xml:space="preserve">course’s recap-session</w:t>
-            </w:r>
-            <w:r>
-              <w:rPr>
-                <w:b/>
-                <w:bCs/>
-              </w:rPr>
-              <w:t xml:space="preserve"> </w:t>
-            </w:r>
-            <w:r>
-              <w:rPr>
-                <w:b/>
-                <w:bCs/>
-              </w:rPr>
-              <w:t xml:space="preserve">text]</w:t>
+              <w:t xml:space="preserve">title — confirm speaker.</w:t>
+            </w:r>
+            <w:r>
+              <w:rPr>
+                <w:b/>
+                <w:bCs/>
+              </w:rPr>
+              <w:t xml:space="preserve"> </w:t>
+            </w:r>
+            <w:r>
+              <w:rPr>
+                <w:b/>
+                <w:bCs/>
+              </w:rPr>
+              <w:t xml:space="preserve">Description below is the</w:t>
+            </w:r>
+            <w:r>
+              <w:rPr>
+                <w:b/>
+                <w:bCs/>
+              </w:rPr>
+              <w:t xml:space="preserve"> </w:t>
+            </w:r>
+            <w:r>
+              <w:rPr>
+                <w:b/>
+                <w:bCs/>
+              </w:rPr>
+              <w:t xml:space="preserve">old course’s</w:t>
+            </w:r>
+            <w:r>
+              <w:rPr>
+                <w:b/>
+                <w:bCs/>
+              </w:rPr>
+              <w:t xml:space="preserve"> </w:t>
+            </w:r>
+            <w:r>
+              <w:rPr>
+                <w:b/>
+                <w:bCs/>
+              </w:rPr>
+              <w:t xml:space="preserve">recap-session text]</w:t>
             </w:r>
           </w:p>
           <w:p>

</xml_diff>

<commit_message>
Syllabus header: title left, ETH logo right, lecturers centered below
ETH Zürich wordmark (public domain, Wikimedia) added as images/eth_logo.svg
plus trimmed PNG raster for pdf/docx. Title/subtitle/author metadata scoped
to pdf and docx so the html page shows only the custom header.

Co-Authored-By: Claude Fable 5 <noreply@anthropic.com>
</commit_message>
<xml_diff>
--- a/docs/syllabus.docx
+++ b/docs/syllabus.docx
@@ -20,19 +20,27 @@
     </w:p>
     <w:p>
       <w:pPr>
+        <w:pStyle w:val="Author"/>
+      </w:pPr>
+      <w:r>
+        <w:t xml:space="preserve">Viktoria Cologna &amp; Jan Pfänder</w:t>
+      </w:r>
+    </w:p>
+    <w:p>
+      <w:pPr>
         <w:pStyle w:val="FirstParagraph"/>
       </w:pPr>
       <w:r>
         <w:drawing>
           <wp:inline>
-            <wp:extent cx="1600200" cy="1600200"/>
+            <wp:extent cx="1866900" cy="335177"/>
             <wp:effectExtent b="0" l="0" r="0" t="0"/>
             <wp:docPr descr="" title="" id="21" name="Picture"/>
             <a:graphic>
               <a:graphicData uri="http://schemas.openxmlformats.org/drawingml/2006/picture">
                 <pic:pic>
                   <pic:nvPicPr>
-                    <pic:cNvPr descr="images/logo.png" id="22" name="Picture"/>
+                    <pic:cNvPr descr="images/eth_logo.png" id="22" name="Picture"/>
                     <pic:cNvPicPr>
                       <a:picLocks noChangeArrowheads="1" noChangeAspect="1"/>
                     </pic:cNvPicPr>
@@ -46,7 +54,7 @@
                   <pic:spPr bwMode="auto">
                     <a:xfrm>
                       <a:off x="0" y="0"/>
-                      <a:ext cx="1600200" cy="1600200"/>
+                      <a:ext cx="1866900" cy="335177"/>
                     </a:xfrm>
                     <a:prstGeom prst="rect">
                       <a:avLst/>
@@ -65,54 +73,7 @@
         </w:drawing>
       </w:r>
     </w:p>
-    <w:p>
-      <w:pPr>
-        <w:pStyle w:val="BodyText"/>
-      </w:pPr>
-      <w:r>
-        <w:rPr>
-          <w:b/>
-          <w:bCs/>
-        </w:rPr>
-        <w:t xml:space="preserve">Viktoria Cologna</w:t>
-      </w:r>
-      <w:r>
-        <w:t xml:space="preserve"> </w:t>
-      </w:r>
-      <w:r>
-        <w:t xml:space="preserve">—</w:t>
-      </w:r>
-      <w:r>
-        <w:t xml:space="preserve"> </w:t>
-      </w:r>
-      <w:hyperlink r:id="rId23">
-        <w:r>
-          <w:rPr>
-            <w:rStyle w:val="Hyperlink"/>
-          </w:rPr>
-          <w:t xml:space="preserve">https://www.viktoriacologna.com/</w:t>
-        </w:r>
-      </w:hyperlink>
-    </w:p>
-    <w:p>
-      <w:pPr>
-        <w:pStyle w:val="BodyText"/>
-      </w:pPr>
-      <w:r>
-        <w:rPr>
-          <w:b/>
-          <w:bCs/>
-        </w:rPr>
-        <w:t xml:space="preserve">Jan Pfänder</w:t>
-      </w:r>
-      <w:r>
-        <w:t xml:space="preserve"> </w:t>
-      </w:r>
-      <w:r>
-        <w:t xml:space="preserve">— janlukas.pfaender@gmail.com</w:t>
-      </w:r>
-    </w:p>
-    <w:bookmarkStart w:id="24" w:name="course-description"/>
+    <w:bookmarkStart w:id="23" w:name="course-description"/>
     <w:p>
       <w:pPr>
         <w:pStyle w:val="Heading2"/>
@@ -129,8 +90,8 @@
         <w:t xml:space="preserve">Climate change communication influences how individuals, organizations, and societies perceive climate change, and how they react to it. In this course, we will discuss research findings in environmental psychology and communication science to understand specific challenges of climate change communication and how to address them.</w:t>
       </w:r>
     </w:p>
-    <w:bookmarkEnd w:id="24"/>
-    <w:bookmarkStart w:id="25" w:name="learning-objectives"/>
+    <w:bookmarkEnd w:id="23"/>
+    <w:bookmarkStart w:id="24" w:name="learning-objectives"/>
     <w:p>
       <w:pPr>
         <w:pStyle w:val="Heading2"/>
@@ -195,8 +156,8 @@
         <w:t xml:space="preserve">Strategically design an effective climate change communication campaign</w:t>
       </w:r>
     </w:p>
-    <w:bookmarkEnd w:id="25"/>
-    <w:bookmarkStart w:id="27" w:name="general-information"/>
+    <w:bookmarkEnd w:id="24"/>
+    <w:bookmarkStart w:id="26" w:name="general-information"/>
     <w:p>
       <w:pPr>
         <w:pStyle w:val="Heading2"/>
@@ -243,7 +204,7 @@
       <w:r>
         <w:t xml:space="preserve"> </w:t>
       </w:r>
-      <w:hyperlink r:id="rId26">
+      <w:hyperlink r:id="rId25">
         <w:r>
           <w:rPr>
             <w:rStyle w:val="Hyperlink"/>
@@ -255,8 +216,8 @@
         <w:t xml:space="preserve">. This is also where slides and additional materials will be posted.</w:t>
       </w:r>
     </w:p>
-    <w:bookmarkEnd w:id="27"/>
-    <w:bookmarkStart w:id="28" w:name="participation"/>
+    <w:bookmarkEnd w:id="26"/>
+    <w:bookmarkStart w:id="27" w:name="participation"/>
     <w:p>
       <w:pPr>
         <w:pStyle w:val="Heading2"/>
@@ -285,8 +246,8 @@
         <w:t xml:space="preserve">Students are expected to actively participate in the course by drawing on their own reading of the materials, as well as their personal experiences and perspectives.</w:t>
       </w:r>
     </w:p>
-    <w:bookmarkEnd w:id="28"/>
-    <w:bookmarkStart w:id="29" w:name="materials"/>
+    <w:bookmarkEnd w:id="27"/>
+    <w:bookmarkStart w:id="28" w:name="materials"/>
     <w:p>
       <w:pPr>
         <w:pStyle w:val="Heading2"/>
@@ -315,8 +276,8 @@
         <w:t xml:space="preserve">Course plan, reading materials, and slides will be available on OLAT. Please note that no recording will be available for this course.</w:t>
       </w:r>
     </w:p>
-    <w:bookmarkEnd w:id="29"/>
-    <w:bookmarkStart w:id="30" w:name="assessment"/>
+    <w:bookmarkEnd w:id="28"/>
+    <w:bookmarkStart w:id="29" w:name="assessment"/>
     <w:p>
       <w:pPr>
         <w:pStyle w:val="Heading2"/>
@@ -361,8 +322,8 @@
         <w:t xml:space="preserve">The exam will take place on 18 December 2024.</w:t>
       </w:r>
     </w:p>
-    <w:bookmarkEnd w:id="30"/>
-    <w:bookmarkStart w:id="52" w:name="course-structure"/>
+    <w:bookmarkEnd w:id="29"/>
+    <w:bookmarkStart w:id="51" w:name="course-structure"/>
     <w:p>
       <w:pPr>
         <w:pStyle w:val="Heading2"/>
@@ -412,18 +373,18 @@
                 <wp:inline>
                   <wp:extent cx="152400" cy="152400"/>
                   <wp:effectExtent b="0" l="0" r="0" t="0"/>
-                  <wp:docPr descr="" title="" id="32" name="Picture"/>
+                  <wp:docPr descr="" title="" id="31" name="Picture"/>
                   <a:graphic>
                     <a:graphicData uri="http://schemas.openxmlformats.org/drawingml/2006/picture">
                       <pic:pic>
                         <pic:nvPicPr>
-                          <pic:cNvPr descr="/Applications/quarto/share/formats/docx/warning.png" id="33" name="Picture"/>
+                          <pic:cNvPr descr="/Applications/quarto/share/formats/docx/warning.png" id="32" name="Picture"/>
                           <pic:cNvPicPr>
                             <a:picLocks noChangeArrowheads="1" noChangeAspect="1"/>
                           </pic:cNvPicPr>
                         </pic:nvPicPr>
                         <pic:blipFill>
-                          <a:blip r:embed="rId31"/>
+                          <a:blip r:embed="rId30"/>
                           <a:stretch>
                             <a:fillRect/>
                           </a:stretch>
@@ -656,7 +617,7 @@
             <w:r>
               <w:t xml:space="preserve"> </w:t>
             </w:r>
-            <w:hyperlink r:id="rId34">
+            <w:hyperlink r:id="rId33">
               <w:r>
                 <w:rPr>
                   <w:rStyle w:val="Hyperlink"/>
@@ -754,7 +715,7 @@
             <w:r>
               <w:t xml:space="preserve"> </w:t>
             </w:r>
-            <w:hyperlink r:id="rId35">
+            <w:hyperlink r:id="rId34">
               <w:r>
                 <w:rPr>
                   <w:rStyle w:val="Hyperlink"/>
@@ -817,7 +778,7 @@
             <w:r>
               <w:t xml:space="preserve"> </w:t>
             </w:r>
-            <w:hyperlink r:id="rId36">
+            <w:hyperlink r:id="rId35">
               <w:r>
                 <w:rPr>
                   <w:rStyle w:val="Hyperlink"/>
@@ -939,7 +900,7 @@
             <w:r>
               <w:t xml:space="preserve"> </w:t>
             </w:r>
-            <w:hyperlink r:id="rId37">
+            <w:hyperlink r:id="rId36">
               <w:r>
                 <w:rPr>
                   <w:rStyle w:val="Hyperlink"/>
@@ -984,7 +945,7 @@
             <w:r>
               <w:t xml:space="preserve"> </w:t>
             </w:r>
-            <w:hyperlink r:id="rId38">
+            <w:hyperlink r:id="rId37">
               <w:r>
                 <w:rPr>
                   <w:rStyle w:val="Hyperlink"/>
@@ -1029,7 +990,7 @@
             <w:r>
               <w:t xml:space="preserve"> </w:t>
             </w:r>
-            <w:hyperlink r:id="rId39">
+            <w:hyperlink r:id="rId38">
               <w:r>
                 <w:rPr>
                   <w:rStyle w:val="Hyperlink"/>
@@ -1139,7 +1100,7 @@
             <w:r>
               <w:t xml:space="preserve"> </w:t>
             </w:r>
-            <w:hyperlink r:id="rId40">
+            <w:hyperlink r:id="rId39">
               <w:r>
                 <w:rPr>
                   <w:rStyle w:val="Hyperlink"/>
@@ -1171,7 +1132,7 @@
             <w:r>
               <w:t xml:space="preserve"> </w:t>
             </w:r>
-            <w:hyperlink r:id="rId41">
+            <w:hyperlink r:id="rId40">
               <w:r>
                 <w:rPr>
                   <w:rStyle w:val="Hyperlink"/>
@@ -1334,7 +1295,7 @@
             <w:r>
               <w:t xml:space="preserve"> </w:t>
             </w:r>
-            <w:hyperlink r:id="rId42">
+            <w:hyperlink r:id="rId41">
               <w:r>
                 <w:rPr>
                   <w:rStyle w:val="Hyperlink"/>
@@ -1379,7 +1340,7 @@
             <w:r>
               <w:t xml:space="preserve"> </w:t>
             </w:r>
-            <w:hyperlink r:id="rId43">
+            <w:hyperlink r:id="rId42">
               <w:r>
                 <w:rPr>
                   <w:rStyle w:val="Hyperlink"/>
@@ -1424,7 +1385,7 @@
             <w:r>
               <w:t xml:space="preserve"> </w:t>
             </w:r>
-            <w:hyperlink r:id="rId44">
+            <w:hyperlink r:id="rId43">
               <w:r>
                 <w:rPr>
                   <w:rStyle w:val="Hyperlink"/>
@@ -1522,7 +1483,7 @@
             <w:r>
               <w:t xml:space="preserve"> </w:t>
             </w:r>
-            <w:hyperlink r:id="rId45">
+            <w:hyperlink r:id="rId44">
               <w:r>
                 <w:rPr>
                   <w:rStyle w:val="Hyperlink"/>
@@ -1567,7 +1528,7 @@
             <w:r>
               <w:t xml:space="preserve"> </w:t>
             </w:r>
-            <w:hyperlink r:id="rId46">
+            <w:hyperlink r:id="rId45">
               <w:r>
                 <w:rPr>
                   <w:rStyle w:val="Hyperlink"/>
@@ -1738,7 +1699,7 @@
             <w:r>
               <w:t xml:space="preserve"> </w:t>
             </w:r>
-            <w:hyperlink r:id="rId47">
+            <w:hyperlink r:id="rId46">
               <w:r>
                 <w:rPr>
                   <w:rStyle w:val="Hyperlink"/>
@@ -1783,7 +1744,7 @@
             <w:r>
               <w:t xml:space="preserve"> </w:t>
             </w:r>
-            <w:hyperlink r:id="rId48">
+            <w:hyperlink r:id="rId47">
               <w:r>
                 <w:rPr>
                   <w:rStyle w:val="Hyperlink"/>
@@ -1885,7 +1846,7 @@
             <w:r>
               <w:t xml:space="preserve"> </w:t>
             </w:r>
-            <w:hyperlink r:id="rId49">
+            <w:hyperlink r:id="rId48">
               <w:r>
                 <w:rPr>
                   <w:rStyle w:val="Hyperlink"/>
@@ -1951,7 +1912,7 @@
             <w:r>
               <w:t xml:space="preserve"> </w:t>
             </w:r>
-            <w:hyperlink r:id="rId50">
+            <w:hyperlink r:id="rId49">
               <w:r>
                 <w:rPr>
                   <w:rStyle w:val="Hyperlink"/>
@@ -2134,7 +2095,7 @@
             <w:r>
               <w:t xml:space="preserve"> </w:t>
             </w:r>
-            <w:hyperlink r:id="rId51">
+            <w:hyperlink r:id="rId50">
               <w:r>
                 <w:rPr>
                   <w:rStyle w:val="Hyperlink"/>
@@ -2304,7 +2265,7 @@
         </w:tc>
       </w:tr>
     </w:tbl>
-    <w:bookmarkEnd w:id="52"/>
+    <w:bookmarkEnd w:id="51"/>
     <w:sectPr>
       <w:footnotePr>
         <w:numRestart w:val="eachSect"/>

</xml_diff>

<commit_message>
Restore hex logo: badge left of title, ETH wordmark right, lecturers centered
PDF builds the same header with raw LaTeX minipages instead of maketitle.

Co-Authored-By: Claude Fable 5 <noreply@anthropic.com>
</commit_message>
<xml_diff>
--- a/docs/syllabus.docx
+++ b/docs/syllabus.docx
@@ -33,14 +33,14 @@
       <w:r>
         <w:drawing>
           <wp:inline>
-            <wp:extent cx="1866900" cy="335177"/>
+            <wp:extent cx="1333500" cy="1492723"/>
             <wp:effectExtent b="0" l="0" r="0" t="0"/>
             <wp:docPr descr="" title="" id="21" name="Picture"/>
             <a:graphic>
               <a:graphicData uri="http://schemas.openxmlformats.org/drawingml/2006/picture">
                 <pic:pic>
                   <pic:nvPicPr>
-                    <pic:cNvPr descr="images/eth_logo.png" id="22" name="Picture"/>
+                    <pic:cNvPr descr="images/logo.png" id="22" name="Picture"/>
                     <pic:cNvPicPr>
                       <a:picLocks noChangeArrowheads="1" noChangeAspect="1"/>
                     </pic:cNvPicPr>
@@ -54,7 +54,7 @@
                   <pic:spPr bwMode="auto">
                     <a:xfrm>
                       <a:off x="0" y="0"/>
-                      <a:ext cx="1866900" cy="335177"/>
+                      <a:ext cx="1333500" cy="1492723"/>
                     </a:xfrm>
                     <a:prstGeom prst="rect">
                       <a:avLst/>
@@ -73,7 +73,54 @@
         </w:drawing>
       </w:r>
     </w:p>
-    <w:bookmarkStart w:id="23" w:name="course-description"/>
+    <w:p>
+      <w:pPr>
+        <w:pStyle w:val="BodyText"/>
+      </w:pPr>
+      <w:r>
+        <w:drawing>
+          <wp:inline>
+            <wp:extent cx="1600200" cy="287294"/>
+            <wp:effectExtent b="0" l="0" r="0" t="0"/>
+            <wp:docPr descr="" title="" id="24" name="Picture"/>
+            <a:graphic>
+              <a:graphicData uri="http://schemas.openxmlformats.org/drawingml/2006/picture">
+                <pic:pic>
+                  <pic:nvPicPr>
+                    <pic:cNvPr descr="images/eth_logo.png" id="25" name="Picture"/>
+                    <pic:cNvPicPr>
+                      <a:picLocks noChangeArrowheads="1" noChangeAspect="1"/>
+                    </pic:cNvPicPr>
+                  </pic:nvPicPr>
+                  <pic:blipFill>
+                    <a:blip r:embed="rId23"/>
+                    <a:stretch>
+                      <a:fillRect/>
+                    </a:stretch>
+                  </pic:blipFill>
+                  <pic:spPr bwMode="auto">
+                    <a:xfrm>
+                      <a:off x="0" y="0"/>
+                      <a:ext cx="1600200" cy="287294"/>
+                    </a:xfrm>
+                    <a:prstGeom prst="rect">
+                      <a:avLst/>
+                    </a:prstGeom>
+                    <a:noFill/>
+                    <a:ln w="9525">
+                      <a:noFill/>
+                      <a:headEnd/>
+                      <a:tailEnd/>
+                    </a:ln>
+                  </pic:spPr>
+                </pic:pic>
+              </a:graphicData>
+            </a:graphic>
+          </wp:inline>
+        </w:drawing>
+      </w:r>
+    </w:p>
+    <w:bookmarkStart w:id="26" w:name="course-description"/>
     <w:p>
       <w:pPr>
         <w:pStyle w:val="Heading2"/>
@@ -90,8 +137,8 @@
         <w:t xml:space="preserve">Climate change communication influences how individuals, organizations, and societies perceive climate change, and how they react to it. In this course, we will discuss research findings in environmental psychology and communication science to understand specific challenges of climate change communication and how to address them.</w:t>
       </w:r>
     </w:p>
-    <w:bookmarkEnd w:id="23"/>
-    <w:bookmarkStart w:id="24" w:name="learning-objectives"/>
+    <w:bookmarkEnd w:id="26"/>
+    <w:bookmarkStart w:id="27" w:name="learning-objectives"/>
     <w:p>
       <w:pPr>
         <w:pStyle w:val="Heading2"/>
@@ -156,8 +203,8 @@
         <w:t xml:space="preserve">Strategically design an effective climate change communication campaign</w:t>
       </w:r>
     </w:p>
-    <w:bookmarkEnd w:id="24"/>
-    <w:bookmarkStart w:id="26" w:name="general-information"/>
+    <w:bookmarkEnd w:id="27"/>
+    <w:bookmarkStart w:id="29" w:name="general-information"/>
     <w:p>
       <w:pPr>
         <w:pStyle w:val="Heading2"/>
@@ -204,7 +251,7 @@
       <w:r>
         <w:t xml:space="preserve"> </w:t>
       </w:r>
-      <w:hyperlink r:id="rId25">
+      <w:hyperlink r:id="rId28">
         <w:r>
           <w:rPr>
             <w:rStyle w:val="Hyperlink"/>
@@ -216,8 +263,8 @@
         <w:t xml:space="preserve">. This is also where slides and additional materials will be posted.</w:t>
       </w:r>
     </w:p>
-    <w:bookmarkEnd w:id="26"/>
-    <w:bookmarkStart w:id="27" w:name="participation"/>
+    <w:bookmarkEnd w:id="29"/>
+    <w:bookmarkStart w:id="30" w:name="participation"/>
     <w:p>
       <w:pPr>
         <w:pStyle w:val="Heading2"/>
@@ -246,8 +293,8 @@
         <w:t xml:space="preserve">Students are expected to actively participate in the course by drawing on their own reading of the materials, as well as their personal experiences and perspectives.</w:t>
       </w:r>
     </w:p>
-    <w:bookmarkEnd w:id="27"/>
-    <w:bookmarkStart w:id="28" w:name="materials"/>
+    <w:bookmarkEnd w:id="30"/>
+    <w:bookmarkStart w:id="31" w:name="materials"/>
     <w:p>
       <w:pPr>
         <w:pStyle w:val="Heading2"/>
@@ -276,8 +323,8 @@
         <w:t xml:space="preserve">Course plan, reading materials, and slides will be available on OLAT. Please note that no recording will be available for this course.</w:t>
       </w:r>
     </w:p>
-    <w:bookmarkEnd w:id="28"/>
-    <w:bookmarkStart w:id="29" w:name="assessment"/>
+    <w:bookmarkEnd w:id="31"/>
+    <w:bookmarkStart w:id="32" w:name="assessment"/>
     <w:p>
       <w:pPr>
         <w:pStyle w:val="Heading2"/>
@@ -322,8 +369,8 @@
         <w:t xml:space="preserve">The exam will take place on 18 December 2024.</w:t>
       </w:r>
     </w:p>
-    <w:bookmarkEnd w:id="29"/>
-    <w:bookmarkStart w:id="51" w:name="course-structure"/>
+    <w:bookmarkEnd w:id="32"/>
+    <w:bookmarkStart w:id="54" w:name="course-structure"/>
     <w:p>
       <w:pPr>
         <w:pStyle w:val="Heading2"/>
@@ -373,18 +420,18 @@
                 <wp:inline>
                   <wp:extent cx="152400" cy="152400"/>
                   <wp:effectExtent b="0" l="0" r="0" t="0"/>
-                  <wp:docPr descr="" title="" id="31" name="Picture"/>
+                  <wp:docPr descr="" title="" id="34" name="Picture"/>
                   <a:graphic>
                     <a:graphicData uri="http://schemas.openxmlformats.org/drawingml/2006/picture">
                       <pic:pic>
                         <pic:nvPicPr>
-                          <pic:cNvPr descr="/Applications/quarto/share/formats/docx/warning.png" id="32" name="Picture"/>
+                          <pic:cNvPr descr="/Applications/quarto/share/formats/docx/warning.png" id="35" name="Picture"/>
                           <pic:cNvPicPr>
                             <a:picLocks noChangeArrowheads="1" noChangeAspect="1"/>
                           </pic:cNvPicPr>
                         </pic:nvPicPr>
                         <pic:blipFill>
-                          <a:blip r:embed="rId30"/>
+                          <a:blip r:embed="rId33"/>
                           <a:stretch>
                             <a:fillRect/>
                           </a:stretch>
@@ -617,7 +664,7 @@
             <w:r>
               <w:t xml:space="preserve"> </w:t>
             </w:r>
-            <w:hyperlink r:id="rId33">
+            <w:hyperlink r:id="rId36">
               <w:r>
                 <w:rPr>
                   <w:rStyle w:val="Hyperlink"/>
@@ -715,7 +762,7 @@
             <w:r>
               <w:t xml:space="preserve"> </w:t>
             </w:r>
-            <w:hyperlink r:id="rId34">
+            <w:hyperlink r:id="rId37">
               <w:r>
                 <w:rPr>
                   <w:rStyle w:val="Hyperlink"/>
@@ -778,7 +825,7 @@
             <w:r>
               <w:t xml:space="preserve"> </w:t>
             </w:r>
-            <w:hyperlink r:id="rId35">
+            <w:hyperlink r:id="rId38">
               <w:r>
                 <w:rPr>
                   <w:rStyle w:val="Hyperlink"/>
@@ -900,7 +947,7 @@
             <w:r>
               <w:t xml:space="preserve"> </w:t>
             </w:r>
-            <w:hyperlink r:id="rId36">
+            <w:hyperlink r:id="rId39">
               <w:r>
                 <w:rPr>
                   <w:rStyle w:val="Hyperlink"/>
@@ -945,7 +992,7 @@
             <w:r>
               <w:t xml:space="preserve"> </w:t>
             </w:r>
-            <w:hyperlink r:id="rId37">
+            <w:hyperlink r:id="rId40">
               <w:r>
                 <w:rPr>
                   <w:rStyle w:val="Hyperlink"/>
@@ -990,7 +1037,7 @@
             <w:r>
               <w:t xml:space="preserve"> </w:t>
             </w:r>
-            <w:hyperlink r:id="rId38">
+            <w:hyperlink r:id="rId41">
               <w:r>
                 <w:rPr>
                   <w:rStyle w:val="Hyperlink"/>
@@ -1100,7 +1147,7 @@
             <w:r>
               <w:t xml:space="preserve"> </w:t>
             </w:r>
-            <w:hyperlink r:id="rId39">
+            <w:hyperlink r:id="rId42">
               <w:r>
                 <w:rPr>
                   <w:rStyle w:val="Hyperlink"/>
@@ -1132,7 +1179,7 @@
             <w:r>
               <w:t xml:space="preserve"> </w:t>
             </w:r>
-            <w:hyperlink r:id="rId40">
+            <w:hyperlink r:id="rId43">
               <w:r>
                 <w:rPr>
                   <w:rStyle w:val="Hyperlink"/>
@@ -1295,7 +1342,7 @@
             <w:r>
               <w:t xml:space="preserve"> </w:t>
             </w:r>
-            <w:hyperlink r:id="rId41">
+            <w:hyperlink r:id="rId44">
               <w:r>
                 <w:rPr>
                   <w:rStyle w:val="Hyperlink"/>
@@ -1340,7 +1387,7 @@
             <w:r>
               <w:t xml:space="preserve"> </w:t>
             </w:r>
-            <w:hyperlink r:id="rId42">
+            <w:hyperlink r:id="rId45">
               <w:r>
                 <w:rPr>
                   <w:rStyle w:val="Hyperlink"/>
@@ -1385,7 +1432,7 @@
             <w:r>
               <w:t xml:space="preserve"> </w:t>
             </w:r>
-            <w:hyperlink r:id="rId43">
+            <w:hyperlink r:id="rId46">
               <w:r>
                 <w:rPr>
                   <w:rStyle w:val="Hyperlink"/>
@@ -1483,7 +1530,7 @@
             <w:r>
               <w:t xml:space="preserve"> </w:t>
             </w:r>
-            <w:hyperlink r:id="rId44">
+            <w:hyperlink r:id="rId47">
               <w:r>
                 <w:rPr>
                   <w:rStyle w:val="Hyperlink"/>
@@ -1528,7 +1575,7 @@
             <w:r>
               <w:t xml:space="preserve"> </w:t>
             </w:r>
-            <w:hyperlink r:id="rId45">
+            <w:hyperlink r:id="rId48">
               <w:r>
                 <w:rPr>
                   <w:rStyle w:val="Hyperlink"/>
@@ -1699,7 +1746,7 @@
             <w:r>
               <w:t xml:space="preserve"> </w:t>
             </w:r>
-            <w:hyperlink r:id="rId46">
+            <w:hyperlink r:id="rId49">
               <w:r>
                 <w:rPr>
                   <w:rStyle w:val="Hyperlink"/>
@@ -1744,7 +1791,7 @@
             <w:r>
               <w:t xml:space="preserve"> </w:t>
             </w:r>
-            <w:hyperlink r:id="rId47">
+            <w:hyperlink r:id="rId50">
               <w:r>
                 <w:rPr>
                   <w:rStyle w:val="Hyperlink"/>
@@ -1846,7 +1893,7 @@
             <w:r>
               <w:t xml:space="preserve"> </w:t>
             </w:r>
-            <w:hyperlink r:id="rId48">
+            <w:hyperlink r:id="rId51">
               <w:r>
                 <w:rPr>
                   <w:rStyle w:val="Hyperlink"/>
@@ -1912,7 +1959,7 @@
             <w:r>
               <w:t xml:space="preserve"> </w:t>
             </w:r>
-            <w:hyperlink r:id="rId49">
+            <w:hyperlink r:id="rId52">
               <w:r>
                 <w:rPr>
                   <w:rStyle w:val="Hyperlink"/>
@@ -2095,7 +2142,7 @@
             <w:r>
               <w:t xml:space="preserve"> </w:t>
             </w:r>
-            <w:hyperlink r:id="rId50">
+            <w:hyperlink r:id="rId53">
               <w:r>
                 <w:rPr>
                   <w:rStyle w:val="Hyperlink"/>
@@ -2265,7 +2312,7 @@
         </w:tc>
       </w:tr>
     </w:tbl>
-    <w:bookmarkEnd w:id="51"/>
+    <w:bookmarkEnd w:id="54"/>
     <w:sectPr>
       <w:footnotePr>
         <w:numRestart w:val="eachSect"/>

</xml_diff>

<commit_message>
Simplify syllabus header: title on top, logo row beneath, instructors with emails
Standard title block in all formats again. Logos via a cross-format
layout-ncol row (hex left, ETH right). Viktoria's email set to
viktoria.cologna@eawag.ch in _variables.yml, also shown on the home page.

Co-Authored-By: Claude Fable 5 <noreply@anthropic.com>
</commit_message>
<xml_diff>
--- a/docs/syllabus.docx
+++ b/docs/syllabus.docx
@@ -18,106 +18,134 @@
         <w:t xml:space="preserve">Theoretical insights and practical applications — Syllabus, Autumn 2026</w:t>
       </w:r>
     </w:p>
+    <w:tbl>
+      <w:tblPr>
+        <w:tblStyle w:val="Table"/>
+        <w:tblW w:type="pct" w:w="5000"/>
+        <w:tblLayout w:type="fixed"/>
+        <w:tblLook w:firstRow="0" w:lastRow="0" w:firstColumn="0" w:lastColumn="0" w:noHBand="0" w:noVBand="0" w:val="0000"/>
+      </w:tblPr>
+      <w:tblGrid>
+        <w:gridCol w:w="2906"/>
+        <w:gridCol w:w="5013"/>
+      </w:tblGrid>
+      <w:tr>
+        <w:tc>
+          <w:tcPr/>
+          <w:p>
+            <w:pPr>
+              <w:jc w:val="center"/>
+            </w:pPr>
+            <w:r>
+              <w:drawing>
+                <wp:inline>
+                  <wp:extent cx="2185416" cy="2446361"/>
+                  <wp:effectExtent b="0" l="0" r="0" t="0"/>
+                  <wp:docPr descr="" title="" id="21" name="Picture"/>
+                  <a:graphic>
+                    <a:graphicData uri="http://schemas.openxmlformats.org/drawingml/2006/picture">
+                      <pic:pic>
+                        <pic:nvPicPr>
+                          <pic:cNvPr descr="images/logo.png" id="22" name="Picture"/>
+                          <pic:cNvPicPr>
+                            <a:picLocks noChangeArrowheads="1" noChangeAspect="1"/>
+                          </pic:cNvPicPr>
+                        </pic:nvPicPr>
+                        <pic:blipFill>
+                          <a:blip r:embed="rId20"/>
+                          <a:stretch>
+                            <a:fillRect/>
+                          </a:stretch>
+                        </pic:blipFill>
+                        <pic:spPr bwMode="auto">
+                          <a:xfrm>
+                            <a:off x="0" y="0"/>
+                            <a:ext cx="2185416" cy="2446361"/>
+                          </a:xfrm>
+                          <a:prstGeom prst="rect">
+                            <a:avLst/>
+                          </a:prstGeom>
+                          <a:noFill/>
+                          <a:ln w="9525">
+                            <a:noFill/>
+                            <a:headEnd/>
+                            <a:tailEnd/>
+                          </a:ln>
+                        </pic:spPr>
+                      </pic:pic>
+                    </a:graphicData>
+                  </a:graphic>
+                </wp:inline>
+              </w:drawing>
+            </w:r>
+          </w:p>
+        </w:tc>
+        <w:tc>
+          <w:tcPr/>
+          <w:p>
+            <w:pPr>
+              <w:jc w:val="center"/>
+            </w:pPr>
+            <w:r>
+              <w:drawing>
+                <wp:inline>
+                  <wp:extent cx="3758184" cy="674731"/>
+                  <wp:effectExtent b="0" l="0" r="0" t="0"/>
+                  <wp:docPr descr="" title="" id="24" name="Picture"/>
+                  <a:graphic>
+                    <a:graphicData uri="http://schemas.openxmlformats.org/drawingml/2006/picture">
+                      <pic:pic>
+                        <pic:nvPicPr>
+                          <pic:cNvPr descr="images/eth_logo.png" id="25" name="Picture"/>
+                          <pic:cNvPicPr>
+                            <a:picLocks noChangeArrowheads="1" noChangeAspect="1"/>
+                          </pic:cNvPicPr>
+                        </pic:nvPicPr>
+                        <pic:blipFill>
+                          <a:blip r:embed="rId23"/>
+                          <a:stretch>
+                            <a:fillRect/>
+                          </a:stretch>
+                        </pic:blipFill>
+                        <pic:spPr bwMode="auto">
+                          <a:xfrm>
+                            <a:off x="0" y="0"/>
+                            <a:ext cx="3758184" cy="674731"/>
+                          </a:xfrm>
+                          <a:prstGeom prst="rect">
+                            <a:avLst/>
+                          </a:prstGeom>
+                          <a:noFill/>
+                          <a:ln w="9525">
+                            <a:noFill/>
+                            <a:headEnd/>
+                            <a:tailEnd/>
+                          </a:ln>
+                        </pic:spPr>
+                      </pic:pic>
+                    </a:graphicData>
+                  </a:graphic>
+                </wp:inline>
+              </w:drawing>
+            </w:r>
+          </w:p>
+        </w:tc>
+      </w:tr>
+    </w:tbl>
     <w:p>
       <w:pPr>
-        <w:pStyle w:val="Author"/>
+        <w:pStyle w:val="BodyText"/>
       </w:pPr>
       <w:r>
-        <w:t xml:space="preserve">Viktoria Cologna &amp; Jan Pfänder</w:t>
+        <w:t xml:space="preserve">Viktoria Cologna — viktoria.cologna@eawag.ch</w:t>
       </w:r>
     </w:p>
     <w:p>
       <w:pPr>
-        <w:pStyle w:val="FirstParagraph"/>
+        <w:pStyle w:val="BodyText"/>
       </w:pPr>
       <w:r>
-        <w:drawing>
-          <wp:inline>
-            <wp:extent cx="1333500" cy="1492723"/>
-            <wp:effectExtent b="0" l="0" r="0" t="0"/>
-            <wp:docPr descr="" title="" id="21" name="Picture"/>
-            <a:graphic>
-              <a:graphicData uri="http://schemas.openxmlformats.org/drawingml/2006/picture">
-                <pic:pic>
-                  <pic:nvPicPr>
-                    <pic:cNvPr descr="images/logo.png" id="22" name="Picture"/>
-                    <pic:cNvPicPr>
-                      <a:picLocks noChangeArrowheads="1" noChangeAspect="1"/>
-                    </pic:cNvPicPr>
-                  </pic:nvPicPr>
-                  <pic:blipFill>
-                    <a:blip r:embed="rId20"/>
-                    <a:stretch>
-                      <a:fillRect/>
-                    </a:stretch>
-                  </pic:blipFill>
-                  <pic:spPr bwMode="auto">
-                    <a:xfrm>
-                      <a:off x="0" y="0"/>
-                      <a:ext cx="1333500" cy="1492723"/>
-                    </a:xfrm>
-                    <a:prstGeom prst="rect">
-                      <a:avLst/>
-                    </a:prstGeom>
-                    <a:noFill/>
-                    <a:ln w="9525">
-                      <a:noFill/>
-                      <a:headEnd/>
-                      <a:tailEnd/>
-                    </a:ln>
-                  </pic:spPr>
-                </pic:pic>
-              </a:graphicData>
-            </a:graphic>
-          </wp:inline>
-        </w:drawing>
-      </w:r>
-    </w:p>
-    <w:p>
-      <w:pPr>
-        <w:pStyle w:val="BodyText"/>
-      </w:pPr>
-      <w:r>
-        <w:drawing>
-          <wp:inline>
-            <wp:extent cx="1600200" cy="287294"/>
-            <wp:effectExtent b="0" l="0" r="0" t="0"/>
-            <wp:docPr descr="" title="" id="24" name="Picture"/>
-            <a:graphic>
-              <a:graphicData uri="http://schemas.openxmlformats.org/drawingml/2006/picture">
-                <pic:pic>
-                  <pic:nvPicPr>
-                    <pic:cNvPr descr="images/eth_logo.png" id="25" name="Picture"/>
-                    <pic:cNvPicPr>
-                      <a:picLocks noChangeArrowheads="1" noChangeAspect="1"/>
-                    </pic:cNvPicPr>
-                  </pic:nvPicPr>
-                  <pic:blipFill>
-                    <a:blip r:embed="rId23"/>
-                    <a:stretch>
-                      <a:fillRect/>
-                    </a:stretch>
-                  </pic:blipFill>
-                  <pic:spPr bwMode="auto">
-                    <a:xfrm>
-                      <a:off x="0" y="0"/>
-                      <a:ext cx="1600200" cy="287294"/>
-                    </a:xfrm>
-                    <a:prstGeom prst="rect">
-                      <a:avLst/>
-                    </a:prstGeom>
-                    <a:noFill/>
-                    <a:ln w="9525">
-                      <a:noFill/>
-                      <a:headEnd/>
-                      <a:tailEnd/>
-                    </a:ln>
-                  </pic:spPr>
-                </pic:pic>
-              </a:graphicData>
-            </a:graphic>
-          </wp:inline>
-        </w:drawing>
+        <w:t xml:space="preserve">Jan Pfänder — janlukas.pfaender@gmail.com</w:t>
       </w:r>
     </w:p>
     <w:bookmarkStart w:id="26" w:name="course-description"/>

</xml_diff>

<commit_message>
Center the two logos next to each other under the title
Co-Authored-By: Claude Fable 5 <noreply@anthropic.com>
</commit_message>
<xml_diff>
--- a/docs/syllabus.docx
+++ b/docs/syllabus.docx
@@ -18,120 +18,98 @@
         <w:t xml:space="preserve">Theoretical insights and practical applications — Syllabus, Autumn 2026</w:t>
       </w:r>
     </w:p>
-    <w:tbl>
-      <w:tblPr>
-        <w:tblStyle w:val="Table"/>
-        <w:tblW w:type="pct" w:w="5000"/>
-        <w:tblLayout w:type="fixed"/>
-        <w:tblLook w:firstRow="0" w:lastRow="0" w:firstColumn="0" w:lastColumn="0" w:noHBand="0" w:noVBand="0" w:val="0000"/>
-      </w:tblPr>
-      <w:tblGrid>
-        <w:gridCol w:w="2906"/>
-        <w:gridCol w:w="5013"/>
-      </w:tblGrid>
-      <w:tr>
-        <w:tc>
-          <w:tcPr/>
-          <w:p>
-            <w:pPr>
-              <w:jc w:val="center"/>
-            </w:pPr>
-            <w:r>
-              <w:drawing>
-                <wp:inline>
-                  <wp:extent cx="2185416" cy="2446361"/>
-                  <wp:effectExtent b="0" l="0" r="0" t="0"/>
-                  <wp:docPr descr="" title="" id="21" name="Picture"/>
-                  <a:graphic>
-                    <a:graphicData uri="http://schemas.openxmlformats.org/drawingml/2006/picture">
-                      <pic:pic>
-                        <pic:nvPicPr>
-                          <pic:cNvPr descr="images/logo.png" id="22" name="Picture"/>
-                          <pic:cNvPicPr>
-                            <a:picLocks noChangeArrowheads="1" noChangeAspect="1"/>
-                          </pic:cNvPicPr>
-                        </pic:nvPicPr>
-                        <pic:blipFill>
-                          <a:blip r:embed="rId20"/>
-                          <a:stretch>
-                            <a:fillRect/>
-                          </a:stretch>
-                        </pic:blipFill>
-                        <pic:spPr bwMode="auto">
-                          <a:xfrm>
-                            <a:off x="0" y="0"/>
-                            <a:ext cx="2185416" cy="2446361"/>
-                          </a:xfrm>
-                          <a:prstGeom prst="rect">
-                            <a:avLst/>
-                          </a:prstGeom>
-                          <a:noFill/>
-                          <a:ln w="9525">
-                            <a:noFill/>
-                            <a:headEnd/>
-                            <a:tailEnd/>
-                          </a:ln>
-                        </pic:spPr>
-                      </pic:pic>
-                    </a:graphicData>
-                  </a:graphic>
-                </wp:inline>
-              </w:drawing>
-            </w:r>
-          </w:p>
-        </w:tc>
-        <w:tc>
-          <w:tcPr/>
-          <w:p>
-            <w:pPr>
-              <w:jc w:val="center"/>
-            </w:pPr>
-            <w:r>
-              <w:drawing>
-                <wp:inline>
-                  <wp:extent cx="3758184" cy="674731"/>
-                  <wp:effectExtent b="0" l="0" r="0" t="0"/>
-                  <wp:docPr descr="" title="" id="24" name="Picture"/>
-                  <a:graphic>
-                    <a:graphicData uri="http://schemas.openxmlformats.org/drawingml/2006/picture">
-                      <pic:pic>
-                        <pic:nvPicPr>
-                          <pic:cNvPr descr="images/eth_logo.png" id="25" name="Picture"/>
-                          <pic:cNvPicPr>
-                            <a:picLocks noChangeArrowheads="1" noChangeAspect="1"/>
-                          </pic:cNvPicPr>
-                        </pic:nvPicPr>
-                        <pic:blipFill>
-                          <a:blip r:embed="rId23"/>
-                          <a:stretch>
-                            <a:fillRect/>
-                          </a:stretch>
-                        </pic:blipFill>
-                        <pic:spPr bwMode="auto">
-                          <a:xfrm>
-                            <a:off x="0" y="0"/>
-                            <a:ext cx="3758184" cy="674731"/>
-                          </a:xfrm>
-                          <a:prstGeom prst="rect">
-                            <a:avLst/>
-                          </a:prstGeom>
-                          <a:noFill/>
-                          <a:ln w="9525">
-                            <a:noFill/>
-                            <a:headEnd/>
-                            <a:tailEnd/>
-                          </a:ln>
-                        </pic:spPr>
-                      </pic:pic>
-                    </a:graphicData>
-                  </a:graphic>
-                </wp:inline>
-              </w:drawing>
-            </w:r>
-          </w:p>
-        </w:tc>
-      </w:tr>
-    </w:tbl>
+    <w:p>
+      <w:pPr>
+        <w:pStyle w:val="FirstParagraph"/>
+      </w:pPr>
+      <w:r>
+        <w:drawing>
+          <wp:inline>
+            <wp:extent cx="1047750" cy="1172854"/>
+            <wp:effectExtent b="0" l="0" r="0" t="0"/>
+            <wp:docPr descr="" title="" id="21" name="Picture"/>
+            <a:graphic>
+              <a:graphicData uri="http://schemas.openxmlformats.org/drawingml/2006/picture">
+                <pic:pic>
+                  <pic:nvPicPr>
+                    <pic:cNvPr descr="images/logo.png" id="22" name="Picture"/>
+                    <pic:cNvPicPr>
+                      <a:picLocks noChangeArrowheads="1" noChangeAspect="1"/>
+                    </pic:cNvPicPr>
+                  </pic:nvPicPr>
+                  <pic:blipFill>
+                    <a:blip r:embed="rId20"/>
+                    <a:stretch>
+                      <a:fillRect/>
+                    </a:stretch>
+                  </pic:blipFill>
+                  <pic:spPr bwMode="auto">
+                    <a:xfrm>
+                      <a:off x="0" y="0"/>
+                      <a:ext cx="1047750" cy="1172854"/>
+                    </a:xfrm>
+                    <a:prstGeom prst="rect">
+                      <a:avLst/>
+                    </a:prstGeom>
+                    <a:noFill/>
+                    <a:ln w="9525">
+                      <a:noFill/>
+                      <a:headEnd/>
+                      <a:tailEnd/>
+                    </a:ln>
+                  </pic:spPr>
+                </pic:pic>
+              </a:graphicData>
+            </a:graphic>
+          </wp:inline>
+        </w:drawing>
+      </w:r>
+      <w:r>
+        <w:t xml:space="preserve"> </w:t>
+      </w:r>
+      <w:r>
+        <w:drawing>
+          <wp:inline>
+            <wp:extent cx="1809750" cy="324916"/>
+            <wp:effectExtent b="0" l="0" r="0" t="0"/>
+            <wp:docPr descr="" title="" id="24" name="Picture"/>
+            <a:graphic>
+              <a:graphicData uri="http://schemas.openxmlformats.org/drawingml/2006/picture">
+                <pic:pic>
+                  <pic:nvPicPr>
+                    <pic:cNvPr descr="images/eth_logo.png" id="25" name="Picture"/>
+                    <pic:cNvPicPr>
+                      <a:picLocks noChangeArrowheads="1" noChangeAspect="1"/>
+                    </pic:cNvPicPr>
+                  </pic:nvPicPr>
+                  <pic:blipFill>
+                    <a:blip r:embed="rId23"/>
+                    <a:stretch>
+                      <a:fillRect/>
+                    </a:stretch>
+                  </pic:blipFill>
+                  <pic:spPr bwMode="auto">
+                    <a:xfrm>
+                      <a:off x="0" y="0"/>
+                      <a:ext cx="1809750" cy="324916"/>
+                    </a:xfrm>
+                    <a:prstGeom prst="rect">
+                      <a:avLst/>
+                    </a:prstGeom>
+                    <a:noFill/>
+                    <a:ln w="9525">
+                      <a:noFill/>
+                      <a:headEnd/>
+                      <a:tailEnd/>
+                    </a:ln>
+                  </pic:spPr>
+                </pic:pic>
+              </a:graphicData>
+            </a:graphic>
+          </wp:inline>
+        </w:drawing>
+      </w:r>
+    </w:p>
     <w:p>
       <w:pPr>
         <w:pStyle w:val="BodyText"/>

</xml_diff>

<commit_message>
Derive session dates from first_session, add downloadable calendar file
- _variables.yml: course block now has machine-readable weekday/start/end/
  room/timezone/first_session; date attrs removed from session divs (dates
  are first_session + 7 days per session, date="..." still overrides)
- course-structure.lua and the index chunk both compute dates from the
  same variables
- index generates course-sessions.ics (14 events, TZID Europe/Zurich so
  the October clock change does not shift times) with a download link

Co-Authored-By: Claude Fable 5 <noreply@anthropic.com>
</commit_message>
<xml_diff>
--- a/docs/syllabus.docx
+++ b/docs/syllabus.docx
@@ -115,7 +115,7 @@
         <w:pStyle w:val="BodyText"/>
       </w:pPr>
       <w:r>
-        <w:t xml:space="preserve">Viktoria Cologna — viktoria.cologna@eawag.ch</w:t>
+        <w:t xml:space="preserve">Dr. Viktoria Cologna — viktoria.cologna@eawag.ch</w:t>
       </w:r>
     </w:p>
     <w:p>
@@ -123,7 +123,7 @@
         <w:pStyle w:val="BodyText"/>
       </w:pPr>
       <w:r>
-        <w:t xml:space="preserve">Jan Pfänder — janlukas.pfaender@gmail.com</w:t>
+        <w:t xml:space="preserve">Dr. Jan Pfänder — janlukas.pfaender@gmail.com</w:t>
       </w:r>
     </w:p>
     <w:bookmarkStart w:id="26" w:name="course-description"/>
@@ -284,49 +284,62 @@
         <w:pStyle w:val="FirstParagraph"/>
       </w:pPr>
       <w:r>
+        <w:t xml:space="preserve">Students are expected to actively participate in the course by drawing on their own reading of the materials, as well as their personal experiences and perspectives. Participating means asking deep and challenging questions, but also asking simple clarification questions like</w:t>
+      </w:r>
+      <w:r>
+        <w:t xml:space="preserve"> </w:t>
+      </w:r>
+      <w:r>
+        <w:t xml:space="preserve">“I’m just not getting this, please explain it in some new way”</w:t>
+      </w:r>
+      <w:r>
+        <w:t xml:space="preserve"> </w:t>
+      </w:r>
+      <w:r>
+        <w:t xml:space="preserve">or</w:t>
+      </w:r>
+      <w:r>
+        <w:t xml:space="preserve"> </w:t>
+      </w:r>
+      <w:r>
+        <w:t xml:space="preserve">“I’m lost, can you remind me why we’re talking about this?”</w:t>
+      </w:r>
+      <w:r>
+        <w:t xml:space="preserve">.</w:t>
+      </w:r>
+    </w:p>
+    <w:bookmarkEnd w:id="30"/>
+    <w:bookmarkStart w:id="31" w:name="materials"/>
+    <w:p>
+      <w:pPr>
+        <w:pStyle w:val="Heading2"/>
+      </w:pPr>
+      <w:r>
+        <w:t xml:space="preserve">Materials</w:t>
+      </w:r>
+    </w:p>
+    <w:p>
+      <w:pPr>
+        <w:pStyle w:val="FirstParagraph"/>
+      </w:pPr>
+      <w:r>
+        <w:t xml:space="preserve">Course plan, reading materials, and slides will be available on Moodle and on https://github.com/janpfander/course_climate_communication. Please note that</w:t>
+      </w:r>
+      <w:r>
+        <w:t xml:space="preserve"> </w:t>
+      </w:r>
+      <w:r>
         <w:rPr>
           <w:b/>
           <w:bCs/>
         </w:rPr>
-        <w:t xml:space="preserve">[TODO: carried over from 2024 UZH syllabus — rewrite]</w:t>
-      </w:r>
-    </w:p>
-    <w:p>
-      <w:pPr>
-        <w:pStyle w:val="BodyText"/>
-      </w:pPr>
-      <w:r>
-        <w:t xml:space="preserve">Students are expected to actively participate in the course by drawing on their own reading of the materials, as well as their personal experiences and perspectives.</w:t>
-      </w:r>
-    </w:p>
-    <w:bookmarkEnd w:id="30"/>
-    <w:bookmarkStart w:id="31" w:name="materials"/>
-    <w:p>
-      <w:pPr>
-        <w:pStyle w:val="Heading2"/>
-      </w:pPr>
-      <w:r>
-        <w:t xml:space="preserve">Materials</w:t>
-      </w:r>
-    </w:p>
-    <w:p>
-      <w:pPr>
-        <w:pStyle w:val="FirstParagraph"/>
-      </w:pPr>
-      <w:r>
-        <w:rPr>
-          <w:b/>
-          <w:bCs/>
-        </w:rPr>
-        <w:t xml:space="preserve">[TODO: carried over from 2024 UZH syllabus — rewrite. OLAT is the UZH platform, ETH uses Moodle.]</w:t>
-      </w:r>
-    </w:p>
-    <w:p>
-      <w:pPr>
-        <w:pStyle w:val="BodyText"/>
-      </w:pPr>
-      <w:r>
-        <w:t xml:space="preserve">Course plan, reading materials, and slides will be available on OLAT. Please note that no recording will be available for this course.</w:t>
+        <w:t xml:space="preserve">no</w:t>
+      </w:r>
+      <w:r>
+        <w:t xml:space="preserve"> </w:t>
+      </w:r>
+      <w:r>
+        <w:t xml:space="preserve">recording will be available for this course.</w:t>
       </w:r>
     </w:p>
     <w:bookmarkEnd w:id="31"/>
@@ -344,39 +357,11 @@
         <w:pStyle w:val="FirstParagraph"/>
       </w:pPr>
       <w:r>
-        <w:rPr>
-          <w:b/>
-          <w:bCs/>
-        </w:rPr>
-        <w:t xml:space="preserve">[TODO: carried over from 2024 UZH syllabus — rewrite. Exam date below is from the old course (2024).]</w:t>
-      </w:r>
-    </w:p>
-    <w:p>
-      <w:pPr>
-        <w:pStyle w:val="Compact"/>
-        <w:numPr>
-          <w:ilvl w:val="0"/>
-          <w:numId w:val="1003"/>
-        </w:numPr>
-      </w:pPr>
-      <w:r>
-        <w:t xml:space="preserve">On-site written exam (3 ECTS) with multiple choice and open questions.</w:t>
-      </w:r>
-    </w:p>
-    <w:p>
-      <w:pPr>
-        <w:pStyle w:val="Compact"/>
-        <w:numPr>
-          <w:ilvl w:val="0"/>
-          <w:numId w:val="1003"/>
-        </w:numPr>
-      </w:pPr>
-      <w:r>
-        <w:t xml:space="preserve">The exam will take place on 18 December 2024.</w:t>
+        <w:t xml:space="preserve">This class is not graded, students either pass or fail. Students are expected to prepare for class by completing assigned readings, attend all lectures, and meaningfully contribute to in-class exercises and discussion.</w:t>
       </w:r>
     </w:p>
     <w:bookmarkEnd w:id="32"/>
-    <w:bookmarkStart w:id="54" w:name="course-structure"/>
+    <w:bookmarkStart w:id="49" w:name="course-structure"/>
     <w:p>
       <w:pPr>
         <w:pStyle w:val="Heading2"/>
@@ -385,152 +370,6 @@
         <w:t xml:space="preserve">Course Structure</w:t>
       </w:r>
     </w:p>
-    <w:tbl>
-      <w:tblPr>
-        <w:tblStyle w:val="Table"/>
-        <w:tblLook w:firstRow="0" w:lastRow="0" w:firstColumn="0" w:lastColumn="0" w:noHBand="0" w:noVBand="0" w:val="0000"/>
-        <w:tblBorders>
-          <w:top w:val="single" w:sz="4" w:space="0" w:color="EB9113"/>
-          <w:left w:val="single" w:sz="24" w:space="0" w:color="EB9113"/>
-          <w:bottom w:val="single" w:sz="4" w:space="0" w:color="EB9113"/>
-          <w:right w:val="single" w:sz="4" w:space="0" w:color="EB9113"/>
-        </w:tblBorders>
-        <w:tblCellMar>
-          <w:left w:w="144" w:type="dxa"/>
-          <w:right w:w="144" w:type="dxa"/>
-        </w:tblCellMar>
-        <w:tblLook w:firstRow="0" w:lastRow="0" w:firstColumn="0" w:lastColumn="0" w:noHBand="0" w:noVBand="0" w:val="0000"/>
-      </w:tblPr>
-      <w:tr>
-        <w:trPr>
-          <w:cantSplit/>
-        </w:trPr>
-        <w:tc>
-          <w:tcPr>
-            <w:shd w:color="auto" w:fill="fcefdc" w:val="clear"/>
-            <w:tcMar>
-              <w:top w:w="92" w:type="dxa"/>
-              <w:bottom w:w="92" w:type="dxa"/>
-            </w:tcMar>
-          </w:tcPr>
-          <w:p>
-            <w:pPr>
-              <w:pStyle w:val="FirstParagraph"/>
-            </w:pPr>
-            <w:pPr>
-              <w:spacing w:before="0" w:after="0"/>
-              <w:textAlignment w:val="center"/>
-            </w:pPr>
-            <w:r>
-              <w:drawing>
-                <wp:inline>
-                  <wp:extent cx="152400" cy="152400"/>
-                  <wp:effectExtent b="0" l="0" r="0" t="0"/>
-                  <wp:docPr descr="" title="" id="34" name="Picture"/>
-                  <a:graphic>
-                    <a:graphicData uri="http://schemas.openxmlformats.org/drawingml/2006/picture">
-                      <pic:pic>
-                        <pic:nvPicPr>
-                          <pic:cNvPr descr="/Applications/quarto/share/formats/docx/warning.png" id="35" name="Picture"/>
-                          <pic:cNvPicPr>
-                            <a:picLocks noChangeArrowheads="1" noChangeAspect="1"/>
-                          </pic:cNvPicPr>
-                        </pic:nvPicPr>
-                        <pic:blipFill>
-                          <a:blip r:embed="rId33"/>
-                          <a:stretch>
-                            <a:fillRect/>
-                          </a:stretch>
-                        </pic:blipFill>
-                        <pic:spPr bwMode="auto">
-                          <a:xfrm>
-                            <a:off x="0" y="0"/>
-                            <a:ext cx="152400" cy="152400"/>
-                          </a:xfrm>
-                          <a:prstGeom prst="rect">
-                            <a:avLst/>
-                          </a:prstGeom>
-                          <a:noFill/>
-                          <a:ln w="9525">
-                            <a:noFill/>
-                            <a:headEnd/>
-                            <a:tailEnd/>
-                          </a:ln>
-                        </pic:spPr>
-                      </pic:pic>
-                    </a:graphicData>
-                  </a:graphic>
-                </wp:inline>
-              </w:drawing>
-            </w:r>
-            <w:r>
-              <w:t xml:space="preserve"> </w:t>
-            </w:r>
-            <w:r>
-              <w:t xml:space="preserve"> </w:t>
-            </w:r>
-            <w:r>
-              <w:t xml:space="preserve">Draft</w:t>
-            </w:r>
-          </w:p>
-        </w:tc>
-      </w:tr>
-      <w:tr>
-        <w:trPr>
-          <w:cantSplit/>
-        </w:trPr>
-        <w:tc>
-          <w:tcPr>
-            <w:tcMar>
-              <w:top w:w="108" w:type="dxa"/>
-              <w:bottom w:w="108" w:type="dxa"/>
-            </w:tcMar>
-          </w:tcPr>
-          <w:p>
-            <w:pPr>
-              <w:pStyle w:val="BodyText"/>
-            </w:pPr>
-            <w:pPr>
-              <w:spacing w:before="16" w:after="16"/>
-            </w:pPr>
-            <w:r>
-              <w:t xml:space="preserve">Topics, descriptions, and literature below are carried over from a previous version of this course taught at UZH. Dates are correct for Autumn 2026, everything else will be revised. Citations are plain text copied from the old reference list. Once</w:t>
-            </w:r>
-            <w:r>
-              <w:t xml:space="preserve"> </w:t>
-            </w:r>
-            <w:r>
-              <w:rPr>
-                <w:rStyle w:val="VerbatimChar"/>
-              </w:rPr>
-              <w:t xml:space="preserve">references.bib</w:t>
-            </w:r>
-            <w:r>
-              <w:t xml:space="preserve"> </w:t>
-            </w:r>
-            <w:r>
-              <w:t xml:space="preserve">is exported from Zotero, they can be replaced by</w:t>
-            </w:r>
-            <w:r>
-              <w:t xml:space="preserve"> </w:t>
-            </w:r>
-            <w:r>
-              <w:rPr>
-                <w:rStyle w:val="VerbatimChar"/>
-              </w:rPr>
-              <w:t xml:space="preserve">@bibkeys</w:t>
-            </w:r>
-            <w:r>
-              <w:t xml:space="preserve"> </w:t>
-            </w:r>
-            <w:r>
-              <w:t xml:space="preserve">(Leiserowitz et al. 2024 and Corner et al. 2018 are missing from the old list).</w:t>
-            </w:r>
-          </w:p>
-          <w:p/>
-        </w:tc>
-      </w:tr>
-    </w:tbl>
     <w:tbl>
       <w:tblPr>
         <w:tblStyle w:val="Table"/>
@@ -670,7 +509,7 @@
             <w:r>
               <w:t xml:space="preserve"> </w:t>
             </w:r>
-            <w:hyperlink r:id="rId36">
+            <w:hyperlink r:id="rId33">
               <w:r>
                 <w:rPr>
                   <w:rStyle w:val="Hyperlink"/>
@@ -768,7 +607,7 @@
             <w:r>
               <w:t xml:space="preserve"> </w:t>
             </w:r>
-            <w:hyperlink r:id="rId37">
+            <w:hyperlink r:id="rId34">
               <w:r>
                 <w:rPr>
                   <w:rStyle w:val="Hyperlink"/>
@@ -831,7 +670,7 @@
             <w:r>
               <w:t xml:space="preserve"> </w:t>
             </w:r>
-            <w:hyperlink r:id="rId38">
+            <w:hyperlink r:id="rId35">
               <w:r>
                 <w:rPr>
                   <w:rStyle w:val="Hyperlink"/>
@@ -891,7 +730,7 @@
                 <w:b/>
                 <w:bCs/>
               </w:rPr>
-              <w:t xml:space="preserve">[TODO: blurb below describes a different person (Dr. Lydia Ebersbach, WWF) — rewrite for the actual speaker]</w:t>
+              <w:t xml:space="preserve">[TODO: rewrite for the actual speaker]</w:t>
             </w:r>
           </w:p>
           <w:p>
@@ -953,7 +792,7 @@
             <w:r>
               <w:t xml:space="preserve"> </w:t>
             </w:r>
-            <w:hyperlink r:id="rId39">
+            <w:hyperlink r:id="rId36">
               <w:r>
                 <w:rPr>
                   <w:rStyle w:val="Hyperlink"/>
@@ -998,7 +837,7 @@
             <w:r>
               <w:t xml:space="preserve"> </w:t>
             </w:r>
-            <w:hyperlink r:id="rId40">
+            <w:hyperlink r:id="rId37">
               <w:r>
                 <w:rPr>
                   <w:rStyle w:val="Hyperlink"/>
@@ -1043,7 +882,7 @@
             <w:r>
               <w:t xml:space="preserve"> </w:t>
             </w:r>
-            <w:hyperlink r:id="rId41">
+            <w:hyperlink r:id="rId38">
               <w:r>
                 <w:rPr>
                   <w:rStyle w:val="Hyperlink"/>
@@ -1110,19 +949,129 @@
               <w:pStyle w:val="BodyText"/>
             </w:pPr>
             <w:r>
+              <w:t xml:space="preserve">tbd</w:t>
+            </w:r>
+          </w:p>
+        </w:tc>
+      </w:tr>
+      <w:tr>
+        <w:tc>
+          <w:tcPr/>
+          <w:p>
+            <w:pPr>
+              <w:pStyle w:val="Compact"/>
+            </w:pPr>
+            <w:r>
+              <w:t xml:space="preserve">5</w:t>
+            </w:r>
+          </w:p>
+        </w:tc>
+        <w:tc>
+          <w:tcPr/>
+          <w:p>
+            <w:pPr>
+              <w:pStyle w:val="Compact"/>
+            </w:pPr>
+            <w:r>
+              <w:t xml:space="preserve">13.10.2026</w:t>
+            </w:r>
+          </w:p>
+        </w:tc>
+        <w:tc>
+          <w:tcPr/>
+          <w:p>
+            <w:pPr>
+              <w:pStyle w:val="BodyText"/>
+            </w:pPr>
+            <w:r>
               <w:rPr>
                 <w:b/>
                 <w:bCs/>
               </w:rPr>
-              <w:t xml:space="preserve">[TODO: template lists the climate-delay/denial literature here, which matches session 5’s topic — check alignment]</w:t>
-            </w:r>
-          </w:p>
-          <w:p>
-            <w:pPr>
-              <w:pStyle w:val="BodyText"/>
-            </w:pPr>
-            <w:r>
-              <w:t xml:space="preserve">Lamb, W. F., Mattioli, G., Levi, S., Roberts, J. T., Capstick, S., Creutzig, F., Minx, J. C., Müller-Hansen, F., Culhane, T., &amp; Steinberger, J. K. (2020). Discourses of climate delay.</w:t>
+              <w:t xml:space="preserve">Climate change misinformation</w:t>
+            </w:r>
+            <w:r>
+              <w:t xml:space="preserve"> — Jan Pfänder</w:t>
+            </w:r>
+          </w:p>
+          <w:p>
+            <w:pPr>
+              <w:pStyle w:val="BodyText"/>
+            </w:pPr>
+            <w:r>
+              <w:t xml:space="preserve">What are discourses that delay action on climate change? How do you identify climate science denial and how do you respond to it?</w:t>
+            </w:r>
+          </w:p>
+        </w:tc>
+        <w:tc>
+          <w:tcPr/>
+          <w:p>
+            <w:pPr>
+              <w:pStyle w:val="BodyText"/>
+            </w:pPr>
+            <w:r>
+              <w:t xml:space="preserve">tbd</w:t>
+            </w:r>
+          </w:p>
+        </w:tc>
+      </w:tr>
+      <w:tr>
+        <w:tc>
+          <w:tcPr/>
+          <w:p>
+            <w:pPr>
+              <w:pStyle w:val="Compact"/>
+            </w:pPr>
+            <w:r>
+              <w:t xml:space="preserve">6</w:t>
+            </w:r>
+          </w:p>
+        </w:tc>
+        <w:tc>
+          <w:tcPr/>
+          <w:p>
+            <w:pPr>
+              <w:pStyle w:val="Compact"/>
+            </w:pPr>
+            <w:r>
+              <w:t xml:space="preserve">20.10.2026</w:t>
+            </w:r>
+          </w:p>
+        </w:tc>
+        <w:tc>
+          <w:tcPr/>
+          <w:p>
+            <w:pPr>
+              <w:pStyle w:val="BodyText"/>
+            </w:pPr>
+            <w:r>
+              <w:rPr>
+                <w:b/>
+                <w:bCs/>
+              </w:rPr>
+              <w:t xml:space="preserve">Emotions and behavior</w:t>
+            </w:r>
+            <w:r>
+              <w:t xml:space="preserve"> — [TODO: lecturer]</w:t>
+            </w:r>
+          </w:p>
+          <w:p>
+            <w:pPr>
+              <w:pStyle w:val="BodyText"/>
+            </w:pPr>
+            <w:r>
+              <w:t xml:space="preserve">What is the role of emotions in climate change communication? How can we communicate about climate change in a way that increases feelings of self-efficacy? How does media usage relate to behavioral intentions?</w:t>
+            </w:r>
+          </w:p>
+        </w:tc>
+        <w:tc>
+          <w:tcPr/>
+          <w:p>
+            <w:pPr>
+              <w:pStyle w:val="BodyText"/>
+            </w:pPr>
+            <w:r>
+              <w:t xml:space="preserve">Myers, T. A., Roser-Renouf, C., &amp; Maibach, E. (2023). Emotional responses to climate change information and their effects on policy support.</w:t>
             </w:r>
             <w:r>
               <w:t xml:space="preserve"> </w:t>
@@ -1132,7 +1081,7 @@
                 <w:i/>
                 <w:iCs/>
               </w:rPr>
-              <w:t xml:space="preserve">Global Sustainability</w:t>
+              <w:t xml:space="preserve">Frontiers in Climate</w:t>
             </w:r>
             <w:r>
               <w:t xml:space="preserve">,</w:t>
@@ -1145,7 +1094,7 @@
                 <w:i/>
                 <w:iCs/>
               </w:rPr>
-              <w:t xml:space="preserve">3</w:t>
+              <w:t xml:space="preserve">5</w:t>
             </w:r>
             <w:r>
               <w:t xml:space="preserve">.</w:t>
@@ -1153,202 +1102,7 @@
             <w:r>
               <w:t xml:space="preserve"> </w:t>
             </w:r>
-            <w:hyperlink r:id="rId42">
-              <w:r>
-                <w:rPr>
-                  <w:rStyle w:val="Hyperlink"/>
-                </w:rPr>
-                <w:t xml:space="preserve">https://doi.org/10.1017/sus.2020.13</w:t>
-              </w:r>
-            </w:hyperlink>
-          </w:p>
-          <w:p>
-            <w:pPr>
-              <w:pStyle w:val="BodyText"/>
-            </w:pPr>
-            <w:r>
-              <w:t xml:space="preserve">Cook, J. (2020). Deconstructing climate science denial. In D. C. Holmes &amp; L. M. Richardson (Eds.),</w:t>
-            </w:r>
-            <w:r>
-              <w:t xml:space="preserve"> </w:t>
-            </w:r>
-            <w:r>
-              <w:rPr>
-                <w:i/>
-                <w:iCs/>
-              </w:rPr>
-              <w:t xml:space="preserve">Research Handbook on Communicating Climate Change</w:t>
-            </w:r>
-            <w:r>
-              <w:t xml:space="preserve">. Edward Elgar Publishing.</w:t>
-            </w:r>
-            <w:r>
-              <w:t xml:space="preserve"> </w:t>
-            </w:r>
-            <w:hyperlink r:id="rId43">
-              <w:r>
-                <w:rPr>
-                  <w:rStyle w:val="Hyperlink"/>
-                </w:rPr>
-                <w:t xml:space="preserve">https://doi.org/10.4337/9781789900408.00014</w:t>
-              </w:r>
-            </w:hyperlink>
-          </w:p>
-        </w:tc>
-      </w:tr>
-      <w:tr>
-        <w:tc>
-          <w:tcPr/>
-          <w:p>
-            <w:pPr>
-              <w:pStyle w:val="Compact"/>
-            </w:pPr>
-            <w:r>
-              <w:t xml:space="preserve">5</w:t>
-            </w:r>
-          </w:p>
-        </w:tc>
-        <w:tc>
-          <w:tcPr/>
-          <w:p>
-            <w:pPr>
-              <w:pStyle w:val="Compact"/>
-            </w:pPr>
-            <w:r>
-              <w:t xml:space="preserve">13.10.2026</w:t>
-            </w:r>
-          </w:p>
-        </w:tc>
-        <w:tc>
-          <w:tcPr/>
-          <w:p>
-            <w:pPr>
-              <w:pStyle w:val="BodyText"/>
-            </w:pPr>
-            <w:r>
-              <w:rPr>
-                <w:b/>
-                <w:bCs/>
-              </w:rPr>
-              <w:t xml:space="preserve">Climate change misinformation</w:t>
-            </w:r>
-            <w:r>
-              <w:t xml:space="preserve"> — Jan Pfänder</w:t>
-            </w:r>
-          </w:p>
-          <w:p>
-            <w:pPr>
-              <w:pStyle w:val="BodyText"/>
-            </w:pPr>
-            <w:r>
-              <w:t xml:space="preserve">What are discourses that delay action on climate change? How do you identify climate science denial and how do you respond to it?</w:t>
-            </w:r>
-          </w:p>
-        </w:tc>
-        <w:tc>
-          <w:tcPr/>
-          <w:p>
-            <w:pPr>
-              <w:pStyle w:val="BodyText"/>
-            </w:pPr>
-            <w:r>
-              <w:rPr>
-                <w:b/>
-                <w:bCs/>
-              </w:rPr>
-              <w:t xml:space="preserve">[TODO: template’s literature cell held only a guest-prep note — assign readings]</w:t>
-            </w:r>
-          </w:p>
-        </w:tc>
-      </w:tr>
-      <w:tr>
-        <w:tc>
-          <w:tcPr/>
-          <w:p>
-            <w:pPr>
-              <w:pStyle w:val="Compact"/>
-            </w:pPr>
-            <w:r>
-              <w:t xml:space="preserve">6</w:t>
-            </w:r>
-          </w:p>
-        </w:tc>
-        <w:tc>
-          <w:tcPr/>
-          <w:p>
-            <w:pPr>
-              <w:pStyle w:val="Compact"/>
-            </w:pPr>
-            <w:r>
-              <w:t xml:space="preserve">20.10.2026</w:t>
-            </w:r>
-          </w:p>
-        </w:tc>
-        <w:tc>
-          <w:tcPr/>
-          <w:p>
-            <w:pPr>
-              <w:pStyle w:val="BodyText"/>
-            </w:pPr>
-            <w:r>
-              <w:rPr>
-                <w:b/>
-                <w:bCs/>
-              </w:rPr>
-              <w:t xml:space="preserve">Emotions and behavior</w:t>
-            </w:r>
-            <w:r>
-              <w:t xml:space="preserve"> — [TODO: lecturer]</w:t>
-            </w:r>
-          </w:p>
-          <w:p>
-            <w:pPr>
-              <w:pStyle w:val="BodyText"/>
-            </w:pPr>
-            <w:r>
-              <w:t xml:space="preserve">What is the role of emotions in climate change communication? How can we communicate about climate change in a way that increases feelings of self-efficacy? How does media usage relate to behavioral intentions?</w:t>
-            </w:r>
-          </w:p>
-        </w:tc>
-        <w:tc>
-          <w:tcPr/>
-          <w:p>
-            <w:pPr>
-              <w:pStyle w:val="BodyText"/>
-            </w:pPr>
-            <w:r>
-              <w:t xml:space="preserve">Myers, T. A., Roser-Renouf, C., &amp; Maibach, E. (2023). Emotional responses to climate change information and their effects on policy support.</w:t>
-            </w:r>
-            <w:r>
-              <w:t xml:space="preserve"> </w:t>
-            </w:r>
-            <w:r>
-              <w:rPr>
-                <w:i/>
-                <w:iCs/>
-              </w:rPr>
-              <w:t xml:space="preserve">Frontiers in Climate</w:t>
-            </w:r>
-            <w:r>
-              <w:t xml:space="preserve">,</w:t>
-            </w:r>
-            <w:r>
-              <w:t xml:space="preserve"> </w:t>
-            </w:r>
-            <w:r>
-              <w:rPr>
-                <w:i/>
-                <w:iCs/>
-              </w:rPr>
-              <w:t xml:space="preserve">5</w:t>
-            </w:r>
-            <w:r>
-              <w:t xml:space="preserve">.</w:t>
-            </w:r>
-            <w:r>
-              <w:t xml:space="preserve"> </w:t>
-            </w:r>
-            <w:hyperlink r:id="rId44">
+            <w:hyperlink r:id="rId39">
               <w:r>
                 <w:rPr>
                   <w:rStyle w:val="Hyperlink"/>
@@ -1393,7 +1147,7 @@
             <w:r>
               <w:t xml:space="preserve"> </w:t>
             </w:r>
-            <w:hyperlink r:id="rId45">
+            <w:hyperlink r:id="rId40">
               <w:r>
                 <w:rPr>
                   <w:rStyle w:val="Hyperlink"/>
@@ -1438,7 +1192,7 @@
             <w:r>
               <w:t xml:space="preserve"> </w:t>
             </w:r>
-            <w:hyperlink r:id="rId46">
+            <w:hyperlink r:id="rId41">
               <w:r>
                 <w:rPr>
                   <w:rStyle w:val="Hyperlink"/>
@@ -1536,7 +1290,7 @@
             <w:r>
               <w:t xml:space="preserve"> </w:t>
             </w:r>
-            <w:hyperlink r:id="rId47">
+            <w:hyperlink r:id="rId42">
               <w:r>
                 <w:rPr>
                   <w:rStyle w:val="Hyperlink"/>
@@ -1581,7 +1335,7 @@
             <w:r>
               <w:t xml:space="preserve"> </w:t>
             </w:r>
-            <w:hyperlink r:id="rId48">
+            <w:hyperlink r:id="rId43">
               <w:r>
                 <w:rPr>
                   <w:rStyle w:val="Hyperlink"/>
@@ -1752,7 +1506,7 @@
             <w:r>
               <w:t xml:space="preserve"> </w:t>
             </w:r>
-            <w:hyperlink r:id="rId49">
+            <w:hyperlink r:id="rId44">
               <w:r>
                 <w:rPr>
                   <w:rStyle w:val="Hyperlink"/>
@@ -1797,7 +1551,7 @@
             <w:r>
               <w:t xml:space="preserve"> </w:t>
             </w:r>
-            <w:hyperlink r:id="rId50">
+            <w:hyperlink r:id="rId45">
               <w:r>
                 <w:rPr>
                   <w:rStyle w:val="Hyperlink"/>
@@ -1899,7 +1653,7 @@
             <w:r>
               <w:t xml:space="preserve"> </w:t>
             </w:r>
-            <w:hyperlink r:id="rId51">
+            <w:hyperlink r:id="rId46">
               <w:r>
                 <w:rPr>
                   <w:rStyle w:val="Hyperlink"/>
@@ -1965,7 +1719,7 @@
             <w:r>
               <w:t xml:space="preserve"> </w:t>
             </w:r>
-            <w:hyperlink r:id="rId52">
+            <w:hyperlink r:id="rId47">
               <w:r>
                 <w:rPr>
                   <w:rStyle w:val="Hyperlink"/>
@@ -2148,7 +1902,7 @@
             <w:r>
               <w:t xml:space="preserve"> </w:t>
             </w:r>
-            <w:hyperlink r:id="rId53">
+            <w:hyperlink r:id="rId48">
               <w:r>
                 <w:rPr>
                   <w:rStyle w:val="Hyperlink"/>
@@ -2287,26 +2041,6 @@
               <w:t xml:space="preserve"> — Viktoria Cologna &amp; Jan Pfänder</w:t>
             </w:r>
           </w:p>
-          <w:p>
-            <w:pPr>
-              <w:pStyle w:val="BodyText"/>
-            </w:pPr>
-            <w:r>
-              <w:rPr>
-                <w:b/>
-                <w:bCs/>
-              </w:rPr>
-              <w:t xml:space="preserve">[TODO: description below contains stale 2024 exam logistics — rewrite]</w:t>
-            </w:r>
-          </w:p>
-          <w:p>
-            <w:pPr>
-              <w:pStyle w:val="BodyText"/>
-            </w:pPr>
-            <w:r>
-              <w:t xml:space="preserve">The exam will take place on-site. The format of the exam (online or pen and paper) will be communicated at a later stage.</w:t>
-            </w:r>
-          </w:p>
         </w:tc>
         <w:tc>
           <w:tcPr/>
@@ -2318,7 +2052,7 @@
         </w:tc>
       </w:tr>
     </w:tbl>
-    <w:bookmarkEnd w:id="54"/>
+    <w:bookmarkEnd w:id="49"/>
     <w:sectPr>
       <w:footnotePr>
         <w:numRestart w:val="eachSect"/>
@@ -2651,9 +2385,6 @@
     </w:lvlOverride>
   </w:num>
   <w:num w:numId="1002">
-    <w:abstractNumId w:val="991"/>
-  </w:num>
-  <w:num w:numId="1003">
     <w:abstractNumId w:val="991"/>
   </w:num>
 </w:numbering>

</xml_diff>

<commit_message>
update syllabus and calendar
</commit_message>
<xml_diff>
--- a/docs/syllabus.docx
+++ b/docs/syllabus.docx
@@ -25,7 +25,7 @@
       <w:r>
         <w:drawing>
           <wp:inline>
-            <wp:extent cx="1047750" cy="1172854"/>
+            <wp:extent cx="1047750" cy="1204310"/>
             <wp:effectExtent b="0" l="0" r="0" t="0"/>
             <wp:docPr descr="" title="" id="21" name="Picture"/>
             <a:graphic>
@@ -46,7 +46,7 @@
                   <pic:spPr bwMode="auto">
                     <a:xfrm>
                       <a:off x="0" y="0"/>
-                      <a:ext cx="1047750" cy="1172854"/>
+                      <a:ext cx="1047750" cy="1204310"/>
                     </a:xfrm>
                     <a:prstGeom prst="rect">
                       <a:avLst/>
@@ -715,12 +715,185 @@
                 <w:b/>
                 <w:bCs/>
               </w:rPr>
-              <w:t xml:space="preserve">Guest speaker: Dr. Leonard Creutzburg</w:t>
-            </w:r>
-            <w:r>
-              <w:t xml:space="preserve"> — Invited speaker</w:t>
-            </w:r>
-          </w:p>
+              <w:t xml:space="preserve">Climate change emotions</w:t>
+            </w:r>
+            <w:r>
+              <w:t xml:space="preserve"> — Viktoria Cologna</w:t>
+            </w:r>
+          </w:p>
+          <w:p>
+            <w:pPr>
+              <w:pStyle w:val="BodyText"/>
+            </w:pPr>
+            <w:r>
+              <w:t xml:space="preserve">What is the role of emotions in climate change communication? How can we communicate about climate change in a way that increases feelings of self-efficacy? How does media usage relate to behavioral intentions?</w:t>
+            </w:r>
+          </w:p>
+        </w:tc>
+        <w:tc>
+          <w:tcPr/>
+          <w:p>
+            <w:pPr>
+              <w:pStyle w:val="BodyText"/>
+            </w:pPr>
+            <w:r>
+              <w:t xml:space="preserve">Myers, T. A., Roser-Renouf, C., &amp; Maibach, E. (2023). Emotional responses to climate change information and their effects on policy support.</w:t>
+            </w:r>
+            <w:r>
+              <w:t xml:space="preserve"> </w:t>
+            </w:r>
+            <w:r>
+              <w:rPr>
+                <w:i/>
+                <w:iCs/>
+              </w:rPr>
+              <w:t xml:space="preserve">Frontiers in Climate</w:t>
+            </w:r>
+            <w:r>
+              <w:t xml:space="preserve">,</w:t>
+            </w:r>
+            <w:r>
+              <w:t xml:space="preserve"> </w:t>
+            </w:r>
+            <w:r>
+              <w:rPr>
+                <w:i/>
+                <w:iCs/>
+              </w:rPr>
+              <w:t xml:space="preserve">5</w:t>
+            </w:r>
+            <w:r>
+              <w:t xml:space="preserve">.</w:t>
+            </w:r>
+            <w:r>
+              <w:t xml:space="preserve"> </w:t>
+            </w:r>
+            <w:hyperlink r:id="rId36">
+              <w:r>
+                <w:rPr>
+                  <w:rStyle w:val="Hyperlink"/>
+                </w:rPr>
+                <w:t xml:space="preserve">https://www.frontiersin.org/articles/10.3389/fclim.2023.1135450</w:t>
+              </w:r>
+            </w:hyperlink>
+          </w:p>
+          <w:p>
+            <w:pPr>
+              <w:pStyle w:val="BodyText"/>
+            </w:pPr>
+            <w:r>
+              <w:t xml:space="preserve">Ogunbode, C. A., Doran, R., Hanss, D., Ojala, M., Salmela-Aro, K., van den Broek, K. L., Bhullar, N., Aquino, S. D., Marot, T., Schermer, J. A., Wlodarczyk, A., Lu, S., Jiang, F., Maran, D. A., Yadav, R., Ardi, R., Chegeni, R., Ghanbarian, E., Zand, S., … Karasu, M. (2022). Climate anxiety, wellbeing and pro-environmental action: Correlates of negative emotional responses to climate change in 32 countries.</w:t>
+            </w:r>
+            <w:r>
+              <w:t xml:space="preserve"> </w:t>
+            </w:r>
+            <w:r>
+              <w:rPr>
+                <w:i/>
+                <w:iCs/>
+              </w:rPr>
+              <w:t xml:space="preserve">Journal of Environmental Psychology</w:t>
+            </w:r>
+            <w:r>
+              <w:t xml:space="preserve">,</w:t>
+            </w:r>
+            <w:r>
+              <w:t xml:space="preserve"> </w:t>
+            </w:r>
+            <w:r>
+              <w:rPr>
+                <w:i/>
+                <w:iCs/>
+              </w:rPr>
+              <w:t xml:space="preserve">84</w:t>
+            </w:r>
+            <w:r>
+              <w:t xml:space="preserve">, 101887.</w:t>
+            </w:r>
+            <w:r>
+              <w:t xml:space="preserve"> </w:t>
+            </w:r>
+            <w:hyperlink r:id="rId37">
+              <w:r>
+                <w:rPr>
+                  <w:rStyle w:val="Hyperlink"/>
+                </w:rPr>
+                <w:t xml:space="preserve">https://doi.org/10.1016/j.jenvp.2022.101887</w:t>
+              </w:r>
+            </w:hyperlink>
+          </w:p>
+          <w:p>
+            <w:pPr>
+              <w:pStyle w:val="BodyText"/>
+            </w:pPr>
+            <w:r>
+              <w:t xml:space="preserve">Stanley, S. K., Hogg, T. L., Leviston, Z., &amp; Walker, I. (2021). From anger to action: Differential impacts of eco-anxiety, eco-depression, and eco-anger on climate action and wellbeing.</w:t>
+            </w:r>
+            <w:r>
+              <w:t xml:space="preserve"> </w:t>
+            </w:r>
+            <w:r>
+              <w:rPr>
+                <w:i/>
+                <w:iCs/>
+              </w:rPr>
+              <w:t xml:space="preserve">The Journal of Climate Change and Health</w:t>
+            </w:r>
+            <w:r>
+              <w:t xml:space="preserve">,</w:t>
+            </w:r>
+            <w:r>
+              <w:t xml:space="preserve"> </w:t>
+            </w:r>
+            <w:r>
+              <w:rPr>
+                <w:i/>
+                <w:iCs/>
+              </w:rPr>
+              <w:t xml:space="preserve">1</w:t>
+            </w:r>
+            <w:r>
+              <w:t xml:space="preserve">, 100003.</w:t>
+            </w:r>
+            <w:r>
+              <w:t xml:space="preserve"> </w:t>
+            </w:r>
+            <w:hyperlink r:id="rId38">
+              <w:r>
+                <w:rPr>
+                  <w:rStyle w:val="Hyperlink"/>
+                </w:rPr>
+                <w:t xml:space="preserve">https://doi.org/10.1016/j.joclim.2021.100003</w:t>
+              </w:r>
+            </w:hyperlink>
+          </w:p>
+        </w:tc>
+      </w:tr>
+      <w:tr>
+        <w:tc>
+          <w:tcPr/>
+          <w:p>
+            <w:pPr>
+              <w:pStyle w:val="Compact"/>
+            </w:pPr>
+            <w:r>
+              <w:t xml:space="preserve">4</w:t>
+            </w:r>
+          </w:p>
+        </w:tc>
+        <w:tc>
+          <w:tcPr/>
+          <w:p>
+            <w:pPr>
+              <w:pStyle w:val="Compact"/>
+            </w:pPr>
+            <w:r>
+              <w:t xml:space="preserve">06.10.2026</w:t>
+            </w:r>
+          </w:p>
+        </w:tc>
+        <w:tc>
+          <w:tcPr/>
           <w:p>
             <w:pPr>
               <w:pStyle w:val="BodyText"/>
@@ -730,32 +903,23 @@
                 <w:b/>
                 <w:bCs/>
               </w:rPr>
-              <w:t xml:space="preserve">[TODO: rewrite for the actual speaker]</w:t>
-            </w:r>
-          </w:p>
-          <w:p>
-            <w:pPr>
-              <w:pStyle w:val="BodyText"/>
-            </w:pPr>
-            <w:r>
-              <w:t xml:space="preserve">Dr. Lydia Ebersbach is media relations manager at WWF Switzerland. She holds a Magister in History, Politics and Economics from Potsdam University, a PhD in Marketing from St. Gallen University and completed a CAS in Storytelling and Brand Journalism at MAZ / HSL. She will talk to us about the challenges of climate communication from the perspective of a Swiss NGO.</w:t>
-            </w:r>
-          </w:p>
-        </w:tc>
-        <w:tc>
-          <w:tcPr/>
-          <w:p>
-            <w:pPr>
-              <w:pStyle w:val="BodyText"/>
-            </w:pPr>
-            <w:r>
-              <w:rPr>
-                <w:b/>
-                <w:bCs/>
-              </w:rPr>
-              <w:t xml:space="preserve">[TODO: framing literature listed here in the template likely belongs to session 4]</w:t>
-            </w:r>
-          </w:p>
+              <w:t xml:space="preserve">Mental models and framing</w:t>
+            </w:r>
+            <w:r>
+              <w:t xml:space="preserve"> — Jan Pfänder</w:t>
+            </w:r>
+          </w:p>
+          <w:p>
+            <w:pPr>
+              <w:pStyle w:val="BodyText"/>
+            </w:pPr>
+            <w:r>
+              <w:t xml:space="preserve">What are mental models? Which frames are used in climate change communication? How can we frame climate change in a way that allows us to reach different population groups? What are the strategies, channels, and messages used by different stakeholders?</w:t>
+            </w:r>
+          </w:p>
+        </w:tc>
+        <w:tc>
+          <w:tcPr/>
           <w:p>
             <w:pPr>
               <w:pStyle w:val="BodyText"/>
@@ -792,7 +956,7 @@
             <w:r>
               <w:t xml:space="preserve"> </w:t>
             </w:r>
-            <w:hyperlink r:id="rId36">
+            <w:hyperlink r:id="rId39">
               <w:r>
                 <w:rPr>
                   <w:rStyle w:val="Hyperlink"/>
@@ -837,7 +1001,7 @@
             <w:r>
               <w:t xml:space="preserve"> </w:t>
             </w:r>
-            <w:hyperlink r:id="rId37">
+            <w:hyperlink r:id="rId40">
               <w:r>
                 <w:rPr>
                   <w:rStyle w:val="Hyperlink"/>
@@ -882,7 +1046,7 @@
             <w:r>
               <w:t xml:space="preserve"> </w:t>
             </w:r>
-            <w:hyperlink r:id="rId38">
+            <w:hyperlink r:id="rId41">
               <w:r>
                 <w:rPr>
                   <w:rStyle w:val="Hyperlink"/>
@@ -901,7 +1065,7 @@
               <w:pStyle w:val="Compact"/>
             </w:pPr>
             <w:r>
-              <w:t xml:space="preserve">4</w:t>
+              <w:t xml:space="preserve">5</w:t>
             </w:r>
           </w:p>
         </w:tc>
@@ -912,7 +1076,7 @@
               <w:pStyle w:val="Compact"/>
             </w:pPr>
             <w:r>
-              <w:t xml:space="preserve">06.10.2026</w:t>
+              <w:t xml:space="preserve">13.10.2026</w:t>
             </w:r>
           </w:p>
         </w:tc>
@@ -927,320 +1091,10 @@
                 <w:b/>
                 <w:bCs/>
               </w:rPr>
-              <w:t xml:space="preserve">Mental models and framing</w:t>
-            </w:r>
-            <w:r>
-              <w:t xml:space="preserve"> — Jan Pfänder</w:t>
-            </w:r>
-          </w:p>
-          <w:p>
-            <w:pPr>
-              <w:pStyle w:val="BodyText"/>
-            </w:pPr>
-            <w:r>
-              <w:t xml:space="preserve">What are mental models? Which frames are used in climate change communication? How can we frame climate change in a way that allows us to reach different population groups? What are the strategies, channels, and messages used by different stakeholders?</w:t>
-            </w:r>
-          </w:p>
-        </w:tc>
-        <w:tc>
-          <w:tcPr/>
-          <w:p>
-            <w:pPr>
-              <w:pStyle w:val="BodyText"/>
-            </w:pPr>
-            <w:r>
-              <w:t xml:space="preserve">tbd</w:t>
-            </w:r>
-          </w:p>
-        </w:tc>
-      </w:tr>
-      <w:tr>
-        <w:tc>
-          <w:tcPr/>
-          <w:p>
-            <w:pPr>
-              <w:pStyle w:val="Compact"/>
-            </w:pPr>
-            <w:r>
-              <w:t xml:space="preserve">5</w:t>
-            </w:r>
-          </w:p>
-        </w:tc>
-        <w:tc>
-          <w:tcPr/>
-          <w:p>
-            <w:pPr>
-              <w:pStyle w:val="Compact"/>
-            </w:pPr>
-            <w:r>
-              <w:t xml:space="preserve">13.10.2026</w:t>
-            </w:r>
-          </w:p>
-        </w:tc>
-        <w:tc>
-          <w:tcPr/>
-          <w:p>
-            <w:pPr>
-              <w:pStyle w:val="BodyText"/>
-            </w:pPr>
-            <w:r>
-              <w:rPr>
-                <w:b/>
-                <w:bCs/>
-              </w:rPr>
-              <w:t xml:space="preserve">Climate change misinformation</w:t>
-            </w:r>
-            <w:r>
-              <w:t xml:space="preserve"> — Jan Pfänder</w:t>
-            </w:r>
-          </w:p>
-          <w:p>
-            <w:pPr>
-              <w:pStyle w:val="BodyText"/>
-            </w:pPr>
-            <w:r>
-              <w:t xml:space="preserve">What are discourses that delay action on climate change? How do you identify climate science denial and how do you respond to it?</w:t>
-            </w:r>
-          </w:p>
-        </w:tc>
-        <w:tc>
-          <w:tcPr/>
-          <w:p>
-            <w:pPr>
-              <w:pStyle w:val="BodyText"/>
-            </w:pPr>
-            <w:r>
-              <w:t xml:space="preserve">tbd</w:t>
-            </w:r>
-          </w:p>
-        </w:tc>
-      </w:tr>
-      <w:tr>
-        <w:tc>
-          <w:tcPr/>
-          <w:p>
-            <w:pPr>
-              <w:pStyle w:val="Compact"/>
-            </w:pPr>
-            <w:r>
-              <w:t xml:space="preserve">6</w:t>
-            </w:r>
-          </w:p>
-        </w:tc>
-        <w:tc>
-          <w:tcPr/>
-          <w:p>
-            <w:pPr>
-              <w:pStyle w:val="Compact"/>
-            </w:pPr>
-            <w:r>
-              <w:t xml:space="preserve">20.10.2026</w:t>
-            </w:r>
-          </w:p>
-        </w:tc>
-        <w:tc>
-          <w:tcPr/>
-          <w:p>
-            <w:pPr>
-              <w:pStyle w:val="BodyText"/>
-            </w:pPr>
-            <w:r>
-              <w:rPr>
-                <w:b/>
-                <w:bCs/>
-              </w:rPr>
-              <w:t xml:space="preserve">Emotions and behavior</w:t>
-            </w:r>
-            <w:r>
-              <w:t xml:space="preserve"> — [TODO: lecturer]</w:t>
-            </w:r>
-          </w:p>
-          <w:p>
-            <w:pPr>
-              <w:pStyle w:val="BodyText"/>
-            </w:pPr>
-            <w:r>
-              <w:t xml:space="preserve">What is the role of emotions in climate change communication? How can we communicate about climate change in a way that increases feelings of self-efficacy? How does media usage relate to behavioral intentions?</w:t>
-            </w:r>
-          </w:p>
-        </w:tc>
-        <w:tc>
-          <w:tcPr/>
-          <w:p>
-            <w:pPr>
-              <w:pStyle w:val="BodyText"/>
-            </w:pPr>
-            <w:r>
-              <w:t xml:space="preserve">Myers, T. A., Roser-Renouf, C., &amp; Maibach, E. (2023). Emotional responses to climate change information and their effects on policy support.</w:t>
-            </w:r>
-            <w:r>
-              <w:t xml:space="preserve"> </w:t>
-            </w:r>
-            <w:r>
-              <w:rPr>
-                <w:i/>
-                <w:iCs/>
-              </w:rPr>
-              <w:t xml:space="preserve">Frontiers in Climate</w:t>
-            </w:r>
-            <w:r>
-              <w:t xml:space="preserve">,</w:t>
-            </w:r>
-            <w:r>
-              <w:t xml:space="preserve"> </w:t>
-            </w:r>
-            <w:r>
-              <w:rPr>
-                <w:i/>
-                <w:iCs/>
-              </w:rPr>
-              <w:t xml:space="preserve">5</w:t>
-            </w:r>
-            <w:r>
-              <w:t xml:space="preserve">.</w:t>
-            </w:r>
-            <w:r>
-              <w:t xml:space="preserve"> </w:t>
-            </w:r>
-            <w:hyperlink r:id="rId39">
-              <w:r>
-                <w:rPr>
-                  <w:rStyle w:val="Hyperlink"/>
-                </w:rPr>
-                <w:t xml:space="preserve">https://www.frontiersin.org/articles/10.3389/fclim.2023.1135450</w:t>
-              </w:r>
-            </w:hyperlink>
-          </w:p>
-          <w:p>
-            <w:pPr>
-              <w:pStyle w:val="BodyText"/>
-            </w:pPr>
-            <w:r>
-              <w:t xml:space="preserve">Ogunbode, C. A., Doran, R., Hanss, D., Ojala, M., Salmela-Aro, K., van den Broek, K. L., Bhullar, N., Aquino, S. D., Marot, T., Schermer, J. A., Wlodarczyk, A., Lu, S., Jiang, F., Maran, D. A., Yadav, R., Ardi, R., Chegeni, R., Ghanbarian, E., Zand, S., … Karasu, M. (2022). Climate anxiety, wellbeing and pro-environmental action: Correlates of negative emotional responses to climate change in 32 countries.</w:t>
-            </w:r>
-            <w:r>
-              <w:t xml:space="preserve"> </w:t>
-            </w:r>
-            <w:r>
-              <w:rPr>
-                <w:i/>
-                <w:iCs/>
-              </w:rPr>
-              <w:t xml:space="preserve">Journal of Environmental Psychology</w:t>
-            </w:r>
-            <w:r>
-              <w:t xml:space="preserve">,</w:t>
-            </w:r>
-            <w:r>
-              <w:t xml:space="preserve"> </w:t>
-            </w:r>
-            <w:r>
-              <w:rPr>
-                <w:i/>
-                <w:iCs/>
-              </w:rPr>
-              <w:t xml:space="preserve">84</w:t>
-            </w:r>
-            <w:r>
-              <w:t xml:space="preserve">, 101887.</w:t>
-            </w:r>
-            <w:r>
-              <w:t xml:space="preserve"> </w:t>
-            </w:r>
-            <w:hyperlink r:id="rId40">
-              <w:r>
-                <w:rPr>
-                  <w:rStyle w:val="Hyperlink"/>
-                </w:rPr>
-                <w:t xml:space="preserve">https://doi.org/10.1016/j.jenvp.2022.101887</w:t>
-              </w:r>
-            </w:hyperlink>
-          </w:p>
-          <w:p>
-            <w:pPr>
-              <w:pStyle w:val="BodyText"/>
-            </w:pPr>
-            <w:r>
-              <w:t xml:space="preserve">Stanley, S. K., Hogg, T. L., Leviston, Z., &amp; Walker, I. (2021). From anger to action: Differential impacts of eco-anxiety, eco-depression, and eco-anger on climate action and wellbeing.</w:t>
-            </w:r>
-            <w:r>
-              <w:t xml:space="preserve"> </w:t>
-            </w:r>
-            <w:r>
-              <w:rPr>
-                <w:i/>
-                <w:iCs/>
-              </w:rPr>
-              <w:t xml:space="preserve">The Journal of Climate Change and Health</w:t>
-            </w:r>
-            <w:r>
-              <w:t xml:space="preserve">,</w:t>
-            </w:r>
-            <w:r>
-              <w:t xml:space="preserve"> </w:t>
-            </w:r>
-            <w:r>
-              <w:rPr>
-                <w:i/>
-                <w:iCs/>
-              </w:rPr>
-              <w:t xml:space="preserve">1</w:t>
-            </w:r>
-            <w:r>
-              <w:t xml:space="preserve">, 100003.</w:t>
-            </w:r>
-            <w:r>
-              <w:t xml:space="preserve"> </w:t>
-            </w:r>
-            <w:hyperlink r:id="rId41">
-              <w:r>
-                <w:rPr>
-                  <w:rStyle w:val="Hyperlink"/>
-                </w:rPr>
-                <w:t xml:space="preserve">https://doi.org/10.1016/j.joclim.2021.100003</w:t>
-              </w:r>
-            </w:hyperlink>
-          </w:p>
-        </w:tc>
-      </w:tr>
-      <w:tr>
-        <w:tc>
-          <w:tcPr/>
-          <w:p>
-            <w:pPr>
-              <w:pStyle w:val="Compact"/>
-            </w:pPr>
-            <w:r>
-              <w:t xml:space="preserve">7</w:t>
-            </w:r>
-          </w:p>
-        </w:tc>
-        <w:tc>
-          <w:tcPr/>
-          <w:p>
-            <w:pPr>
-              <w:pStyle w:val="Compact"/>
-            </w:pPr>
-            <w:r>
-              <w:t xml:space="preserve">27.10.2026</w:t>
-            </w:r>
-          </w:p>
-        </w:tc>
-        <w:tc>
-          <w:tcPr/>
-          <w:p>
-            <w:pPr>
-              <w:pStyle w:val="BodyText"/>
-            </w:pPr>
-            <w:r>
-              <w:rPr>
-                <w:b/>
-                <w:bCs/>
-              </w:rPr>
               <w:t xml:space="preserve">A question of trust</w:t>
             </w:r>
             <w:r>
-              <w:t xml:space="preserve"> — [TODO: lecturer]</w:t>
+              <w:t xml:space="preserve"> — Viktoria Cologna</w:t>
             </w:r>
           </w:p>
           <w:p>
@@ -1354,7 +1208,7 @@
               <w:pStyle w:val="Compact"/>
             </w:pPr>
             <w:r>
-              <w:t xml:space="preserve">8</w:t>
+              <w:t xml:space="preserve">6</w:t>
             </w:r>
           </w:p>
         </w:tc>
@@ -1365,7 +1219,7 @@
               <w:pStyle w:val="Compact"/>
             </w:pPr>
             <w:r>
-              <w:t xml:space="preserve">03.11.2026</w:t>
+              <w:t xml:space="preserve">20.10.2026</w:t>
             </w:r>
           </w:p>
         </w:tc>
@@ -1391,19 +1245,72 @@
               <w:pStyle w:val="BodyText"/>
             </w:pPr>
             <w:r>
+              <w:t xml:space="preserve">Dr. Cornelia Schwierz is Head of Climate Monitoring and Information at the Federal Office of Meteorology and Climatology (MeteoSwiss). In her talk, she will tell us about the challenges the Federal Office faces in communicating about climate change and how they overcome them.</w:t>
+            </w:r>
+          </w:p>
+        </w:tc>
+        <w:tc>
+          <w:tcPr/>
+          <w:p>
+            <w:pPr>
+              <w:pStyle w:val="BodyText"/>
+            </w:pPr>
+            <w:r>
+              <w:t xml:space="preserve">Preparation: Come to class with at least 3 questions for our guest speaker.</w:t>
+            </w:r>
+          </w:p>
+        </w:tc>
+      </w:tr>
+      <w:tr>
+        <w:tc>
+          <w:tcPr/>
+          <w:p>
+            <w:pPr>
+              <w:pStyle w:val="Compact"/>
+            </w:pPr>
+            <w:r>
+              <w:t xml:space="preserve">7</w:t>
+            </w:r>
+          </w:p>
+        </w:tc>
+        <w:tc>
+          <w:tcPr/>
+          <w:p>
+            <w:pPr>
+              <w:pStyle w:val="Compact"/>
+            </w:pPr>
+            <w:r>
+              <w:t xml:space="preserve">27.10.2026</w:t>
+            </w:r>
+          </w:p>
+        </w:tc>
+        <w:tc>
+          <w:tcPr/>
+          <w:p>
+            <w:pPr>
+              <w:pStyle w:val="BodyText"/>
+            </w:pPr>
+            <w:r>
               <w:rPr>
                 <w:b/>
                 <w:bCs/>
               </w:rPr>
-              <w:t xml:space="preserve">[TODO: confirm speaker still current]</w:t>
-            </w:r>
-          </w:p>
-          <w:p>
-            <w:pPr>
-              <w:pStyle w:val="BodyText"/>
-            </w:pPr>
-            <w:r>
-              <w:t xml:space="preserve">Dr. Cornelia Schwierz is Head of Climate Monitoring and Information at the Federal Office of Meteorology and Climatology (MeteoSwiss). In her talk, she will tell us about the challenges the Federal Office faces in communicating about climate change and how they overcome them.</w:t>
+              <w:t xml:space="preserve">Guest speaker: Dr. Reto Knutti</w:t>
+            </w:r>
+            <w:r>
+              <w:t xml:space="preserve"> — Invited speaker</w:t>
+            </w:r>
+          </w:p>
+          <w:p>
+            <w:pPr>
+              <w:pStyle w:val="BodyText"/>
+            </w:pPr>
+            <w:r>
+              <w:rPr>
+                <w:b/>
+                <w:bCs/>
+              </w:rPr>
+              <w:t xml:space="preserve">[TODO: speaker blurb]</w:t>
             </w:r>
           </w:p>
         </w:tc>
@@ -1427,7 +1334,7 @@
               <w:pStyle w:val="Compact"/>
             </w:pPr>
             <w:r>
-              <w:t xml:space="preserve">9</w:t>
+              <w:t xml:space="preserve">8</w:t>
             </w:r>
           </w:p>
         </w:tc>
@@ -1438,7 +1345,7 @@
               <w:pStyle w:val="Compact"/>
             </w:pPr>
             <w:r>
-              <w:t xml:space="preserve">10.11.2026</w:t>
+              <w:t xml:space="preserve">03.11.2026</w:t>
             </w:r>
           </w:p>
         </w:tc>
@@ -1453,7 +1360,7 @@
                 <w:b/>
                 <w:bCs/>
               </w:rPr>
-              <w:t xml:space="preserve">Climate change in the media</w:t>
+              <w:t xml:space="preserve">Climate change in news and social media</w:t>
             </w:r>
             <w:r>
               <w:t xml:space="preserve"> — Viktoria Cologna</w:t>
@@ -1560,63 +1467,6 @@
               </w:r>
             </w:hyperlink>
           </w:p>
-        </w:tc>
-      </w:tr>
-      <w:tr>
-        <w:tc>
-          <w:tcPr/>
-          <w:p>
-            <w:pPr>
-              <w:pStyle w:val="Compact"/>
-            </w:pPr>
-            <w:r>
-              <w:t xml:space="preserve">10</w:t>
-            </w:r>
-          </w:p>
-        </w:tc>
-        <w:tc>
-          <w:tcPr/>
-          <w:p>
-            <w:pPr>
-              <w:pStyle w:val="Compact"/>
-            </w:pPr>
-            <w:r>
-              <w:t xml:space="preserve">17.11.2026</w:t>
-            </w:r>
-          </w:p>
-        </w:tc>
-        <w:tc>
-          <w:tcPr/>
-          <w:p>
-            <w:pPr>
-              <w:pStyle w:val="BodyText"/>
-            </w:pPr>
-            <w:r>
-              <w:rPr>
-                <w:b/>
-                <w:bCs/>
-              </w:rPr>
-              <w:t xml:space="preserve">MISSING</w:t>
-            </w:r>
-            <w:r>
-              <w:t xml:space="preserve"> — [TODO: lecturer]</w:t>
-            </w:r>
-          </w:p>
-          <w:p>
-            <w:pPr>
-              <w:pStyle w:val="BodyText"/>
-            </w:pPr>
-            <w:r>
-              <w:rPr>
-                <w:b/>
-                <w:bCs/>
-              </w:rPr>
-              <w:t xml:space="preserve">[TODO: topic missing in the template — define this session]</w:t>
-            </w:r>
-          </w:p>
-        </w:tc>
-        <w:tc>
-          <w:tcPr/>
           <w:p>
             <w:pPr>
               <w:pStyle w:val="BodyText"/>
@@ -1738,7 +1588,7 @@
               <w:pStyle w:val="Compact"/>
             </w:pPr>
             <w:r>
-              <w:t xml:space="preserve">11</w:t>
+              <w:t xml:space="preserve">9</w:t>
             </w:r>
           </w:p>
         </w:tc>
@@ -1749,7 +1599,7 @@
               <w:pStyle w:val="Compact"/>
             </w:pPr>
             <w:r>
-              <w:t xml:space="preserve">24.11.2026</w:t>
+              <w:t xml:space="preserve">10.11.2026</w:t>
             </w:r>
           </w:p>
         </w:tc>
@@ -1764,12 +1614,58 @@
                 <w:b/>
                 <w:bCs/>
               </w:rPr>
-              <w:t xml:space="preserve">Guest speaker: Cornelia Eisenach</w:t>
-            </w:r>
-            <w:r>
-              <w:t xml:space="preserve"> — Invited speaker</w:t>
-            </w:r>
-          </w:p>
+              <w:t xml:space="preserve">Climate change misinformation</w:t>
+            </w:r>
+            <w:r>
+              <w:t xml:space="preserve"> — Jan Pfänder</w:t>
+            </w:r>
+          </w:p>
+          <w:p>
+            <w:pPr>
+              <w:pStyle w:val="BodyText"/>
+            </w:pPr>
+            <w:r>
+              <w:t xml:space="preserve">What are discourses that delay action on climate change? How do you identify climate science denial and how do you respond to it?</w:t>
+            </w:r>
+          </w:p>
+        </w:tc>
+        <w:tc>
+          <w:tcPr/>
+          <w:p>
+            <w:pPr>
+              <w:pStyle w:val="BodyText"/>
+            </w:pPr>
+            <w:r>
+              <w:t xml:space="preserve">tbd</w:t>
+            </w:r>
+          </w:p>
+        </w:tc>
+      </w:tr>
+      <w:tr>
+        <w:tc>
+          <w:tcPr/>
+          <w:p>
+            <w:pPr>
+              <w:pStyle w:val="Compact"/>
+            </w:pPr>
+            <w:r>
+              <w:t xml:space="preserve">10</w:t>
+            </w:r>
+          </w:p>
+        </w:tc>
+        <w:tc>
+          <w:tcPr/>
+          <w:p>
+            <w:pPr>
+              <w:pStyle w:val="Compact"/>
+            </w:pPr>
+            <w:r>
+              <w:t xml:space="preserve">17.11.2026</w:t>
+            </w:r>
+          </w:p>
+        </w:tc>
+        <w:tc>
+          <w:tcPr/>
           <w:p>
             <w:pPr>
               <w:pStyle w:val="BodyText"/>
@@ -1779,15 +1675,22 @@
                 <w:b/>
                 <w:bCs/>
               </w:rPr>
-              <w:t xml:space="preserve">[TODO: blurb below describes a different person (Sabrina Weiss) — rewrite for the actual speaker]</w:t>
-            </w:r>
-          </w:p>
-          <w:p>
-            <w:pPr>
-              <w:pStyle w:val="BodyText"/>
-            </w:pPr>
-            <w:r>
-              <w:t xml:space="preserve">Sabrina Weiss is a Swiss climate journalist. She holds a BA in Media &amp; Communication Sciences from the University of Zurich and an MSc in Communication Psychology from the London School of Economics and Political Science. Sabrina Weiss is the co-founder of the Climate Journalism Network. In her talk, she will tell us about the challenges of climate change communication in journalism and how to overcome them.</w:t>
+              <w:t xml:space="preserve">Guest speaker: Dr. Leonard Creutzburg</w:t>
+            </w:r>
+            <w:r>
+              <w:t xml:space="preserve"> — Invited speaker</w:t>
+            </w:r>
+          </w:p>
+          <w:p>
+            <w:pPr>
+              <w:pStyle w:val="BodyText"/>
+            </w:pPr>
+            <w:r>
+              <w:rPr>
+                <w:b/>
+                <w:bCs/>
+              </w:rPr>
+              <w:t xml:space="preserve">[TODO: speaker blurb]</w:t>
             </w:r>
           </w:p>
         </w:tc>
@@ -1811,7 +1714,7 @@
               <w:pStyle w:val="Compact"/>
             </w:pPr>
             <w:r>
-              <w:t xml:space="preserve">12</w:t>
+              <w:t xml:space="preserve">11</w:t>
             </w:r>
           </w:p>
         </w:tc>
@@ -1822,7 +1725,7 @@
               <w:pStyle w:val="Compact"/>
             </w:pPr>
             <w:r>
-              <w:t xml:space="preserve">01.12.2026</w:t>
+              <w:t xml:space="preserve">24.11.2026</w:t>
             </w:r>
           </w:p>
         </w:tc>
@@ -1837,10 +1740,10 @@
                 <w:b/>
                 <w:bCs/>
               </w:rPr>
-              <w:t xml:space="preserve">Guest speaker: Reto Knutti</w:t>
-            </w:r>
-            <w:r>
-              <w:t xml:space="preserve"> — Invited speaker</w:t>
+              <w:t xml:space="preserve">TBD</w:t>
+            </w:r>
+            <w:r>
+              <w:t xml:space="preserve"> — Jan Pfänder</w:t>
             </w:r>
           </w:p>
           <w:p>
@@ -1852,15 +1755,198 @@
                 <w:b/>
                 <w:bCs/>
               </w:rPr>
-              <w:t xml:space="preserve">[TODO: description below is a wrap-up summary from the old course, not a speaker blurb — rewrite]</w:t>
-            </w:r>
-          </w:p>
-          <w:p>
-            <w:pPr>
-              <w:pStyle w:val="BodyText"/>
-            </w:pPr>
-            <w:r>
-              <w:t xml:space="preserve">Based on what we have learned in the previous weeks, we will summarize and discuss successful communication strategies.</w:t>
+              <w:t xml:space="preserve">[TODO: topic]</w:t>
+            </w:r>
+          </w:p>
+        </w:tc>
+        <w:tc>
+          <w:tcPr/>
+          <w:p>
+            <w:pPr>
+              <w:pStyle w:val="BodyText"/>
+            </w:pPr>
+            <w:r>
+              <w:t xml:space="preserve">tbd</w:t>
+            </w:r>
+          </w:p>
+        </w:tc>
+      </w:tr>
+      <w:tr>
+        <w:tc>
+          <w:tcPr/>
+          <w:p>
+            <w:pPr>
+              <w:pStyle w:val="Compact"/>
+            </w:pPr>
+            <w:r>
+              <w:t xml:space="preserve">12</w:t>
+            </w:r>
+          </w:p>
+        </w:tc>
+        <w:tc>
+          <w:tcPr/>
+          <w:p>
+            <w:pPr>
+              <w:pStyle w:val="Compact"/>
+            </w:pPr>
+            <w:r>
+              <w:t xml:space="preserve">01.12.2026</w:t>
+            </w:r>
+          </w:p>
+        </w:tc>
+        <w:tc>
+          <w:tcPr/>
+          <w:p>
+            <w:pPr>
+              <w:pStyle w:val="BodyText"/>
+            </w:pPr>
+            <w:r>
+              <w:rPr>
+                <w:b/>
+                <w:bCs/>
+              </w:rPr>
+              <w:t xml:space="preserve">Guest speaker: Dr. Cornelia Staub</w:t>
+            </w:r>
+            <w:r>
+              <w:t xml:space="preserve"> — Invited speaker</w:t>
+            </w:r>
+          </w:p>
+          <w:p>
+            <w:pPr>
+              <w:pStyle w:val="BodyText"/>
+            </w:pPr>
+            <w:r>
+              <w:rPr>
+                <w:b/>
+                <w:bCs/>
+              </w:rPr>
+              <w:t xml:space="preserve">[TODO: speaker blurb]</w:t>
+            </w:r>
+          </w:p>
+        </w:tc>
+        <w:tc>
+          <w:tcPr/>
+          <w:p>
+            <w:pPr>
+              <w:pStyle w:val="BodyText"/>
+            </w:pPr>
+            <w:r>
+              <w:t xml:space="preserve">Preparation: Come to class with at least 3 questions for our guest speaker.</w:t>
+            </w:r>
+          </w:p>
+        </w:tc>
+      </w:tr>
+      <w:tr>
+        <w:tc>
+          <w:tcPr/>
+          <w:p>
+            <w:pPr>
+              <w:pStyle w:val="Compact"/>
+            </w:pPr>
+            <w:r>
+              <w:t xml:space="preserve">13</w:t>
+            </w:r>
+          </w:p>
+        </w:tc>
+        <w:tc>
+          <w:tcPr/>
+          <w:p>
+            <w:pPr>
+              <w:pStyle w:val="Compact"/>
+            </w:pPr>
+            <w:r>
+              <w:t xml:space="preserve">08.12.2026</w:t>
+            </w:r>
+          </w:p>
+        </w:tc>
+        <w:tc>
+          <w:tcPr/>
+          <w:p>
+            <w:pPr>
+              <w:pStyle w:val="BodyText"/>
+            </w:pPr>
+            <w:r>
+              <w:rPr>
+                <w:b/>
+                <w:bCs/>
+              </w:rPr>
+              <w:t xml:space="preserve">Guest speaker: Dr. Cornelia Eisenach</w:t>
+            </w:r>
+            <w:r>
+              <w:t xml:space="preserve"> — Invited speaker</w:t>
+            </w:r>
+          </w:p>
+          <w:p>
+            <w:pPr>
+              <w:pStyle w:val="BodyText"/>
+            </w:pPr>
+            <w:r>
+              <w:rPr>
+                <w:b/>
+                <w:bCs/>
+              </w:rPr>
+              <w:t xml:space="preserve">[TODO: speaker blurb]</w:t>
+            </w:r>
+          </w:p>
+        </w:tc>
+        <w:tc>
+          <w:tcPr/>
+          <w:p>
+            <w:pPr>
+              <w:pStyle w:val="BodyText"/>
+            </w:pPr>
+            <w:r>
+              <w:t xml:space="preserve">Preparation: Come to class with at least 3 questions for our guest speaker.</w:t>
+            </w:r>
+          </w:p>
+        </w:tc>
+      </w:tr>
+      <w:tr>
+        <w:tc>
+          <w:tcPr/>
+          <w:p>
+            <w:pPr>
+              <w:pStyle w:val="Compact"/>
+            </w:pPr>
+            <w:r>
+              <w:t xml:space="preserve">14</w:t>
+            </w:r>
+          </w:p>
+        </w:tc>
+        <w:tc>
+          <w:tcPr/>
+          <w:p>
+            <w:pPr>
+              <w:pStyle w:val="Compact"/>
+            </w:pPr>
+            <w:r>
+              <w:t xml:space="preserve">15.12.2026</w:t>
+            </w:r>
+          </w:p>
+        </w:tc>
+        <w:tc>
+          <w:tcPr/>
+          <w:p>
+            <w:pPr>
+              <w:pStyle w:val="BodyText"/>
+            </w:pPr>
+            <w:r>
+              <w:rPr>
+                <w:b/>
+                <w:bCs/>
+              </w:rPr>
+              <w:t xml:space="preserve">Discussion and lessons learnt</w:t>
+            </w:r>
+            <w:r>
+              <w:t xml:space="preserve"> — Viktoria Cologna &amp; Jan Pfänder</w:t>
+            </w:r>
+          </w:p>
+          <w:p>
+            <w:pPr>
+              <w:pStyle w:val="BodyText"/>
+            </w:pPr>
+            <w:r>
+              <w:t xml:space="preserve">Based on what we have learned in the previous weeks, we will summarize and discuss successful communication strategies, and reflect on the contributions by our guest speakers and how they relate to what we have learned in the previous sessions.</w:t>
             </w:r>
           </w:p>
         </w:tc>
@@ -1928,126 +2014,6 @@
               </w:rPr>
               <w:t xml:space="preserve">[TODO: full citation missing from template’s reference list]</w:t>
             </w:r>
-          </w:p>
-        </w:tc>
-      </w:tr>
-      <w:tr>
-        <w:tc>
-          <w:tcPr/>
-          <w:p>
-            <w:pPr>
-              <w:pStyle w:val="Compact"/>
-            </w:pPr>
-            <w:r>
-              <w:t xml:space="preserve">13</w:t>
-            </w:r>
-          </w:p>
-        </w:tc>
-        <w:tc>
-          <w:tcPr/>
-          <w:p>
-            <w:pPr>
-              <w:pStyle w:val="Compact"/>
-            </w:pPr>
-            <w:r>
-              <w:t xml:space="preserve">08.12.2026</w:t>
-            </w:r>
-          </w:p>
-        </w:tc>
-        <w:tc>
-          <w:tcPr/>
-          <w:p>
-            <w:pPr>
-              <w:pStyle w:val="BodyText"/>
-            </w:pPr>
-            <w:r>
-              <w:rPr>
-                <w:b/>
-                <w:bCs/>
-              </w:rPr>
-              <w:t xml:space="preserve">Guest speaker: Industry/Kanton</w:t>
-            </w:r>
-            <w:r>
-              <w:t xml:space="preserve"> — Invited speaker</w:t>
-            </w:r>
-          </w:p>
-          <w:p>
-            <w:pPr>
-              <w:pStyle w:val="BodyText"/>
-            </w:pPr>
-            <w:r>
-              <w:rPr>
-                <w:b/>
-                <w:bCs/>
-              </w:rPr>
-              <w:t xml:space="preserve">[TODO: placeholder title — confirm speaker. Description below is the old course’s recap-session text]</w:t>
-            </w:r>
-          </w:p>
-          <w:p>
-            <w:pPr>
-              <w:pStyle w:val="BodyText"/>
-            </w:pPr>
-            <w:r>
-              <w:t xml:space="preserve">We will reflect on the contributions by our guest speakers and how they relate to what we have learned in the previous sessions. In preparation for the exam, we will recap the main lessons learnt in this course.</w:t>
-            </w:r>
-          </w:p>
-        </w:tc>
-        <w:tc>
-          <w:tcPr/>
-          <w:p>
-            <w:pPr>
-              <w:pStyle w:val="Compact"/>
-            </w:pPr>
-          </w:p>
-        </w:tc>
-      </w:tr>
-      <w:tr>
-        <w:tc>
-          <w:tcPr/>
-          <w:p>
-            <w:pPr>
-              <w:pStyle w:val="Compact"/>
-            </w:pPr>
-            <w:r>
-              <w:t xml:space="preserve">14</w:t>
-            </w:r>
-          </w:p>
-        </w:tc>
-        <w:tc>
-          <w:tcPr/>
-          <w:p>
-            <w:pPr>
-              <w:pStyle w:val="Compact"/>
-            </w:pPr>
-            <w:r>
-              <w:t xml:space="preserve">15.12.2026</w:t>
-            </w:r>
-          </w:p>
-        </w:tc>
-        <w:tc>
-          <w:tcPr/>
-          <w:p>
-            <w:pPr>
-              <w:pStyle w:val="BodyText"/>
-            </w:pPr>
-            <w:r>
-              <w:rPr>
-                <w:b/>
-                <w:bCs/>
-              </w:rPr>
-              <w:t xml:space="preserve">Discussion and lessons learnt</w:t>
-            </w:r>
-            <w:r>
-              <w:t xml:space="preserve"> — Viktoria Cologna &amp; Jan Pfänder</w:t>
-            </w:r>
-          </w:p>
-        </w:tc>
-        <w:tc>
-          <w:tcPr/>
-          <w:p>
-            <w:pPr>
-              <w:pStyle w:val="Compact"/>
-            </w:pPr>
           </w:p>
         </w:tc>
       </w:tr>

</xml_diff>